<commit_message>
Respond to some comments
</commit_message>
<xml_diff>
--- a/paper/[IEEE Access] Design and Simulation of a Broadband Tunable Transmittance Optical Filter Using Sb2Se3 Phase Change Material.docx
+++ b/paper/[IEEE Access] Design and Simulation of a Broadband Tunable Transmittance Optical Filter Using Sb2Se3 Phase Change Material.docx
@@ -1,6 +1,6 @@
 
 <file path=word/document.xml><?xml version="1.0" encoding="utf-8"?>
-<w:document xmlns:wpc="http://schemas.microsoft.com/office/word/2010/wordprocessingCanvas" xmlns:cx="http://schemas.microsoft.com/office/drawing/2014/chartex" xmlns:cx1="http://schemas.microsoft.com/office/drawing/2015/9/8/chartex" xmlns:cx2="http://schemas.microsoft.com/office/drawing/2015/10/21/chartex" xmlns:cx3="http://schemas.microsoft.com/office/drawing/2016/5/9/chartex" xmlns:cx4="http://schemas.microsoft.com/office/drawing/2016/5/10/chartex" xmlns:cx5="http://schemas.microsoft.com/office/drawing/2016/5/11/chartex" xmlns:cx6="http://schemas.microsoft.com/office/drawing/2016/5/12/chartex" xmlns:cx7="http://schemas.microsoft.com/office/drawing/2016/5/13/chartex" xmlns:cx8="http://schemas.microsoft.com/office/drawing/2016/5/14/chartex" xmlns:mc="http://schemas.openxmlformats.org/markup-compatibility/2006" xmlns:aink="http://schemas.microsoft.com/office/drawing/2016/ink" xmlns:am3d="http://schemas.microsoft.com/office/drawing/2017/model3d" xmlns:o="urn:schemas-microsoft-com:office:office" xmlns:oel="http://schemas.microsoft.com/office/2019/extlst" xmlns:r="http://schemas.openxmlformats.org/officeDocument/2006/relationships" xmlns:m="http://schemas.openxmlformats.org/officeDocument/2006/math" xmlns:v="urn:schemas-microsoft-com:vml" xmlns:wp14="http://schemas.microsoft.com/office/word/2010/wordprocessingDrawing" xmlns:wp="http://schemas.openxmlformats.org/drawingml/2006/wordprocessingDrawing" xmlns:w10="urn:schemas-microsoft-com:office:word" xmlns:w="http://schemas.openxmlformats.org/wordprocessingml/2006/main" xmlns:w14="http://schemas.microsoft.com/office/word/2010/wordml" xmlns:w15="http://schemas.microsoft.com/office/word/2012/wordml" xmlns:w16cex="http://schemas.microsoft.com/office/word/2018/wordml/cex" xmlns:w16cid="http://schemas.microsoft.com/office/word/2016/wordml/cid" xmlns:w16="http://schemas.microsoft.com/office/word/2018/wordml" xmlns:w16du="http://schemas.microsoft.com/office/word/2023/wordml/word16du" xmlns:w16sdtdh="http://schemas.microsoft.com/office/word/2020/wordml/sdtdatahash" xmlns:w16sdtfl="http://schemas.microsoft.com/office/word/2024/wordml/sdtformatlock" xmlns:w16se="http://schemas.microsoft.com/office/word/2015/wordml/symex" xmlns:wpg="http://schemas.microsoft.com/office/word/2010/wordprocessingGroup" xmlns:wpi="http://schemas.microsoft.com/office/word/2010/wordprocessingInk" xmlns:wne="http://schemas.microsoft.com/office/word/2006/wordml" xmlns:wps="http://schemas.microsoft.com/office/word/2010/wordprocessingShape" mc:Ignorable="w14 w15 w16se w16cid w16 w16cex w16sdtdh w16sdtfl w16du wp14">
+<w:document xmlns:wpc="http://schemas.microsoft.com/office/word/2010/wordprocessingCanvas" xmlns:cx="http://schemas.microsoft.com/office/drawing/2014/chartex" xmlns:cx1="http://schemas.microsoft.com/office/drawing/2015/9/8/chartex" xmlns:cx2="http://schemas.microsoft.com/office/drawing/2015/10/21/chartex" xmlns:cx3="http://schemas.microsoft.com/office/drawing/2016/5/9/chartex" xmlns:cx4="http://schemas.microsoft.com/office/drawing/2016/5/10/chartex" xmlns:cx5="http://schemas.microsoft.com/office/drawing/2016/5/11/chartex" xmlns:cx6="http://schemas.microsoft.com/office/drawing/2016/5/12/chartex" xmlns:cx7="http://schemas.microsoft.com/office/drawing/2016/5/13/chartex" xmlns:cx8="http://schemas.microsoft.com/office/drawing/2016/5/14/chartex" xmlns:mc="http://schemas.openxmlformats.org/markup-compatibility/2006" xmlns:aink="http://schemas.microsoft.com/office/drawing/2016/ink" xmlns:am3d="http://schemas.microsoft.com/office/drawing/2017/model3d" xmlns:o="urn:schemas-microsoft-com:office:office" xmlns:oel="http://schemas.microsoft.com/office/2019/extlst" xmlns:r="http://schemas.openxmlformats.org/officeDocument/2006/relationships" xmlns:m="http://schemas.openxmlformats.org/officeDocument/2006/math" xmlns:v="urn:schemas-microsoft-com:vml" xmlns:wp14="http://schemas.microsoft.com/office/word/2010/wordprocessingDrawing" xmlns:wp="http://schemas.openxmlformats.org/drawingml/2006/wordprocessingDrawing" xmlns:w10="urn:schemas-microsoft-com:office:word" xmlns:w="http://schemas.openxmlformats.org/wordprocessingml/2006/main" xmlns:w14="http://schemas.microsoft.com/office/word/2010/wordml" xmlns:w15="http://schemas.microsoft.com/office/word/2012/wordml" xmlns:w16cei="http://schemas.microsoft.com/office/word/2026/wordml/cei" xmlns:w16cex="http://schemas.microsoft.com/office/word/2018/wordml/cex" xmlns:w16cid="http://schemas.microsoft.com/office/word/2016/wordml/cid" xmlns:w16="http://schemas.microsoft.com/office/word/2018/wordml" xmlns:w16du="http://schemas.microsoft.com/office/word/2023/wordml/word16du" xmlns:w16sdtdh="http://schemas.microsoft.com/office/word/2020/wordml/sdtdatahash" xmlns:w16sdtfl="http://schemas.microsoft.com/office/word/2024/wordml/sdtformatlock" xmlns:w16se="http://schemas.microsoft.com/office/word/2015/wordml/symex" xmlns:wpg="http://schemas.microsoft.com/office/word/2010/wordprocessingGroup" xmlns:wpi="http://schemas.microsoft.com/office/word/2010/wordprocessingInk" xmlns:wne="http://schemas.microsoft.com/office/word/2006/wordml" xmlns:wps="http://schemas.microsoft.com/office/word/2010/wordprocessingShape" mc:Ignorable="w14 w15 w16se w16cid w16 w16cex w16sdtdh w16sdtfl w16du wp14">
   <w:body>
     <w:p>
       <w:pPr>
@@ -10,7 +10,23 @@
         </w:tabs>
       </w:pPr>
       <w:r>
-        <w:t>Date of publication xxxx 00, 0000, date of current version xxxx 00, 0000.</w:t>
+        <w:t xml:space="preserve">Date of publication </w:t>
+      </w:r>
+      <w:proofErr w:type="spellStart"/>
+      <w:r>
+        <w:t>xxxx</w:t>
+      </w:r>
+      <w:proofErr w:type="spellEnd"/>
+      <w:r>
+        <w:t xml:space="preserve"> 00, 0000, date of current version </w:t>
+      </w:r>
+      <w:proofErr w:type="spellStart"/>
+      <w:r>
+        <w:t>xxxx</w:t>
+      </w:r>
+      <w:proofErr w:type="spellEnd"/>
+      <w:r>
+        <w:t xml:space="preserve"> 00, 0000.</w:t>
       </w:r>
     </w:p>
     <w:p>
@@ -8990,6 +9006,7 @@
     <w:p>
       <w:pPr>
         <w:pStyle w:val="Subtitle"/>
+        <w:ind w:left="720"/>
       </w:pPr>
       <m:oMath>
         <m:r>
@@ -9220,274 +9237,6 @@
             </m:d>
           </m:den>
         </m:f>
-      </m:oMath>
-      <w:r>
-        <w:t>.</w:t>
-      </w:r>
-      <w:r>
-        <w:tab/>
-        <w:t>(14)</w:t>
-      </w:r>
-    </w:p>
-    <w:p>
-      <w:pPr>
-        <w:pStyle w:val="2ndcolumntext"/>
-      </w:pPr>
-      <w:r>
-        <w:t>Because the middle film layer (</w:t>
-      </w:r>
-      <w:r>
-        <w:rPr>
-          <w:i/>
-          <w:iCs/>
-          <w:lang w:bidi="th-TH"/>
-        </w:rPr>
-        <w:t>n</w:t>
-      </w:r>
-      <w:r>
-        <w:rPr>
-          <w:i/>
-          <w:iCs/>
-          <w:vertAlign w:val="subscript"/>
-          <w:lang w:bidi="th-TH"/>
-        </w:rPr>
-        <w:t>f</w:t>
-      </w:r>
-      <w:r>
-        <w:rPr>
-          <w:vertAlign w:val="subscript"/>
-          <w:lang w:bidi="th-TH"/>
-        </w:rPr>
-        <w:t>2</w:t>
-      </w:r>
-      <w:r>
-        <w:t xml:space="preserve">) is HWOT thick, it behaves as an absentee layer </w:t>
-      </w:r>
-      <w:r>
-        <w:fldChar w:fldCharType="begin"/>
-      </w:r>
-      <w:r>
-        <w:instrText xml:space="preserve"> ADDIN EN.CITE &lt;EndNote&gt;&lt;Cite&gt;&lt;Author&gt;Sarangan&lt;/Author&gt;&lt;Year&gt;2020&lt;/Year&gt;&lt;RecNum&gt;66&lt;/RecNum&gt;&lt;DisplayText&gt;[26, 30]&lt;/DisplayText&gt;&lt;record&gt;&lt;rec-number&gt;66&lt;/rec-number&gt;&lt;foreign-keys&gt;&lt;key app="EN" db-id="v920pft06rp9dbex2ap500x99x5rrtswxzss" timestamp="1768215215" guid="8e64e734-f3d1-4c0b-99d4-4d7caf7afa58"&gt;66&lt;/key&gt;&lt;/foreign-keys&gt;&lt;ref-type name="Book"&gt;6&lt;/ref-type&gt;&lt;contributors&gt;&lt;authors&gt;&lt;author&gt;Andrew Sarangan&lt;/author&gt;&lt;/authors&gt;&lt;/contributors&gt;&lt;titles&gt;&lt;title&gt;Optical Thin Film Design&lt;/title&gt;&lt;/titles&gt;&lt;edition&gt;1st Edition&lt;/edition&gt;&lt;section&gt;256&lt;/section&gt;&lt;dates&gt;&lt;year&gt;2020&lt;/year&gt;&lt;/dates&gt;&lt;pub-location&gt;Boca Raton&lt;/pub-location&gt;&lt;publisher&gt;CRC Press&lt;/publisher&gt;&lt;isbn&gt;9780429423352&lt;/isbn&gt;&lt;urls&gt;&lt;/urls&gt;&lt;electronic-resource-num&gt;https://doi.org/10.1201/9780429423352&lt;/electronic-resource-num&gt;&lt;/record&gt;&lt;/Cite&gt;&lt;Cite&gt;&lt;Author&gt;Li&lt;/Author&gt;&lt;Year&gt;2017&lt;/Year&gt;&lt;RecNum&gt;91&lt;/RecNum&gt;&lt;record&gt;&lt;rec-number&gt;91&lt;/rec-number&gt;&lt;foreign-keys&gt;&lt;key app="EN" db-id="v920pft06rp9dbex2ap500x99x5rrtswxzss" timestamp="1775554061" guid="ad309ab2-1e27-40f9-a5bb-390529c2ee68"&gt;91&lt;/key&gt;&lt;/foreign-keys&gt;&lt;ref-type name="Journal Article"&gt;17&lt;/ref-type&gt;&lt;contributors&gt;&lt;authors&gt;&lt;author&gt;Li, Yuanyang&lt;/author&gt;&lt;author&gt;Yang, Ke&lt;/author&gt;&lt;author&gt;Xia, Bibo&lt;/author&gt;&lt;author&gt;Yang, Bowen&lt;/author&gt;&lt;author&gt;Yan, Lianghong&lt;/author&gt;&lt;author&gt;He, Meiying&lt;/author&gt;&lt;author&gt;Yan, Hongwei&lt;/author&gt;&lt;author&gt;Jiang, Bo&lt;/author&gt;&lt;/authors&gt;&lt;/contributors&gt;&lt;titles&gt;&lt;title&gt;Preparation of mechanically stable triple-layer interference broadband antireflective coatings with self-cleaning property by sol–gel technique&lt;/title&gt;&lt;secondary-title&gt;RSC Advances&lt;/secondary-title&gt;&lt;/titles&gt;&lt;periodical&gt;&lt;full-title&gt;RSC Advances&lt;/full-title&gt;&lt;/periodical&gt;&lt;pages&gt;14660-14668&lt;/pages&gt;&lt;volume&gt;7&lt;/volume&gt;&lt;number&gt;24&lt;/number&gt;&lt;dates&gt;&lt;year&gt;2017&lt;/year&gt;&lt;/dates&gt;&lt;publisher&gt;The Royal Society of Chemistry&lt;/publisher&gt;&lt;work-type&gt;10.1039/C7RA00844A&lt;/work-type&gt;&lt;urls&gt;&lt;related-urls&gt;&lt;url&gt;http://dx.doi.org/10.1039/C7RA00844A&lt;/url&gt;&lt;/related-urls&gt;&lt;/urls&gt;&lt;electronic-resource-num&gt;10.1039/C7RA00844A&lt;/electronic-resource-num&gt;&lt;/record&gt;&lt;/Cite&gt;&lt;/EndNote&gt;</w:instrText>
-      </w:r>
-      <w:r>
-        <w:fldChar w:fldCharType="separate"/>
-      </w:r>
-      <w:r>
-        <w:rPr>
-          <w:noProof/>
-        </w:rPr>
-        <w:t>[26, 30]</w:t>
-      </w:r>
-      <w:r>
-        <w:fldChar w:fldCharType="end"/>
-      </w:r>
-      <w:r>
-        <w:t xml:space="preserve">. So </w:t>
-      </w:r>
-      <w:r>
-        <w:rPr>
-          <w:i/>
-          <w:iCs/>
-        </w:rPr>
-        <w:t>n</w:t>
-      </w:r>
-      <w:r>
-        <w:rPr>
-          <w:i/>
-          <w:iCs/>
-          <w:vertAlign w:val="subscript"/>
-        </w:rPr>
-        <w:t>r</w:t>
-      </w:r>
-      <w:r>
-        <w:rPr>
-          <w:vertAlign w:val="subscript"/>
-        </w:rPr>
-        <w:t>2</w:t>
-      </w:r>
-      <w:r>
-        <w:t xml:space="preserve"> </w:t>
-      </w:r>
-      <w:r>
-        <w:rPr>
-          <w:i/>
-          <w:iCs/>
-        </w:rPr>
-        <w:t>= n</w:t>
-      </w:r>
-      <w:r>
-        <w:rPr>
-          <w:i/>
-          <w:iCs/>
-          <w:vertAlign w:val="subscript"/>
-        </w:rPr>
-        <w:t>r</w:t>
-      </w:r>
-      <w:r>
-        <w:rPr>
-          <w:vertAlign w:val="subscript"/>
-        </w:rPr>
-        <w:t>1</w:t>
-      </w:r>
-      <w:r>
-        <w:t>, and Eq. 14 becomes:</w:t>
-      </w:r>
-    </w:p>
-    <w:p>
-      <w:pPr>
-        <w:pStyle w:val="Subtitle"/>
-      </w:pPr>
-      <m:oMath>
-        <m:r>
-          <m:t>r=</m:t>
-        </m:r>
-        <m:f>
-          <m:fPr>
-            <m:ctrlPr/>
-          </m:fPr>
-          <m:num>
-            <m:sSub>
-              <m:sSubPr>
-                <m:ctrlPr/>
-              </m:sSubPr>
-              <m:e>
-                <m:r>
-                  <m:t>n</m:t>
-                </m:r>
-              </m:e>
-              <m:sub>
-                <m:r>
-                  <m:t>a</m:t>
-                </m:r>
-              </m:sub>
-            </m:sSub>
-            <m:r>
-              <m:t>-</m:t>
-            </m:r>
-            <m:d>
-              <m:dPr>
-                <m:ctrlPr/>
-              </m:dPr>
-              <m:e>
-                <m:f>
-                  <m:fPr>
-                    <m:ctrlPr/>
-                  </m:fPr>
-                  <m:num>
-                    <m:sSubSup>
-                      <m:sSubSupPr>
-                        <m:ctrlPr/>
-                      </m:sSubSupPr>
-                      <m:e>
-                        <m:r>
-                          <m:t>n</m:t>
-                        </m:r>
-                      </m:e>
-                      <m:sub>
-                        <m:r>
-                          <m:t>f3</m:t>
-                        </m:r>
-                      </m:sub>
-                      <m:sup>
-                        <m:r>
-                          <m:t>2</m:t>
-                        </m:r>
-                      </m:sup>
-                    </m:sSubSup>
-                  </m:num>
-                  <m:den>
-                    <m:sSub>
-                      <m:sSubPr>
-                        <m:ctrlPr/>
-                      </m:sSubPr>
-                      <m:e>
-                        <m:r>
-                          <m:t>n</m:t>
-                        </m:r>
-                      </m:e>
-                      <m:sub>
-                        <m:r>
-                          <m:t>r1</m:t>
-                        </m:r>
-                      </m:sub>
-                    </m:sSub>
-                  </m:den>
-                </m:f>
-              </m:e>
-            </m:d>
-          </m:num>
-          <m:den>
-            <m:sSub>
-              <m:sSubPr>
-                <m:ctrlPr/>
-              </m:sSubPr>
-              <m:e>
-                <m:r>
-                  <m:t>n</m:t>
-                </m:r>
-              </m:e>
-              <m:sub>
-                <m:r>
-                  <m:t>a</m:t>
-                </m:r>
-              </m:sub>
-            </m:sSub>
-            <m:r>
-              <m:t>+</m:t>
-            </m:r>
-            <m:d>
-              <m:dPr>
-                <m:ctrlPr/>
-              </m:dPr>
-              <m:e>
-                <m:f>
-                  <m:fPr>
-                    <m:ctrlPr/>
-                  </m:fPr>
-                  <m:num>
-                    <m:sSubSup>
-                      <m:sSubSupPr>
-                        <m:ctrlPr/>
-                      </m:sSubSupPr>
-                      <m:e>
-                        <m:r>
-                          <m:t>n</m:t>
-                        </m:r>
-                      </m:e>
-                      <m:sub>
-                        <m:r>
-                          <m:t>f3</m:t>
-                        </m:r>
-                      </m:sub>
-                      <m:sup>
-                        <m:r>
-                          <m:t>2</m:t>
-                        </m:r>
-                      </m:sup>
-                    </m:sSubSup>
-                  </m:num>
-                  <m:den>
-                    <m:sSub>
-                      <m:sSubPr>
-                        <m:ctrlPr/>
-                      </m:sSubPr>
-                      <m:e>
-                        <m:r>
-                          <m:t>n</m:t>
-                        </m:r>
-                      </m:e>
-                      <m:sub>
-                        <m:r>
-                          <m:t>r1</m:t>
-                        </m:r>
-                      </m:sub>
-                    </m:sSub>
-                  </m:den>
-                </m:f>
-              </m:e>
-            </m:d>
-          </m:den>
-        </m:f>
         <m:r>
           <m:t>=</m:t>
         </m:r>
@@ -9686,19 +9435,118 @@
         </m:f>
       </m:oMath>
       <w:r>
-        <w:t>,</w:t>
+        <w:t>.</w:t>
       </w:r>
       <w:r>
         <w:tab/>
-        <w:t>(15)</w:t>
+        <w:t>(14)</w:t>
       </w:r>
     </w:p>
     <w:p>
       <w:pPr>
-        <w:pStyle w:val="1stcolumntext"/>
-      </w:pPr>
-      <w:r>
-        <w:t>and a three-layer antireflection condition occurs when</w:t>
+        <w:pStyle w:val="2ndcolumntext"/>
+      </w:pPr>
+      <w:r>
+        <w:t>Because the middle film layer (</w:t>
+      </w:r>
+      <w:r>
+        <w:rPr>
+          <w:i/>
+          <w:iCs/>
+          <w:lang w:bidi="th-TH"/>
+        </w:rPr>
+        <w:t>n</w:t>
+      </w:r>
+      <w:r>
+        <w:rPr>
+          <w:i/>
+          <w:iCs/>
+          <w:vertAlign w:val="subscript"/>
+          <w:lang w:bidi="th-TH"/>
+        </w:rPr>
+        <w:t>f</w:t>
+      </w:r>
+      <w:r>
+        <w:rPr>
+          <w:vertAlign w:val="subscript"/>
+          <w:lang w:bidi="th-TH"/>
+        </w:rPr>
+        <w:t>2</w:t>
+      </w:r>
+      <w:r>
+        <w:t xml:space="preserve">) is HWOT thick, it behaves as an absentee layer </w:t>
+      </w:r>
+      <w:r>
+        <w:fldChar w:fldCharType="begin"/>
+      </w:r>
+      <w:r>
+        <w:instrText xml:space="preserve"> ADDIN EN.CITE &lt;EndNote&gt;&lt;Cite&gt;&lt;Author&gt;Sarangan&lt;/Author&gt;&lt;Year&gt;2020&lt;/Year&gt;&lt;RecNum&gt;66&lt;/RecNum&gt;&lt;DisplayText&gt;[26, 30]&lt;/DisplayText&gt;&lt;record&gt;&lt;rec-number&gt;66&lt;/rec-number&gt;&lt;foreign-keys&gt;&lt;key app="EN" db-id="v920pft06rp9dbex2ap500x99x5rrtswxzss" timestamp="1768215215" guid="8e64e734-f3d1-4c0b-99d4-4d7caf7afa58"&gt;66&lt;/key&gt;&lt;/foreign-keys&gt;&lt;ref-type name="Book"&gt;6&lt;/ref-type&gt;&lt;contributors&gt;&lt;authors&gt;&lt;author&gt;Andrew Sarangan&lt;/author&gt;&lt;/authors&gt;&lt;/contributors&gt;&lt;titles&gt;&lt;title&gt;Optical Thin Film Design&lt;/title&gt;&lt;/titles&gt;&lt;edition&gt;1st Edition&lt;/edition&gt;&lt;section&gt;256&lt;/section&gt;&lt;dates&gt;&lt;year&gt;2020&lt;/year&gt;&lt;/dates&gt;&lt;pub-location&gt;Boca Raton&lt;/pub-location&gt;&lt;publisher&gt;CRC Press&lt;/publisher&gt;&lt;isbn&gt;9780429423352&lt;/isbn&gt;&lt;urls&gt;&lt;/urls&gt;&lt;electronic-resource-num&gt;https://doi.org/10.1201/9780429423352&lt;/electronic-resource-num&gt;&lt;/record&gt;&lt;/Cite&gt;&lt;Cite&gt;&lt;Author&gt;Li&lt;/Author&gt;&lt;Year&gt;2017&lt;/Year&gt;&lt;RecNum&gt;91&lt;/RecNum&gt;&lt;record&gt;&lt;rec-number&gt;91&lt;/rec-number&gt;&lt;foreign-keys&gt;&lt;key app="EN" db-id="v920pft06rp9dbex2ap500x99x5rrtswxzss" timestamp="1775554061" guid="ad309ab2-1e27-40f9-a5bb-390529c2ee68"&gt;91&lt;/key&gt;&lt;/foreign-keys&gt;&lt;ref-type name="Journal Article"&gt;17&lt;/ref-type&gt;&lt;contributors&gt;&lt;authors&gt;&lt;author&gt;Li, Yuanyang&lt;/author&gt;&lt;author&gt;Yang, Ke&lt;/author&gt;&lt;author&gt;Xia, Bibo&lt;/author&gt;&lt;author&gt;Yang, Bowen&lt;/author&gt;&lt;author&gt;Yan, Lianghong&lt;/author&gt;&lt;author&gt;He, Meiying&lt;/author&gt;&lt;author&gt;Yan, Hongwei&lt;/author&gt;&lt;author&gt;Jiang, Bo&lt;/author&gt;&lt;/authors&gt;&lt;/contributors&gt;&lt;titles&gt;&lt;title&gt;Preparation of mechanically stable triple-layer interference broadband antireflective coatings with self-cleaning property by sol–gel technique&lt;/title&gt;&lt;secondary-title&gt;RSC Advances&lt;/secondary-title&gt;&lt;/titles&gt;&lt;periodical&gt;&lt;full-title&gt;RSC Advances&lt;/full-title&gt;&lt;/periodical&gt;&lt;pages&gt;14660-14668&lt;/pages&gt;&lt;volume&gt;7&lt;/volume&gt;&lt;number&gt;24&lt;/number&gt;&lt;dates&gt;&lt;year&gt;2017&lt;/year&gt;&lt;/dates&gt;&lt;publisher&gt;The Royal Society of Chemistry&lt;/publisher&gt;&lt;work-type&gt;10.1039/C7RA00844A&lt;/work-type&gt;&lt;urls&gt;&lt;related-urls&gt;&lt;url&gt;http://dx.doi.org/10.1039/C7RA00844A&lt;/url&gt;&lt;/related-urls&gt;&lt;/urls&gt;&lt;electronic-resource-num&gt;10.1039/C7RA00844A&lt;/electronic-resource-num&gt;&lt;/record&gt;&lt;/Cite&gt;&lt;/EndNote&gt;</w:instrText>
+      </w:r>
+      <w:r>
+        <w:fldChar w:fldCharType="separate"/>
+      </w:r>
+      <w:r>
+        <w:rPr>
+          <w:noProof/>
+        </w:rPr>
+        <w:t>[26, 30]</w:t>
+      </w:r>
+      <w:r>
+        <w:fldChar w:fldCharType="end"/>
+      </w:r>
+      <w:r>
+        <w:t xml:space="preserve">. So </w:t>
+      </w:r>
+      <w:r>
+        <w:rPr>
+          <w:i/>
+          <w:iCs/>
+        </w:rPr>
+        <w:t>n</w:t>
+      </w:r>
+      <w:r>
+        <w:rPr>
+          <w:i/>
+          <w:iCs/>
+          <w:vertAlign w:val="subscript"/>
+        </w:rPr>
+        <w:t>r</w:t>
+      </w:r>
+      <w:r>
+        <w:rPr>
+          <w:vertAlign w:val="subscript"/>
+        </w:rPr>
+        <w:t>2</w:t>
+      </w:r>
+      <w:r>
+        <w:t xml:space="preserve"> </w:t>
+      </w:r>
+      <w:r>
+        <w:rPr>
+          <w:i/>
+          <w:iCs/>
+        </w:rPr>
+        <w:t>= n</w:t>
+      </w:r>
+      <w:r>
+        <w:rPr>
+          <w:i/>
+          <w:iCs/>
+          <w:vertAlign w:val="subscript"/>
+        </w:rPr>
+        <w:t>r</w:t>
+      </w:r>
+      <w:r>
+        <w:rPr>
+          <w:vertAlign w:val="subscript"/>
+        </w:rPr>
+        <w:t>1</w:t>
+      </w:r>
+      <w:r>
+        <w:t>. A</w:t>
+      </w:r>
+      <w:r>
+        <w:t xml:space="preserve"> three-layer antireflection condition occurs when</w:t>
       </w:r>
     </w:p>
     <w:p>
@@ -9803,7 +9651,24 @@
       </w:r>
       <w:r>
         <w:tab/>
-        <w:t>(16)</w:t>
+      </w:r>
+      <w:r>
+        <w:rPr>
+          <w:highlight w:val="yellow"/>
+        </w:rPr>
+        <w:t>(1</w:t>
+      </w:r>
+      <w:r>
+        <w:rPr>
+          <w:highlight w:val="yellow"/>
+        </w:rPr>
+        <w:t>5</w:t>
+      </w:r>
+      <w:r>
+        <w:rPr>
+          <w:highlight w:val="yellow"/>
+        </w:rPr>
+        <w:t>)</w:t>
       </w:r>
     </w:p>
     <w:p>
@@ -9821,7 +9686,10 @@
         <w:t xml:space="preserve"> </w:t>
       </w:r>
       <w:r>
-        <w:t xml:space="preserve">refractive index ratio of </w:t>
+        <w:t>refractor</w:t>
+      </w:r>
+      <w:r>
+        <w:t xml:space="preserve"> index ratio of </w:t>
       </w:r>
       <w:r>
         <w:rPr>
@@ -10278,7 +10146,22 @@
         <w:fldChar w:fldCharType="end"/>
       </w:r>
       <w:r>
-        <w:t xml:space="preserve"> and the ideal top layer calculated using Eq. 16 has </w:t>
+        <w:t xml:space="preserve"> and the ideal top layer calculated using Eq. </w:t>
+      </w:r>
+      <w:r>
+        <w:rPr>
+          <w:highlight w:val="yellow"/>
+        </w:rPr>
+        <w:t>1</w:t>
+      </w:r>
+      <w:r>
+        <w:rPr>
+          <w:highlight w:val="yellow"/>
+        </w:rPr>
+        <w:t>5</w:t>
+      </w:r>
+      <w:r>
+        <w:t xml:space="preserve"> has </w:t>
       </w:r>
       <w:r>
         <w:rPr>
@@ -10403,11 +10286,7 @@
         <w:t>3</w:t>
       </w:r>
       <w:r>
-        <w:t xml:space="preserve"> deposited directly on </w:t>
-      </w:r>
-      <w:r>
-        <w:lastRenderedPageBreak/>
-        <w:t>top of the substrate, i.e., single-layer, two-layer, and three-layer designs, are ~6.5%. But the three-layer design with Sb</w:t>
+        <w:t xml:space="preserve"> deposited directly on top of the substrate, i.e., single-layer, two-layer, and three-layer designs, are ~6.5%. But the three-layer design with Sb</w:t>
       </w:r>
       <w:r>
         <w:rPr>
@@ -10573,6 +10452,7 @@
         <w:pStyle w:val="H2Cont"/>
       </w:pPr>
       <w:r>
+        <w:lastRenderedPageBreak/>
         <w:t>LONG-PASS EDGE-FILTER DESIGN</w:t>
       </w:r>
     </w:p>
@@ -10587,69 +10467,33 @@
         <w:rPr>
           <w:rFonts w:eastAsia="TH SarabunPSK"/>
         </w:rPr>
-        <w:t xml:space="preserve">In </w:t>
+        <w:t>In previous sections, we only consider the reflectance of the design when Sb</w:t>
       </w:r>
       <w:r>
         <w:rPr>
           <w:rFonts w:eastAsia="TH SarabunPSK"/>
-        </w:rPr>
-        <w:t>previous sections</w:t>
+          <w:vertAlign w:val="subscript"/>
+        </w:rPr>
+        <w:t>2</w:t>
       </w:r>
       <w:r>
         <w:rPr>
           <w:rFonts w:eastAsia="TH SarabunPSK"/>
         </w:rPr>
-        <w:t>, we only consider the reflectance of the design when Sb</w:t>
+        <w:t>Se</w:t>
       </w:r>
       <w:r>
         <w:rPr>
           <w:rFonts w:eastAsia="TH SarabunPSK"/>
           <w:vertAlign w:val="subscript"/>
         </w:rPr>
-        <w:t>2</w:t>
+        <w:t>3</w:t>
       </w:r>
       <w:r>
         <w:rPr>
           <w:rFonts w:eastAsia="TH SarabunPSK"/>
         </w:rPr>
-        <w:t>Se</w:t>
-      </w:r>
-      <w:r>
-        <w:rPr>
-          <w:rFonts w:eastAsia="TH SarabunPSK"/>
-          <w:vertAlign w:val="subscript"/>
-        </w:rPr>
-        <w:t>3</w:t>
-      </w:r>
-      <w:r>
-        <w:rPr>
-          <w:rFonts w:eastAsia="TH SarabunPSK"/>
-        </w:rPr>
-        <w:t xml:space="preserve"> is in amorphous phase (ON mode). </w:t>
-      </w:r>
-      <w:r>
-        <w:rPr>
-          <w:rFonts w:eastAsia="TH SarabunPSK"/>
-        </w:rPr>
-        <w:t xml:space="preserve">However, because </w:t>
-      </w:r>
-      <w:r>
-        <w:rPr>
-          <w:rFonts w:eastAsia="TH SarabunPSK"/>
-        </w:rPr>
-        <w:t>we want to modulate the performance of our optical filter</w:t>
-      </w:r>
-      <w:r>
-        <w:rPr>
-          <w:rFonts w:eastAsia="TH SarabunPSK"/>
-        </w:rPr>
-        <w:t>s</w:t>
-      </w:r>
-      <w:r>
-        <w:rPr>
-          <w:rFonts w:eastAsia="TH SarabunPSK"/>
-        </w:rPr>
-        <w:t>, the reflectance when Sb</w:t>
+        <w:t xml:space="preserve"> is in amorphous phase (ON mode). However, because we want to modulate the performance of our optical filters, the reflectance when Sb</w:t>
       </w:r>
       <w:r>
         <w:rPr>
@@ -11010,19 +10854,7 @@
               <w:rPr>
                 <w:rFonts w:ascii="Cambria Math" w:hAnsi="Cambria Math"/>
               </w:rPr>
-              <m:t xml:space="preserve">H/2  </m:t>
-            </m:r>
-            <m:r>
-              <w:rPr>
-                <w:rFonts w:ascii="Cambria Math" w:hAnsi="Cambria Math"/>
-              </w:rPr>
-              <m:t>L</m:t>
-            </m:r>
-            <m:r>
-              <w:rPr>
-                <w:rFonts w:ascii="Cambria Math" w:hAnsi="Cambria Math"/>
-              </w:rPr>
-              <m:t xml:space="preserve">  H/2</m:t>
+              <m:t>H/2  L  H/2</m:t>
             </m:r>
           </m:e>
         </m:d>
@@ -11045,37 +10877,7 @@
               <w:rPr>
                 <w:rFonts w:ascii="Cambria Math" w:hAnsi="Cambria Math"/>
               </w:rPr>
-              <m:t>L</m:t>
-            </m:r>
-            <m:r>
-              <w:rPr>
-                <w:rFonts w:ascii="Cambria Math" w:hAnsi="Cambria Math"/>
-              </w:rPr>
-              <m:t xml:space="preserve">/2  </m:t>
-            </m:r>
-            <m:r>
-              <w:rPr>
-                <w:rFonts w:ascii="Cambria Math" w:hAnsi="Cambria Math"/>
-              </w:rPr>
-              <m:t>H</m:t>
-            </m:r>
-            <m:r>
-              <w:rPr>
-                <w:rFonts w:ascii="Cambria Math" w:hAnsi="Cambria Math"/>
-              </w:rPr>
-              <m:t xml:space="preserve">  </m:t>
-            </m:r>
-            <m:r>
-              <w:rPr>
-                <w:rFonts w:ascii="Cambria Math" w:hAnsi="Cambria Math"/>
-              </w:rPr>
-              <m:t>L</m:t>
-            </m:r>
-            <m:r>
-              <w:rPr>
-                <w:rFonts w:ascii="Cambria Math" w:hAnsi="Cambria Math"/>
-              </w:rPr>
-              <m:t>/2</m:t>
+              <m:t>L/2  H  L/2</m:t>
             </m:r>
           </m:e>
         </m:d>
@@ -11358,13 +11160,7 @@
         <w:rPr>
           <w:spacing w:val="-2"/>
         </w:rPr>
-        <w:t xml:space="preserve">a) to HR-region in crystalline phase </w:t>
-      </w:r>
-      <w:r>
-        <w:rPr>
-          <w:spacing w:val="-2"/>
-        </w:rPr>
-        <w:t xml:space="preserve">(Fig </w:t>
+        <w:t xml:space="preserve">a) to HR-region in crystalline phase (Fig </w:t>
       </w:r>
       <w:r>
         <w:rPr>
@@ -11615,6 +11411,9 @@
     <w:p>
       <w:pPr>
         <w:pStyle w:val="1stcolumntext"/>
+        <w:rPr>
+          <w:rFonts w:cstheme="minorBidi"/>
+        </w:rPr>
       </w:pPr>
       <w:r>
         <w:t>We use transfer</w:t>
@@ -11703,10 +11502,7 @@
         <w:t xml:space="preserve"> The simulations are going to be </w:t>
       </w:r>
       <w:r>
-        <w:t>from 850–1650 nm</w:t>
-      </w:r>
-      <w:r>
-        <w:t xml:space="preserve"> </w:t>
+        <w:t xml:space="preserve">from 850–1650 nm </w:t>
       </w:r>
       <w:r>
         <w:t>at an interval of every 1 nm.</w:t>
@@ -11847,11 +11643,23 @@
         <w:rPr>
           <w:rFonts w:cstheme="minorBidi"/>
         </w:rPr>
-        <w:t>. The high-index layers (</w:t>
+        <w:t>.</w:t>
       </w:r>
       <w:r>
         <w:rPr>
           <w:rFonts w:cstheme="minorBidi"/>
+        </w:rPr>
+        <w:t xml:space="preserve"> </w:t>
+      </w:r>
+      <w:r>
+        <w:rPr>
+          <w:rFonts w:cstheme="minorBidi"/>
+        </w:rPr>
+        <w:t>The high-index layers (</w:t>
+      </w:r>
+      <w:r>
+        <w:rPr>
+          <w:rFonts w:cstheme="minorBidi"/>
           <w:i/>
           <w:iCs/>
         </w:rPr>
@@ -12188,7 +11996,13 @@
         <w:t>SiO2</w:t>
       </w:r>
       <w:r>
-        <w:t xml:space="preserve"> and is 3 mm thick, reflection from the substrate-air layer on the backside is calculated</w:t>
+        <w:t xml:space="preserve"> and is 3 mm thick</w:t>
+      </w:r>
+      <w:r>
+        <w:t xml:space="preserve">. The </w:t>
+      </w:r>
+      <w:r>
+        <w:t>reflection from the substrate-air layer on the backside is calculated</w:t>
       </w:r>
       <w:r>
         <w:t xml:space="preserve">. </w:t>
@@ -12209,7 +12023,29 @@
         <w:t xml:space="preserve"> nm.</w:t>
       </w:r>
       <w:r>
-        <w:t xml:space="preserve"> And t</w:t>
+        <w:t xml:space="preserve"> </w:t>
+      </w:r>
+      <w:r>
+        <w:rPr>
+          <w:rFonts w:cstheme="minorBidi"/>
+          <w:highlight w:val="yellow"/>
+        </w:rPr>
+        <w:t>Missing datapoint are linearly interpolated since every dataset used have measuring interval of less than 4 nm</w:t>
+      </w:r>
+      <w:r>
+        <w:rPr>
+          <w:rFonts w:cstheme="minorBidi"/>
+        </w:rPr>
+        <w:t>.</w:t>
+      </w:r>
+      <w:r>
+        <w:rPr>
+          <w:rFonts w:cstheme="minorBidi"/>
+        </w:rPr>
+        <w:t xml:space="preserve"> </w:t>
+      </w:r>
+      <w:r>
+        <w:t>And t</w:t>
       </w:r>
       <w:r>
         <w:t>he incident angle is 0°, and light polarization mode is transverse electric (TE)</w:t>
@@ -12226,13 +12062,7 @@
         <w:pStyle w:val="2ndcolumntext"/>
       </w:pPr>
       <w:r>
-        <w:t>The main performance indicators are going to be transmittance</w:t>
-      </w:r>
-      <w:r>
-        <w:t xml:space="preserve"> at 1064 nm in both phases and the </w:t>
-      </w:r>
-      <w:r>
-        <w:t>transmittance contrast (</w:t>
+        <w:t>The main performance indicators are going to be transmittance at 1064 nm in both phases and the transmittance contrast (</w:t>
       </w:r>
       <w:r>
         <w:rPr>
@@ -12286,7 +12116,59 @@
         <w:t>OFF</w:t>
       </w:r>
       <w:r>
-        <w:t>). The secondary performance indicators are; the high-contrast region spectral width, the performance at different polarization and incident angle, the total PCM used, design thickness, and the complexity of the design which is indicated by the number of layers and the number of material types used.</w:t>
+        <w:t xml:space="preserve">). The secondary performance indicators are; </w:t>
+      </w:r>
+      <w:r>
+        <w:rPr>
+          <w:highlight w:val="yellow"/>
+        </w:rPr>
+        <w:t xml:space="preserve">the transmittance contrast </w:t>
+      </w:r>
+      <w:r>
+        <w:rPr>
+          <w:highlight w:val="yellow"/>
+        </w:rPr>
+        <w:t>(</w:t>
+      </w:r>
+      <w:r>
+        <w:rPr>
+          <w:rFonts w:ascii="Calibri" w:hAnsi="Calibri" w:cs="Calibri"/>
+          <w:i/>
+          <w:iCs/>
+          <w:highlight w:val="yellow"/>
+        </w:rPr>
+        <w:t>Δ</w:t>
+      </w:r>
+      <w:r>
+        <w:rPr>
+          <w:i/>
+          <w:iCs/>
+          <w:highlight w:val="yellow"/>
+        </w:rPr>
+        <w:t>T</w:t>
+      </w:r>
+      <w:r>
+        <w:rPr>
+          <w:highlight w:val="yellow"/>
+        </w:rPr>
+        <w:t>)</w:t>
+      </w:r>
+      <w:r>
+        <w:rPr>
+          <w:i/>
+          <w:iCs/>
+          <w:highlight w:val="yellow"/>
+        </w:rPr>
+        <w:t xml:space="preserve"> </w:t>
+      </w:r>
+      <w:r>
+        <w:rPr>
+          <w:highlight w:val="yellow"/>
+        </w:rPr>
+        <w:t>FWHM</w:t>
+      </w:r>
+      <w:r>
+        <w:t>, the performance at different polarization and incident angle, the total PCM used, design thickness, and the complexity of the design which is indicated by the number of layers and the number of material types used.</w:t>
       </w:r>
     </w:p>
     <w:p>
@@ -12610,7 +12492,13 @@
       </w:r>
       <w:r>
         <w:tab/>
-        <w:t>(17)</w:t>
+        <w:t>(1</w:t>
+      </w:r>
+      <w:r>
+        <w:t>6</w:t>
+      </w:r>
+      <w:r>
+        <w:t>)</w:t>
       </w:r>
     </w:p>
     <w:p>
@@ -12782,7 +12670,13 @@
       </w:r>
       <w:r>
         <w:tab/>
-        <w:t>(18)</w:t>
+        <w:t>(1</w:t>
+      </w:r>
+      <w:r>
+        <w:t>7</w:t>
+      </w:r>
+      <w:r>
+        <w:t>)</w:t>
       </w:r>
     </w:p>
     <w:p>
@@ -12994,6 +12888,7 @@
         <w:pStyle w:val="2ndcolumntext"/>
       </w:pPr>
       <w:r>
+        <w:lastRenderedPageBreak/>
         <w:t xml:space="preserve">Meanwhile, the imaginary part </w:t>
       </w:r>
       <w:r>
@@ -13082,7 +12977,13 @@
       </w:r>
       <w:r>
         <w:tab/>
-        <w:t>(19)</w:t>
+        <w:t>(1</w:t>
+      </w:r>
+      <w:r>
+        <w:t>8</w:t>
+      </w:r>
+      <w:r>
+        <w:t>)</w:t>
       </w:r>
     </w:p>
     <w:p>
@@ -13285,17 +13186,37 @@
         <w:fldChar w:fldCharType="end"/>
       </w:r>
       <w:r>
-        <w:t>. The model from Eq. (</w:t>
-      </w:r>
-      <w:r>
-        <w:rPr>
+        <w:t xml:space="preserve">. The model from Eq. </w:t>
+      </w:r>
+      <w:r>
+        <w:rPr>
+          <w:highlight w:val="yellow"/>
+        </w:rPr>
+        <w:t>(</w:t>
+      </w:r>
+      <w:r>
+        <w:rPr>
+          <w:highlight w:val="yellow"/>
           <w:cs/>
           <w:lang w:bidi="th-TH"/>
         </w:rPr>
-        <w:t>19</w:t>
-      </w:r>
-      <w:r>
-        <w:t xml:space="preserve">) is adopted in this work, they are consistent with experimental trends and with general PCM endurance theory, providing a practical way to assess </w:t>
+        <w:t>1</w:t>
+      </w:r>
+      <w:r>
+        <w:rPr>
+          <w:highlight w:val="yellow"/>
+          <w:lang w:bidi="th-TH"/>
+        </w:rPr>
+        <w:t>8</w:t>
+      </w:r>
+      <w:r>
+        <w:rPr>
+          <w:highlight w:val="yellow"/>
+        </w:rPr>
+        <w:t>)</w:t>
+      </w:r>
+      <w:r>
+        <w:t xml:space="preserve"> is adopted in this work, they are consistent with experimental trends and with general PCM endurance theory, providing a practical way to assess </w:t>
       </w:r>
       <w:r>
         <w:rPr>
@@ -13664,7 +13585,13 @@
       </w:r>
       <w:r>
         <w:tab/>
-        <w:t>(20)</w:t>
+        <w:t>(</w:t>
+      </w:r>
+      <w:r>
+        <w:t>19</w:t>
+      </w:r>
+      <w:r>
+        <w:t>)</w:t>
       </w:r>
     </w:p>
     <w:p>
@@ -13917,7 +13844,13 @@
       </w:r>
       <w:r>
         <w:tab/>
-        <w:t>(21)</w:t>
+        <w:t>(2</w:t>
+      </w:r>
+      <w:r>
+        <w:t>0</w:t>
+      </w:r>
+      <w:r>
+        <w:t>)</w:t>
       </w:r>
     </w:p>
     <w:p>
@@ -14041,12 +13974,11 @@
     </w:p>
     <w:p>
       <w:pPr>
-        <w:pStyle w:val="H2Cont"/>
+        <w:pStyle w:val="H2First"/>
         <w:numPr>
           <w:ilvl w:val="0"/>
-          <w:numId w:val="47"/>
+          <w:numId w:val="48"/>
         </w:numPr>
-        <w:spacing w:before="0"/>
       </w:pPr>
       <w:r>
         <w:t>OPTICAL PROPERTIES OF 1064-NM OPTICAL FILTERS</w:t>
@@ -14915,12 +14847,12 @@
       <w:tblGrid>
         <w:gridCol w:w="1020"/>
         <w:gridCol w:w="1928"/>
-        <w:gridCol w:w="850"/>
-        <w:gridCol w:w="850"/>
-        <w:gridCol w:w="850"/>
-        <w:gridCol w:w="850"/>
-        <w:gridCol w:w="850"/>
-        <w:gridCol w:w="850"/>
+        <w:gridCol w:w="1209"/>
+        <w:gridCol w:w="935"/>
+        <w:gridCol w:w="935"/>
+        <w:gridCol w:w="794"/>
+        <w:gridCol w:w="794"/>
+        <w:gridCol w:w="794"/>
       </w:tblGrid>
       <w:tr>
         <w:trPr>
@@ -14988,7 +14920,36 @@
         </w:tc>
         <w:tc>
           <w:tcPr>
-            <w:tcW w:w="850" w:type="dxa"/>
+            <w:tcW w:w="1209" w:type="dxa"/>
+            <w:tcBorders>
+              <w:top w:val="double" w:sz="4" w:space="0" w:color="auto"/>
+              <w:bottom w:val="single" w:sz="8" w:space="0" w:color="000000" w:themeColor="text1"/>
+            </w:tcBorders>
+            <w:vAlign w:val="center"/>
+          </w:tcPr>
+          <w:p>
+            <w:pPr>
+              <w:jc w:val="center"/>
+              <w:cnfStyle w:val="100000000000" w:firstRow="1" w:lastRow="0" w:firstColumn="0" w:lastColumn="0" w:oddVBand="0" w:evenVBand="0" w:oddHBand="0" w:evenHBand="0" w:firstRowFirstColumn="0" w:firstRowLastColumn="0" w:lastRowFirstColumn="0" w:lastRowLastColumn="0"/>
+              <w:rPr>
+                <w:rFonts w:eastAsia="MS Mincho"/>
+                <w:sz w:val="16"/>
+                <w:szCs w:val="16"/>
+              </w:rPr>
+            </w:pPr>
+            <w:r>
+              <w:rPr>
+                <w:rFonts w:eastAsia="MS Mincho"/>
+                <w:sz w:val="16"/>
+                <w:szCs w:val="16"/>
+              </w:rPr>
+              <w:t>Number of layer</w:t>
+            </w:r>
+          </w:p>
+        </w:tc>
+        <w:tc>
+          <w:tcPr>
+            <w:tcW w:w="935" w:type="dxa"/>
             <w:tcBorders>
               <w:top w:val="double" w:sz="4" w:space="0" w:color="auto"/>
               <w:bottom w:val="single" w:sz="8" w:space="0" w:color="000000" w:themeColor="text1"/>
@@ -15011,13 +14972,59 @@
                 <w:sz w:val="16"/>
                 <w:szCs w:val="16"/>
               </w:rPr>
-              <w:t>Number of layer</w:t>
+              <w:t>Sb</w:t>
+            </w:r>
+            <w:r>
+              <w:rPr>
+                <w:rFonts w:eastAsia="MS Mincho"/>
+                <w:sz w:val="16"/>
+                <w:szCs w:val="16"/>
+                <w:highlight w:val="yellow"/>
+                <w:vertAlign w:val="subscript"/>
+              </w:rPr>
+              <w:t>2</w:t>
+            </w:r>
+            <w:r>
+              <w:rPr>
+                <w:rFonts w:eastAsia="MS Mincho"/>
+                <w:sz w:val="16"/>
+                <w:szCs w:val="16"/>
+              </w:rPr>
+              <w:t>Se</w:t>
+            </w:r>
+            <w:r>
+              <w:rPr>
+                <w:rFonts w:eastAsia="MS Mincho"/>
+                <w:sz w:val="16"/>
+                <w:szCs w:val="16"/>
+                <w:highlight w:val="yellow"/>
+                <w:vertAlign w:val="subscript"/>
+              </w:rPr>
+              <w:t>3</w:t>
+            </w:r>
+            <w:r>
+              <w:rPr>
+                <w:rFonts w:eastAsia="MS Mincho"/>
+                <w:sz w:val="16"/>
+                <w:szCs w:val="16"/>
+                <w:cs/>
+                <w:lang w:bidi="th-TH"/>
+              </w:rPr>
+              <w:t xml:space="preserve"> </w:t>
+            </w:r>
+            <w:r>
+              <w:rPr>
+                <w:rFonts w:eastAsia="MS Mincho"/>
+                <w:sz w:val="16"/>
+                <w:szCs w:val="16"/>
+              </w:rPr>
+              <w:t>used (nm)</w:t>
             </w:r>
           </w:p>
         </w:tc>
         <w:tc>
           <w:tcPr>
-            <w:tcW w:w="850" w:type="dxa"/>
+            <w:tcW w:w="935" w:type="dxa"/>
             <w:tcBorders>
               <w:top w:val="double" w:sz="4" w:space="0" w:color="auto"/>
               <w:bottom w:val="single" w:sz="8" w:space="0" w:color="000000" w:themeColor="text1"/>
@@ -15040,17 +15047,15 @@
                 <w:sz w:val="16"/>
                 <w:szCs w:val="16"/>
               </w:rPr>
-              <w:t>SbSe</w:t>
+              <w:t xml:space="preserve">Device </w:t>
             </w:r>
             <w:r>
               <w:rPr>
                 <w:rFonts w:eastAsia="MS Mincho"/>
                 <w:sz w:val="16"/>
                 <w:szCs w:val="16"/>
-                <w:cs/>
-                <w:lang w:bidi="th-TH"/>
-              </w:rPr>
-              <w:t xml:space="preserve"> </w:t>
+              </w:rPr>
+              <w:t>size</w:t>
             </w:r>
             <w:r>
               <w:rPr>
@@ -15058,13 +15063,13 @@
                 <w:sz w:val="16"/>
                 <w:szCs w:val="16"/>
               </w:rPr>
-              <w:t>used (nm)</w:t>
+              <w:t xml:space="preserve"> (nm)</w:t>
             </w:r>
           </w:p>
         </w:tc>
         <w:tc>
           <w:tcPr>
-            <w:tcW w:w="850" w:type="dxa"/>
+            <w:tcW w:w="794" w:type="dxa"/>
             <w:tcBorders>
               <w:top w:val="double" w:sz="4" w:space="0" w:color="auto"/>
               <w:bottom w:val="single" w:sz="8" w:space="0" w:color="000000" w:themeColor="text1"/>
@@ -15077,6 +15082,8 @@
               <w:cnfStyle w:val="100000000000" w:firstRow="1" w:lastRow="0" w:firstColumn="0" w:lastColumn="0" w:oddVBand="0" w:evenVBand="0" w:oddHBand="0" w:evenHBand="0" w:firstRowFirstColumn="0" w:firstRowLastColumn="0" w:lastRowFirstColumn="0" w:lastRowLastColumn="0"/>
               <w:rPr>
                 <w:rFonts w:eastAsia="MS Mincho"/>
+                <w:b w:val="0"/>
+                <w:bCs w:val="0"/>
                 <w:sz w:val="16"/>
                 <w:szCs w:val="16"/>
               </w:rPr>
@@ -15087,15 +15094,16 @@
                 <w:sz w:val="16"/>
                 <w:szCs w:val="16"/>
               </w:rPr>
-              <w:t xml:space="preserve">Device </w:t>
+              <w:t>T</w:t>
             </w:r>
             <w:r>
               <w:rPr>
                 <w:rFonts w:eastAsia="MS Mincho"/>
                 <w:sz w:val="16"/>
                 <w:szCs w:val="16"/>
-              </w:rPr>
-              <w:t>size</w:t>
+                <w:vertAlign w:val="subscript"/>
+              </w:rPr>
+              <w:t>ON</w:t>
             </w:r>
             <w:r>
               <w:rPr>
@@ -15103,13 +15111,32 @@
                 <w:sz w:val="16"/>
                 <w:szCs w:val="16"/>
               </w:rPr>
-              <w:t xml:space="preserve"> (nm)</w:t>
+              <w:t xml:space="preserve"> </w:t>
+            </w:r>
+          </w:p>
+          <w:p>
+            <w:pPr>
+              <w:jc w:val="right"/>
+              <w:cnfStyle w:val="100000000000" w:firstRow="1" w:lastRow="0" w:firstColumn="0" w:lastColumn="0" w:oddVBand="0" w:evenVBand="0" w:oddHBand="0" w:evenHBand="0" w:firstRowFirstColumn="0" w:firstRowLastColumn="0" w:lastRowFirstColumn="0" w:lastRowLastColumn="0"/>
+              <w:rPr>
+                <w:rFonts w:eastAsia="MS Mincho"/>
+                <w:sz w:val="16"/>
+                <w:szCs w:val="16"/>
+              </w:rPr>
+            </w:pPr>
+            <w:r>
+              <w:rPr>
+                <w:rFonts w:eastAsia="MS Mincho"/>
+                <w:sz w:val="16"/>
+                <w:szCs w:val="16"/>
+              </w:rPr>
+              <w:t>(%)</w:t>
             </w:r>
           </w:p>
         </w:tc>
         <w:tc>
           <w:tcPr>
-            <w:tcW w:w="850" w:type="dxa"/>
+            <w:tcW w:w="794" w:type="dxa"/>
             <w:tcBorders>
               <w:top w:val="double" w:sz="4" w:space="0" w:color="auto"/>
               <w:bottom w:val="single" w:sz="8" w:space="0" w:color="000000" w:themeColor="text1"/>
@@ -15143,73 +15170,6 @@
                 <w:szCs w:val="16"/>
                 <w:vertAlign w:val="subscript"/>
               </w:rPr>
-              <w:t>ON</w:t>
-            </w:r>
-            <w:r>
-              <w:rPr>
-                <w:rFonts w:eastAsia="MS Mincho"/>
-                <w:sz w:val="16"/>
-                <w:szCs w:val="16"/>
-              </w:rPr>
-              <w:t xml:space="preserve"> </w:t>
-            </w:r>
-          </w:p>
-          <w:p>
-            <w:pPr>
-              <w:jc w:val="right"/>
-              <w:cnfStyle w:val="100000000000" w:firstRow="1" w:lastRow="0" w:firstColumn="0" w:lastColumn="0" w:oddVBand="0" w:evenVBand="0" w:oddHBand="0" w:evenHBand="0" w:firstRowFirstColumn="0" w:firstRowLastColumn="0" w:lastRowFirstColumn="0" w:lastRowLastColumn="0"/>
-              <w:rPr>
-                <w:rFonts w:eastAsia="MS Mincho"/>
-                <w:sz w:val="16"/>
-                <w:szCs w:val="16"/>
-              </w:rPr>
-            </w:pPr>
-            <w:r>
-              <w:rPr>
-                <w:rFonts w:eastAsia="MS Mincho"/>
-                <w:sz w:val="16"/>
-                <w:szCs w:val="16"/>
-              </w:rPr>
-              <w:t>(%)</w:t>
-            </w:r>
-          </w:p>
-        </w:tc>
-        <w:tc>
-          <w:tcPr>
-            <w:tcW w:w="850" w:type="dxa"/>
-            <w:tcBorders>
-              <w:top w:val="double" w:sz="4" w:space="0" w:color="auto"/>
-              <w:bottom w:val="single" w:sz="8" w:space="0" w:color="000000" w:themeColor="text1"/>
-            </w:tcBorders>
-            <w:vAlign w:val="center"/>
-          </w:tcPr>
-          <w:p>
-            <w:pPr>
-              <w:jc w:val="right"/>
-              <w:cnfStyle w:val="100000000000" w:firstRow="1" w:lastRow="0" w:firstColumn="0" w:lastColumn="0" w:oddVBand="0" w:evenVBand="0" w:oddHBand="0" w:evenHBand="0" w:firstRowFirstColumn="0" w:firstRowLastColumn="0" w:lastRowFirstColumn="0" w:lastRowLastColumn="0"/>
-              <w:rPr>
-                <w:rFonts w:eastAsia="MS Mincho"/>
-                <w:b w:val="0"/>
-                <w:bCs w:val="0"/>
-                <w:sz w:val="16"/>
-                <w:szCs w:val="16"/>
-              </w:rPr>
-            </w:pPr>
-            <w:r>
-              <w:rPr>
-                <w:rFonts w:eastAsia="MS Mincho"/>
-                <w:sz w:val="16"/>
-                <w:szCs w:val="16"/>
-              </w:rPr>
-              <w:t>T</w:t>
-            </w:r>
-            <w:r>
-              <w:rPr>
-                <w:rFonts w:eastAsia="MS Mincho"/>
-                <w:sz w:val="16"/>
-                <w:szCs w:val="16"/>
-                <w:vertAlign w:val="subscript"/>
-              </w:rPr>
               <w:t>OFF</w:t>
             </w:r>
           </w:p>
@@ -15235,7 +15195,7 @@
         </w:tc>
         <w:tc>
           <w:tcPr>
-            <w:tcW w:w="850" w:type="dxa"/>
+            <w:tcW w:w="794" w:type="dxa"/>
             <w:tcBorders>
               <w:top w:val="double" w:sz="4" w:space="0" w:color="auto"/>
               <w:bottom w:val="single" w:sz="8" w:space="0" w:color="000000" w:themeColor="text1"/>
@@ -15373,7 +15333,35 @@
         </w:tc>
         <w:tc>
           <w:tcPr>
-            <w:tcW w:w="850" w:type="dxa"/>
+            <w:tcW w:w="1209" w:type="dxa"/>
+            <w:tcBorders>
+              <w:top w:val="single" w:sz="8" w:space="0" w:color="000000" w:themeColor="text1"/>
+            </w:tcBorders>
+            <w:vAlign w:val="center"/>
+          </w:tcPr>
+          <w:p>
+            <w:pPr>
+              <w:jc w:val="center"/>
+              <w:cnfStyle w:val="000000000000" w:firstRow="0" w:lastRow="0" w:firstColumn="0" w:lastColumn="0" w:oddVBand="0" w:evenVBand="0" w:oddHBand="0" w:evenHBand="0" w:firstRowFirstColumn="0" w:firstRowLastColumn="0" w:lastRowFirstColumn="0" w:lastRowLastColumn="0"/>
+              <w:rPr>
+                <w:rFonts w:eastAsia="MS Mincho"/>
+                <w:sz w:val="16"/>
+                <w:szCs w:val="16"/>
+              </w:rPr>
+            </w:pPr>
+            <w:r>
+              <w:rPr>
+                <w:rFonts w:eastAsia="MS Mincho"/>
+                <w:sz w:val="16"/>
+                <w:szCs w:val="16"/>
+              </w:rPr>
+              <w:t>1</w:t>
+            </w:r>
+          </w:p>
+        </w:tc>
+        <w:tc>
+          <w:tcPr>
+            <w:tcW w:w="935" w:type="dxa"/>
             <w:tcBorders>
               <w:top w:val="single" w:sz="8" w:space="0" w:color="000000" w:themeColor="text1"/>
             </w:tcBorders>
@@ -15395,13 +15383,13 @@
                 <w:sz w:val="16"/>
                 <w:szCs w:val="16"/>
               </w:rPr>
-              <w:t>1</w:t>
+              <w:t>157.9</w:t>
             </w:r>
           </w:p>
         </w:tc>
         <w:tc>
           <w:tcPr>
-            <w:tcW w:w="850" w:type="dxa"/>
+            <w:tcW w:w="935" w:type="dxa"/>
             <w:tcBorders>
               <w:top w:val="single" w:sz="8" w:space="0" w:color="000000" w:themeColor="text1"/>
             </w:tcBorders>
@@ -15429,7 +15417,7 @@
         </w:tc>
         <w:tc>
           <w:tcPr>
-            <w:tcW w:w="850" w:type="dxa"/>
+            <w:tcW w:w="794" w:type="dxa"/>
             <w:tcBorders>
               <w:top w:val="single" w:sz="8" w:space="0" w:color="000000" w:themeColor="text1"/>
             </w:tcBorders>
@@ -15451,13 +15439,13 @@
                 <w:sz w:val="16"/>
                 <w:szCs w:val="16"/>
               </w:rPr>
-              <w:t>157.9</w:t>
+              <w:t>93.5</w:t>
             </w:r>
           </w:p>
         </w:tc>
         <w:tc>
           <w:tcPr>
-            <w:tcW w:w="850" w:type="dxa"/>
+            <w:tcW w:w="794" w:type="dxa"/>
             <w:tcBorders>
               <w:top w:val="single" w:sz="8" w:space="0" w:color="000000" w:themeColor="text1"/>
             </w:tcBorders>
@@ -15479,41 +15467,13 @@
                 <w:sz w:val="16"/>
                 <w:szCs w:val="16"/>
               </w:rPr>
-              <w:t>93.5</w:t>
-            </w:r>
-          </w:p>
-        </w:tc>
-        <w:tc>
-          <w:tcPr>
-            <w:tcW w:w="850" w:type="dxa"/>
-            <w:tcBorders>
-              <w:top w:val="single" w:sz="8" w:space="0" w:color="000000" w:themeColor="text1"/>
-            </w:tcBorders>
-            <w:vAlign w:val="center"/>
-          </w:tcPr>
-          <w:p>
-            <w:pPr>
-              <w:jc w:val="right"/>
-              <w:cnfStyle w:val="000000000000" w:firstRow="0" w:lastRow="0" w:firstColumn="0" w:lastColumn="0" w:oddVBand="0" w:evenVBand="0" w:oddHBand="0" w:evenHBand="0" w:firstRowFirstColumn="0" w:firstRowLastColumn="0" w:lastRowFirstColumn="0" w:lastRowLastColumn="0"/>
-              <w:rPr>
-                <w:rFonts w:eastAsia="MS Mincho"/>
-                <w:sz w:val="16"/>
-                <w:szCs w:val="16"/>
-              </w:rPr>
-            </w:pPr>
-            <w:r>
-              <w:rPr>
-                <w:rFonts w:eastAsia="MS Mincho"/>
-                <w:sz w:val="16"/>
-                <w:szCs w:val="16"/>
-              </w:rPr>
               <w:t>37.2</w:t>
             </w:r>
           </w:p>
         </w:tc>
         <w:tc>
           <w:tcPr>
-            <w:tcW w:w="850" w:type="dxa"/>
+            <w:tcW w:w="794" w:type="dxa"/>
             <w:tcBorders>
               <w:top w:val="single" w:sz="8" w:space="0" w:color="000000" w:themeColor="text1"/>
             </w:tcBorders>
@@ -15640,7 +15600,32 @@
         </w:tc>
         <w:tc>
           <w:tcPr>
-            <w:tcW w:w="850" w:type="dxa"/>
+            <w:tcW w:w="1209" w:type="dxa"/>
+            <w:vAlign w:val="center"/>
+          </w:tcPr>
+          <w:p>
+            <w:pPr>
+              <w:jc w:val="center"/>
+              <w:cnfStyle w:val="000000000000" w:firstRow="0" w:lastRow="0" w:firstColumn="0" w:lastColumn="0" w:oddVBand="0" w:evenVBand="0" w:oddHBand="0" w:evenHBand="0" w:firstRowFirstColumn="0" w:firstRowLastColumn="0" w:lastRowFirstColumn="0" w:lastRowLastColumn="0"/>
+              <w:rPr>
+                <w:rFonts w:eastAsia="MS Mincho"/>
+                <w:sz w:val="16"/>
+                <w:szCs w:val="16"/>
+              </w:rPr>
+            </w:pPr>
+            <w:r>
+              <w:rPr>
+                <w:rFonts w:eastAsia="MS Mincho"/>
+                <w:sz w:val="16"/>
+                <w:szCs w:val="16"/>
+              </w:rPr>
+              <w:t>2</w:t>
+            </w:r>
+          </w:p>
+        </w:tc>
+        <w:tc>
+          <w:tcPr>
+            <w:tcW w:w="935" w:type="dxa"/>
             <w:vAlign w:val="center"/>
           </w:tcPr>
           <w:p>
@@ -15659,13 +15644,13 @@
                 <w:sz w:val="16"/>
                 <w:szCs w:val="16"/>
               </w:rPr>
-              <w:t>2</w:t>
+              <w:t>78.9</w:t>
             </w:r>
           </w:p>
         </w:tc>
         <w:tc>
           <w:tcPr>
-            <w:tcW w:w="850" w:type="dxa"/>
+            <w:tcW w:w="935" w:type="dxa"/>
             <w:vAlign w:val="center"/>
           </w:tcPr>
           <w:p>
@@ -15684,13 +15669,13 @@
                 <w:sz w:val="16"/>
                 <w:szCs w:val="16"/>
               </w:rPr>
-              <w:t>78.9</w:t>
+              <w:t>194.1</w:t>
             </w:r>
           </w:p>
         </w:tc>
         <w:tc>
           <w:tcPr>
-            <w:tcW w:w="850" w:type="dxa"/>
+            <w:tcW w:w="794" w:type="dxa"/>
             <w:vAlign w:val="center"/>
           </w:tcPr>
           <w:p>
@@ -15709,13 +15694,13 @@
                 <w:sz w:val="16"/>
                 <w:szCs w:val="16"/>
               </w:rPr>
-              <w:t>194.1</w:t>
+              <w:t>93.3</w:t>
             </w:r>
           </w:p>
         </w:tc>
         <w:tc>
           <w:tcPr>
-            <w:tcW w:w="850" w:type="dxa"/>
+            <w:tcW w:w="794" w:type="dxa"/>
             <w:vAlign w:val="center"/>
           </w:tcPr>
           <w:p>
@@ -15734,38 +15719,13 @@
                 <w:sz w:val="16"/>
                 <w:szCs w:val="16"/>
               </w:rPr>
-              <w:t>93.3</w:t>
-            </w:r>
-          </w:p>
-        </w:tc>
-        <w:tc>
-          <w:tcPr>
-            <w:tcW w:w="850" w:type="dxa"/>
-            <w:vAlign w:val="center"/>
-          </w:tcPr>
-          <w:p>
-            <w:pPr>
-              <w:jc w:val="right"/>
-              <w:cnfStyle w:val="000000000000" w:firstRow="0" w:lastRow="0" w:firstColumn="0" w:lastColumn="0" w:oddVBand="0" w:evenVBand="0" w:oddHBand="0" w:evenHBand="0" w:firstRowFirstColumn="0" w:firstRowLastColumn="0" w:lastRowFirstColumn="0" w:lastRowLastColumn="0"/>
-              <w:rPr>
-                <w:rFonts w:eastAsia="MS Mincho"/>
-                <w:sz w:val="16"/>
-                <w:szCs w:val="16"/>
-              </w:rPr>
-            </w:pPr>
-            <w:r>
-              <w:rPr>
-                <w:rFonts w:eastAsia="MS Mincho"/>
-                <w:sz w:val="16"/>
-                <w:szCs w:val="16"/>
-              </w:rPr>
               <w:t>76.9</w:t>
             </w:r>
           </w:p>
         </w:tc>
         <w:tc>
           <w:tcPr>
-            <w:tcW w:w="850" w:type="dxa"/>
+            <w:tcW w:w="794" w:type="dxa"/>
             <w:vAlign w:val="center"/>
           </w:tcPr>
           <w:p>
@@ -15906,7 +15866,32 @@
         </w:tc>
         <w:tc>
           <w:tcPr>
-            <w:tcW w:w="850" w:type="dxa"/>
+            <w:tcW w:w="1209" w:type="dxa"/>
+            <w:vAlign w:val="center"/>
+          </w:tcPr>
+          <w:p>
+            <w:pPr>
+              <w:jc w:val="center"/>
+              <w:cnfStyle w:val="000000000000" w:firstRow="0" w:lastRow="0" w:firstColumn="0" w:lastColumn="0" w:oddVBand="0" w:evenVBand="0" w:oddHBand="0" w:evenHBand="0" w:firstRowFirstColumn="0" w:firstRowLastColumn="0" w:lastRowFirstColumn="0" w:lastRowLastColumn="0"/>
+              <w:rPr>
+                <w:rFonts w:eastAsia="MS Mincho"/>
+                <w:sz w:val="16"/>
+                <w:szCs w:val="16"/>
+              </w:rPr>
+            </w:pPr>
+            <w:r>
+              <w:rPr>
+                <w:rFonts w:eastAsia="MS Mincho"/>
+                <w:sz w:val="16"/>
+                <w:szCs w:val="16"/>
+              </w:rPr>
+              <w:t>3</w:t>
+            </w:r>
+          </w:p>
+        </w:tc>
+        <w:tc>
+          <w:tcPr>
+            <w:tcW w:w="935" w:type="dxa"/>
             <w:vAlign w:val="center"/>
           </w:tcPr>
           <w:p>
@@ -15925,13 +15910,13 @@
                 <w:sz w:val="16"/>
                 <w:szCs w:val="16"/>
               </w:rPr>
-              <w:t>3</w:t>
+              <w:t>78.9</w:t>
             </w:r>
           </w:p>
         </w:tc>
         <w:tc>
           <w:tcPr>
-            <w:tcW w:w="850" w:type="dxa"/>
+            <w:tcW w:w="935" w:type="dxa"/>
             <w:vAlign w:val="center"/>
           </w:tcPr>
           <w:p>
@@ -15950,13 +15935,13 @@
                 <w:sz w:val="16"/>
                 <w:szCs w:val="16"/>
               </w:rPr>
-              <w:t>78.9</w:t>
+              <w:t>580.3</w:t>
             </w:r>
           </w:p>
         </w:tc>
         <w:tc>
           <w:tcPr>
-            <w:tcW w:w="850" w:type="dxa"/>
+            <w:tcW w:w="794" w:type="dxa"/>
             <w:vAlign w:val="center"/>
           </w:tcPr>
           <w:p>
@@ -15975,13 +15960,13 @@
                 <w:sz w:val="16"/>
                 <w:szCs w:val="16"/>
               </w:rPr>
-              <w:t>580.3</w:t>
+              <w:t>93.3</w:t>
             </w:r>
           </w:p>
         </w:tc>
         <w:tc>
           <w:tcPr>
-            <w:tcW w:w="850" w:type="dxa"/>
+            <w:tcW w:w="794" w:type="dxa"/>
             <w:vAlign w:val="center"/>
           </w:tcPr>
           <w:p>
@@ -16000,38 +15985,13 @@
                 <w:sz w:val="16"/>
                 <w:szCs w:val="16"/>
               </w:rPr>
-              <w:t>93.3</w:t>
-            </w:r>
-          </w:p>
-        </w:tc>
-        <w:tc>
-          <w:tcPr>
-            <w:tcW w:w="850" w:type="dxa"/>
-            <w:vAlign w:val="center"/>
-          </w:tcPr>
-          <w:p>
-            <w:pPr>
-              <w:jc w:val="right"/>
-              <w:cnfStyle w:val="000000000000" w:firstRow="0" w:lastRow="0" w:firstColumn="0" w:lastColumn="0" w:oddVBand="0" w:evenVBand="0" w:oddHBand="0" w:evenHBand="0" w:firstRowFirstColumn="0" w:firstRowLastColumn="0" w:lastRowFirstColumn="0" w:lastRowLastColumn="0"/>
-              <w:rPr>
-                <w:rFonts w:eastAsia="MS Mincho"/>
-                <w:sz w:val="16"/>
-                <w:szCs w:val="16"/>
-              </w:rPr>
-            </w:pPr>
-            <w:r>
-              <w:rPr>
-                <w:rFonts w:eastAsia="MS Mincho"/>
-                <w:sz w:val="16"/>
-                <w:szCs w:val="16"/>
-              </w:rPr>
               <w:t>76.9</w:t>
             </w:r>
           </w:p>
         </w:tc>
         <w:tc>
           <w:tcPr>
-            <w:tcW w:w="850" w:type="dxa"/>
+            <w:tcW w:w="794" w:type="dxa"/>
             <w:vAlign w:val="center"/>
           </w:tcPr>
           <w:p>
@@ -16206,7 +16166,32 @@
         </w:tc>
         <w:tc>
           <w:tcPr>
-            <w:tcW w:w="850" w:type="dxa"/>
+            <w:tcW w:w="1209" w:type="dxa"/>
+            <w:vAlign w:val="center"/>
+          </w:tcPr>
+          <w:p>
+            <w:pPr>
+              <w:jc w:val="center"/>
+              <w:cnfStyle w:val="000000000000" w:firstRow="0" w:lastRow="0" w:firstColumn="0" w:lastColumn="0" w:oddVBand="0" w:evenVBand="0" w:oddHBand="0" w:evenHBand="0" w:firstRowFirstColumn="0" w:firstRowLastColumn="0" w:lastRowFirstColumn="0" w:lastRowLastColumn="0"/>
+              <w:rPr>
+                <w:rFonts w:eastAsia="MS Mincho"/>
+                <w:sz w:val="16"/>
+                <w:szCs w:val="16"/>
+              </w:rPr>
+            </w:pPr>
+            <w:r>
+              <w:rPr>
+                <w:rFonts w:eastAsia="MS Mincho"/>
+                <w:sz w:val="16"/>
+                <w:szCs w:val="16"/>
+              </w:rPr>
+              <w:t>3</w:t>
+            </w:r>
+          </w:p>
+        </w:tc>
+        <w:tc>
+          <w:tcPr>
+            <w:tcW w:w="935" w:type="dxa"/>
             <w:vAlign w:val="center"/>
           </w:tcPr>
           <w:p>
@@ -16225,13 +16210,13 @@
                 <w:sz w:val="16"/>
                 <w:szCs w:val="16"/>
               </w:rPr>
-              <w:t>3</w:t>
+              <w:t>157.9</w:t>
             </w:r>
           </w:p>
         </w:tc>
         <w:tc>
           <w:tcPr>
-            <w:tcW w:w="850" w:type="dxa"/>
+            <w:tcW w:w="935" w:type="dxa"/>
             <w:vAlign w:val="center"/>
           </w:tcPr>
           <w:p>
@@ -16250,13 +16235,13 @@
                 <w:sz w:val="16"/>
                 <w:szCs w:val="16"/>
               </w:rPr>
-              <w:t>157.9</w:t>
+              <w:t>455.7</w:t>
             </w:r>
           </w:p>
         </w:tc>
         <w:tc>
           <w:tcPr>
-            <w:tcW w:w="850" w:type="dxa"/>
+            <w:tcW w:w="794" w:type="dxa"/>
             <w:vAlign w:val="center"/>
           </w:tcPr>
           <w:p>
@@ -16275,13 +16260,13 @@
                 <w:sz w:val="16"/>
                 <w:szCs w:val="16"/>
               </w:rPr>
-              <w:t>455.7</w:t>
+              <w:t>96.6</w:t>
             </w:r>
           </w:p>
         </w:tc>
         <w:tc>
           <w:tcPr>
-            <w:tcW w:w="850" w:type="dxa"/>
+            <w:tcW w:w="794" w:type="dxa"/>
             <w:vAlign w:val="center"/>
           </w:tcPr>
           <w:p>
@@ -16300,38 +16285,13 @@
                 <w:sz w:val="16"/>
                 <w:szCs w:val="16"/>
               </w:rPr>
-              <w:t>96.6</w:t>
-            </w:r>
-          </w:p>
-        </w:tc>
-        <w:tc>
-          <w:tcPr>
-            <w:tcW w:w="850" w:type="dxa"/>
-            <w:vAlign w:val="center"/>
-          </w:tcPr>
-          <w:p>
-            <w:pPr>
-              <w:jc w:val="right"/>
-              <w:cnfStyle w:val="000000000000" w:firstRow="0" w:lastRow="0" w:firstColumn="0" w:lastColumn="0" w:oddVBand="0" w:evenVBand="0" w:oddHBand="0" w:evenHBand="0" w:firstRowFirstColumn="0" w:firstRowLastColumn="0" w:lastRowFirstColumn="0" w:lastRowLastColumn="0"/>
-              <w:rPr>
-                <w:rFonts w:eastAsia="MS Mincho"/>
-                <w:sz w:val="16"/>
-                <w:szCs w:val="16"/>
-              </w:rPr>
-            </w:pPr>
-            <w:r>
-              <w:rPr>
-                <w:rFonts w:eastAsia="MS Mincho"/>
-                <w:sz w:val="16"/>
-                <w:szCs w:val="16"/>
-              </w:rPr>
               <w:t>83.3</w:t>
             </w:r>
           </w:p>
         </w:tc>
         <w:tc>
           <w:tcPr>
-            <w:tcW w:w="850" w:type="dxa"/>
+            <w:tcW w:w="794" w:type="dxa"/>
             <w:vAlign w:val="center"/>
           </w:tcPr>
           <w:p>
@@ -16700,7 +16660,32 @@
         </w:tc>
         <w:tc>
           <w:tcPr>
-            <w:tcW w:w="850" w:type="dxa"/>
+            <w:tcW w:w="1209" w:type="dxa"/>
+            <w:vAlign w:val="center"/>
+          </w:tcPr>
+          <w:p>
+            <w:pPr>
+              <w:jc w:val="center"/>
+              <w:cnfStyle w:val="000000000000" w:firstRow="0" w:lastRow="0" w:firstColumn="0" w:lastColumn="0" w:oddVBand="0" w:evenVBand="0" w:oddHBand="0" w:evenHBand="0" w:firstRowFirstColumn="0" w:firstRowLastColumn="0" w:lastRowFirstColumn="0" w:lastRowLastColumn="0"/>
+              <w:rPr>
+                <w:rFonts w:eastAsia="MS Mincho"/>
+                <w:sz w:val="16"/>
+                <w:szCs w:val="16"/>
+              </w:rPr>
+            </w:pPr>
+            <w:r>
+              <w:rPr>
+                <w:rFonts w:eastAsia="MS Mincho"/>
+                <w:sz w:val="16"/>
+                <w:szCs w:val="16"/>
+              </w:rPr>
+              <w:t>3</w:t>
+            </w:r>
+          </w:p>
+        </w:tc>
+        <w:tc>
+          <w:tcPr>
+            <w:tcW w:w="935" w:type="dxa"/>
             <w:vAlign w:val="center"/>
           </w:tcPr>
           <w:p>
@@ -16719,13 +16704,13 @@
                 <w:sz w:val="16"/>
                 <w:szCs w:val="16"/>
               </w:rPr>
-              <w:t>3</w:t>
+              <w:t>48.5</w:t>
             </w:r>
           </w:p>
         </w:tc>
         <w:tc>
           <w:tcPr>
-            <w:tcW w:w="850" w:type="dxa"/>
+            <w:tcW w:w="935" w:type="dxa"/>
             <w:vAlign w:val="center"/>
           </w:tcPr>
           <w:p>
@@ -16744,13 +16729,13 @@
                 <w:sz w:val="16"/>
                 <w:szCs w:val="16"/>
               </w:rPr>
-              <w:t>48.5</w:t>
+              <w:t>182.5</w:t>
             </w:r>
           </w:p>
         </w:tc>
         <w:tc>
           <w:tcPr>
-            <w:tcW w:w="850" w:type="dxa"/>
+            <w:tcW w:w="794" w:type="dxa"/>
             <w:vAlign w:val="center"/>
           </w:tcPr>
           <w:p>
@@ -16769,13 +16754,13 @@
                 <w:sz w:val="16"/>
                 <w:szCs w:val="16"/>
               </w:rPr>
-              <w:t>182.5</w:t>
+              <w:t>94.1</w:t>
             </w:r>
           </w:p>
         </w:tc>
         <w:tc>
           <w:tcPr>
-            <w:tcW w:w="850" w:type="dxa"/>
+            <w:tcW w:w="794" w:type="dxa"/>
             <w:vAlign w:val="center"/>
           </w:tcPr>
           <w:p>
@@ -16794,38 +16779,13 @@
                 <w:sz w:val="16"/>
                 <w:szCs w:val="16"/>
               </w:rPr>
-              <w:t>94.1</w:t>
-            </w:r>
-          </w:p>
-        </w:tc>
-        <w:tc>
-          <w:tcPr>
-            <w:tcW w:w="850" w:type="dxa"/>
-            <w:vAlign w:val="center"/>
-          </w:tcPr>
-          <w:p>
-            <w:pPr>
-              <w:jc w:val="right"/>
-              <w:cnfStyle w:val="000000000000" w:firstRow="0" w:lastRow="0" w:firstColumn="0" w:lastColumn="0" w:oddVBand="0" w:evenVBand="0" w:oddHBand="0" w:evenHBand="0" w:firstRowFirstColumn="0" w:firstRowLastColumn="0" w:lastRowFirstColumn="0" w:lastRowLastColumn="0"/>
-              <w:rPr>
-                <w:rFonts w:eastAsia="MS Mincho"/>
-                <w:sz w:val="16"/>
-                <w:szCs w:val="16"/>
-              </w:rPr>
-            </w:pPr>
-            <w:r>
-              <w:rPr>
-                <w:rFonts w:eastAsia="MS Mincho"/>
-                <w:sz w:val="16"/>
-                <w:szCs w:val="16"/>
-              </w:rPr>
               <w:t>54.3</w:t>
             </w:r>
           </w:p>
         </w:tc>
         <w:tc>
           <w:tcPr>
-            <w:tcW w:w="850" w:type="dxa"/>
+            <w:tcW w:w="794" w:type="dxa"/>
             <w:vAlign w:val="center"/>
           </w:tcPr>
           <w:p>
@@ -17195,7 +17155,32 @@
         </w:tc>
         <w:tc>
           <w:tcPr>
-            <w:tcW w:w="850" w:type="dxa"/>
+            <w:tcW w:w="1209" w:type="dxa"/>
+            <w:vAlign w:val="center"/>
+          </w:tcPr>
+          <w:p>
+            <w:pPr>
+              <w:jc w:val="center"/>
+              <w:cnfStyle w:val="000000000000" w:firstRow="0" w:lastRow="0" w:firstColumn="0" w:lastColumn="0" w:oddVBand="0" w:evenVBand="0" w:oddHBand="0" w:evenHBand="0" w:firstRowFirstColumn="0" w:firstRowLastColumn="0" w:lastRowFirstColumn="0" w:lastRowLastColumn="0"/>
+              <w:rPr>
+                <w:rFonts w:eastAsia="MS Mincho"/>
+                <w:sz w:val="16"/>
+                <w:szCs w:val="16"/>
+              </w:rPr>
+            </w:pPr>
+            <w:r>
+              <w:rPr>
+                <w:rFonts w:eastAsia="MS Mincho"/>
+                <w:sz w:val="16"/>
+                <w:szCs w:val="16"/>
+              </w:rPr>
+              <w:t>5</w:t>
+            </w:r>
+          </w:p>
+        </w:tc>
+        <w:tc>
+          <w:tcPr>
+            <w:tcW w:w="935" w:type="dxa"/>
             <w:vAlign w:val="center"/>
           </w:tcPr>
           <w:p>
@@ -17214,13 +17199,13 @@
                 <w:sz w:val="16"/>
                 <w:szCs w:val="16"/>
               </w:rPr>
-              <w:t>5</w:t>
+              <w:t>97.0</w:t>
             </w:r>
           </w:p>
         </w:tc>
         <w:tc>
           <w:tcPr>
-            <w:tcW w:w="850" w:type="dxa"/>
+            <w:tcW w:w="935" w:type="dxa"/>
             <w:vAlign w:val="center"/>
           </w:tcPr>
           <w:p>
@@ -17239,13 +17224,13 @@
                 <w:sz w:val="16"/>
                 <w:szCs w:val="16"/>
               </w:rPr>
-              <w:t>97.0</w:t>
+              <w:t>365.0</w:t>
             </w:r>
           </w:p>
         </w:tc>
         <w:tc>
           <w:tcPr>
-            <w:tcW w:w="850" w:type="dxa"/>
+            <w:tcW w:w="794" w:type="dxa"/>
             <w:vAlign w:val="center"/>
           </w:tcPr>
           <w:p>
@@ -17264,13 +17249,13 @@
                 <w:sz w:val="16"/>
                 <w:szCs w:val="16"/>
               </w:rPr>
-              <w:t>365.0</w:t>
+              <w:t>95.0</w:t>
             </w:r>
           </w:p>
         </w:tc>
         <w:tc>
           <w:tcPr>
-            <w:tcW w:w="850" w:type="dxa"/>
+            <w:tcW w:w="794" w:type="dxa"/>
             <w:vAlign w:val="center"/>
           </w:tcPr>
           <w:p>
@@ -17289,38 +17274,13 @@
                 <w:sz w:val="16"/>
                 <w:szCs w:val="16"/>
               </w:rPr>
-              <w:t>95.0</w:t>
-            </w:r>
-          </w:p>
-        </w:tc>
-        <w:tc>
-          <w:tcPr>
-            <w:tcW w:w="850" w:type="dxa"/>
-            <w:vAlign w:val="center"/>
-          </w:tcPr>
-          <w:p>
-            <w:pPr>
-              <w:jc w:val="right"/>
-              <w:cnfStyle w:val="000000000000" w:firstRow="0" w:lastRow="0" w:firstColumn="0" w:lastColumn="0" w:oddVBand="0" w:evenVBand="0" w:oddHBand="0" w:evenHBand="0" w:firstRowFirstColumn="0" w:firstRowLastColumn="0" w:lastRowFirstColumn="0" w:lastRowLastColumn="0"/>
-              <w:rPr>
-                <w:rFonts w:eastAsia="MS Mincho"/>
-                <w:sz w:val="16"/>
-                <w:szCs w:val="16"/>
-              </w:rPr>
-            </w:pPr>
-            <w:r>
-              <w:rPr>
-                <w:rFonts w:eastAsia="MS Mincho"/>
-                <w:sz w:val="16"/>
-                <w:szCs w:val="16"/>
-              </w:rPr>
               <w:t>16.3</w:t>
             </w:r>
           </w:p>
         </w:tc>
         <w:tc>
           <w:tcPr>
-            <w:tcW w:w="850" w:type="dxa"/>
+            <w:tcW w:w="794" w:type="dxa"/>
             <w:vAlign w:val="center"/>
           </w:tcPr>
           <w:p>
@@ -17690,7 +17650,32 @@
         </w:tc>
         <w:tc>
           <w:tcPr>
-            <w:tcW w:w="850" w:type="dxa"/>
+            <w:tcW w:w="1209" w:type="dxa"/>
+            <w:vAlign w:val="center"/>
+          </w:tcPr>
+          <w:p>
+            <w:pPr>
+              <w:jc w:val="center"/>
+              <w:cnfStyle w:val="000000000000" w:firstRow="0" w:lastRow="0" w:firstColumn="0" w:lastColumn="0" w:oddVBand="0" w:evenVBand="0" w:oddHBand="0" w:evenHBand="0" w:firstRowFirstColumn="0" w:firstRowLastColumn="0" w:lastRowFirstColumn="0" w:lastRowLastColumn="0"/>
+              <w:rPr>
+                <w:rFonts w:eastAsia="MS Mincho"/>
+                <w:sz w:val="16"/>
+                <w:szCs w:val="16"/>
+              </w:rPr>
+            </w:pPr>
+            <w:r>
+              <w:rPr>
+                <w:rFonts w:eastAsia="MS Mincho"/>
+                <w:sz w:val="16"/>
+                <w:szCs w:val="16"/>
+              </w:rPr>
+              <w:t>7</w:t>
+            </w:r>
+          </w:p>
+        </w:tc>
+        <w:tc>
+          <w:tcPr>
+            <w:tcW w:w="935" w:type="dxa"/>
             <w:vAlign w:val="center"/>
           </w:tcPr>
           <w:p>
@@ -17709,13 +17694,13 @@
                 <w:sz w:val="16"/>
                 <w:szCs w:val="16"/>
               </w:rPr>
-              <w:t>7</w:t>
+              <w:t>145.5</w:t>
             </w:r>
           </w:p>
         </w:tc>
         <w:tc>
           <w:tcPr>
-            <w:tcW w:w="850" w:type="dxa"/>
+            <w:tcW w:w="935" w:type="dxa"/>
             <w:vAlign w:val="center"/>
           </w:tcPr>
           <w:p>
@@ -17734,13 +17719,13 @@
                 <w:sz w:val="16"/>
                 <w:szCs w:val="16"/>
               </w:rPr>
-              <w:t>145.5</w:t>
+              <w:t>547.6</w:t>
             </w:r>
           </w:p>
         </w:tc>
         <w:tc>
           <w:tcPr>
-            <w:tcW w:w="850" w:type="dxa"/>
+            <w:tcW w:w="794" w:type="dxa"/>
             <w:vAlign w:val="center"/>
           </w:tcPr>
           <w:p>
@@ -17759,13 +17744,13 @@
                 <w:sz w:val="16"/>
                 <w:szCs w:val="16"/>
               </w:rPr>
-              <w:t>547.6</w:t>
+              <w:t>94.8</w:t>
             </w:r>
           </w:p>
         </w:tc>
         <w:tc>
           <w:tcPr>
-            <w:tcW w:w="850" w:type="dxa"/>
+            <w:tcW w:w="794" w:type="dxa"/>
             <w:vAlign w:val="center"/>
           </w:tcPr>
           <w:p>
@@ -17784,38 +17769,13 @@
                 <w:sz w:val="16"/>
                 <w:szCs w:val="16"/>
               </w:rPr>
-              <w:t>94.8</w:t>
-            </w:r>
-          </w:p>
-        </w:tc>
-        <w:tc>
-          <w:tcPr>
-            <w:tcW w:w="850" w:type="dxa"/>
-            <w:vAlign w:val="center"/>
-          </w:tcPr>
-          <w:p>
-            <w:pPr>
-              <w:jc w:val="right"/>
-              <w:cnfStyle w:val="000000000000" w:firstRow="0" w:lastRow="0" w:firstColumn="0" w:lastColumn="0" w:oddVBand="0" w:evenVBand="0" w:oddHBand="0" w:evenHBand="0" w:firstRowFirstColumn="0" w:firstRowLastColumn="0" w:lastRowFirstColumn="0" w:lastRowLastColumn="0"/>
-              <w:rPr>
-                <w:rFonts w:eastAsia="MS Mincho"/>
-                <w:sz w:val="16"/>
-                <w:szCs w:val="16"/>
-              </w:rPr>
-            </w:pPr>
-            <w:r>
-              <w:rPr>
-                <w:rFonts w:eastAsia="MS Mincho"/>
-                <w:sz w:val="16"/>
-                <w:szCs w:val="16"/>
-              </w:rPr>
               <w:t>4.0</w:t>
             </w:r>
           </w:p>
         </w:tc>
         <w:tc>
           <w:tcPr>
-            <w:tcW w:w="850" w:type="dxa"/>
+            <w:tcW w:w="794" w:type="dxa"/>
             <w:vAlign w:val="center"/>
           </w:tcPr>
           <w:p>
@@ -18185,7 +18145,32 @@
         </w:tc>
         <w:tc>
           <w:tcPr>
-            <w:tcW w:w="850" w:type="dxa"/>
+            <w:tcW w:w="1209" w:type="dxa"/>
+            <w:vAlign w:val="center"/>
+          </w:tcPr>
+          <w:p>
+            <w:pPr>
+              <w:jc w:val="center"/>
+              <w:cnfStyle w:val="000000000000" w:firstRow="0" w:lastRow="0" w:firstColumn="0" w:lastColumn="0" w:oddVBand="0" w:evenVBand="0" w:oddHBand="0" w:evenHBand="0" w:firstRowFirstColumn="0" w:firstRowLastColumn="0" w:lastRowFirstColumn="0" w:lastRowLastColumn="0"/>
+              <w:rPr>
+                <w:rFonts w:eastAsia="MS Mincho"/>
+                <w:sz w:val="16"/>
+                <w:szCs w:val="16"/>
+              </w:rPr>
+            </w:pPr>
+            <w:r>
+              <w:rPr>
+                <w:rFonts w:eastAsia="MS Mincho"/>
+                <w:sz w:val="16"/>
+                <w:szCs w:val="16"/>
+              </w:rPr>
+              <w:t>9</w:t>
+            </w:r>
+          </w:p>
+        </w:tc>
+        <w:tc>
+          <w:tcPr>
+            <w:tcW w:w="935" w:type="dxa"/>
             <w:vAlign w:val="center"/>
           </w:tcPr>
           <w:p>
@@ -18204,13 +18189,13 @@
                 <w:sz w:val="16"/>
                 <w:szCs w:val="16"/>
               </w:rPr>
-              <w:t>9</w:t>
+              <w:t>194.0</w:t>
             </w:r>
           </w:p>
         </w:tc>
         <w:tc>
           <w:tcPr>
-            <w:tcW w:w="850" w:type="dxa"/>
+            <w:tcW w:w="935" w:type="dxa"/>
             <w:vAlign w:val="center"/>
           </w:tcPr>
           <w:p>
@@ -18229,13 +18214,13 @@
                 <w:sz w:val="16"/>
                 <w:szCs w:val="16"/>
               </w:rPr>
-              <w:t>194.0</w:t>
+              <w:t>730.1</w:t>
             </w:r>
           </w:p>
         </w:tc>
         <w:tc>
           <w:tcPr>
-            <w:tcW w:w="850" w:type="dxa"/>
+            <w:tcW w:w="794" w:type="dxa"/>
             <w:vAlign w:val="center"/>
           </w:tcPr>
           <w:p>
@@ -18254,13 +18239,13 @@
                 <w:sz w:val="16"/>
                 <w:szCs w:val="16"/>
               </w:rPr>
-              <w:t>730.1</w:t>
+              <w:t>93.7</w:t>
             </w:r>
           </w:p>
         </w:tc>
         <w:tc>
           <w:tcPr>
-            <w:tcW w:w="850" w:type="dxa"/>
+            <w:tcW w:w="794" w:type="dxa"/>
             <w:vAlign w:val="center"/>
           </w:tcPr>
           <w:p>
@@ -18279,38 +18264,13 @@
                 <w:sz w:val="16"/>
                 <w:szCs w:val="16"/>
               </w:rPr>
-              <w:t>93.7</w:t>
-            </w:r>
-          </w:p>
-        </w:tc>
-        <w:tc>
-          <w:tcPr>
-            <w:tcW w:w="850" w:type="dxa"/>
-            <w:vAlign w:val="center"/>
-          </w:tcPr>
-          <w:p>
-            <w:pPr>
-              <w:jc w:val="right"/>
-              <w:cnfStyle w:val="000000000000" w:firstRow="0" w:lastRow="0" w:firstColumn="0" w:lastColumn="0" w:oddVBand="0" w:evenVBand="0" w:oddHBand="0" w:evenHBand="0" w:firstRowFirstColumn="0" w:firstRowLastColumn="0" w:lastRowFirstColumn="0" w:lastRowLastColumn="0"/>
-              <w:rPr>
-                <w:rFonts w:eastAsia="MS Mincho"/>
-                <w:sz w:val="16"/>
-                <w:szCs w:val="16"/>
-              </w:rPr>
-            </w:pPr>
-            <w:r>
-              <w:rPr>
-                <w:rFonts w:eastAsia="MS Mincho"/>
-                <w:sz w:val="16"/>
-                <w:szCs w:val="16"/>
-              </w:rPr>
               <w:t>0.9</w:t>
             </w:r>
           </w:p>
         </w:tc>
         <w:tc>
           <w:tcPr>
-            <w:tcW w:w="850" w:type="dxa"/>
+            <w:tcW w:w="794" w:type="dxa"/>
             <w:vAlign w:val="center"/>
           </w:tcPr>
           <w:p>
@@ -18680,7 +18640,42 @@
         </w:tc>
         <w:tc>
           <w:tcPr>
-            <w:tcW w:w="850" w:type="dxa"/>
+            <w:tcW w:w="1209" w:type="dxa"/>
+            <w:vAlign w:val="center"/>
+          </w:tcPr>
+          <w:p>
+            <w:pPr>
+              <w:jc w:val="center"/>
+              <w:cnfStyle w:val="000000000000" w:firstRow="0" w:lastRow="0" w:firstColumn="0" w:lastColumn="0" w:oddVBand="0" w:evenVBand="0" w:oddHBand="0" w:evenHBand="0" w:firstRowFirstColumn="0" w:firstRowLastColumn="0" w:lastRowFirstColumn="0" w:lastRowLastColumn="0"/>
+              <w:rPr>
+                <w:rFonts w:eastAsia="MS Mincho"/>
+                <w:sz w:val="16"/>
+                <w:szCs w:val="16"/>
+              </w:rPr>
+            </w:pPr>
+            <w:r>
+              <w:rPr>
+                <w:rFonts w:eastAsia="MS Mincho"/>
+                <w:sz w:val="16"/>
+                <w:szCs w:val="16"/>
+                <w:cs/>
+                <w:lang w:bidi="th-TH"/>
+              </w:rPr>
+              <w:t>1</w:t>
+            </w:r>
+            <w:r>
+              <w:rPr>
+                <w:rFonts w:eastAsia="MS Mincho"/>
+                <w:sz w:val="16"/>
+                <w:szCs w:val="16"/>
+              </w:rPr>
+              <w:t>1</w:t>
+            </w:r>
+          </w:p>
+        </w:tc>
+        <w:tc>
+          <w:tcPr>
+            <w:tcW w:w="935" w:type="dxa"/>
             <w:vAlign w:val="center"/>
           </w:tcPr>
           <w:p>
@@ -18698,24 +18693,14 @@
                 <w:rFonts w:eastAsia="MS Mincho"/>
                 <w:sz w:val="16"/>
                 <w:szCs w:val="16"/>
-                <w:cs/>
-                <w:lang w:bidi="th-TH"/>
-              </w:rPr>
-              <w:t>1</w:t>
-            </w:r>
-            <w:r>
-              <w:rPr>
-                <w:rFonts w:eastAsia="MS Mincho"/>
-                <w:sz w:val="16"/>
-                <w:szCs w:val="16"/>
-              </w:rPr>
-              <w:t>1</w:t>
+              </w:rPr>
+              <w:t>242.6</w:t>
             </w:r>
           </w:p>
         </w:tc>
         <w:tc>
           <w:tcPr>
-            <w:tcW w:w="850" w:type="dxa"/>
+            <w:tcW w:w="935" w:type="dxa"/>
             <w:vAlign w:val="center"/>
           </w:tcPr>
           <w:p>
@@ -18734,13 +18719,13 @@
                 <w:sz w:val="16"/>
                 <w:szCs w:val="16"/>
               </w:rPr>
-              <w:t>242.6</w:t>
+              <w:t>912.6</w:t>
             </w:r>
           </w:p>
         </w:tc>
         <w:tc>
           <w:tcPr>
-            <w:tcW w:w="850" w:type="dxa"/>
+            <w:tcW w:w="794" w:type="dxa"/>
             <w:vAlign w:val="center"/>
           </w:tcPr>
           <w:p>
@@ -18759,13 +18744,13 @@
                 <w:sz w:val="16"/>
                 <w:szCs w:val="16"/>
               </w:rPr>
-              <w:t>912.6</w:t>
+              <w:t>93.6</w:t>
             </w:r>
           </w:p>
         </w:tc>
         <w:tc>
           <w:tcPr>
-            <w:tcW w:w="850" w:type="dxa"/>
+            <w:tcW w:w="794" w:type="dxa"/>
             <w:vAlign w:val="center"/>
           </w:tcPr>
           <w:p>
@@ -18784,38 +18769,13 @@
                 <w:sz w:val="16"/>
                 <w:szCs w:val="16"/>
               </w:rPr>
-              <w:t>93.6</w:t>
-            </w:r>
-          </w:p>
-        </w:tc>
-        <w:tc>
-          <w:tcPr>
-            <w:tcW w:w="850" w:type="dxa"/>
-            <w:vAlign w:val="center"/>
-          </w:tcPr>
-          <w:p>
-            <w:pPr>
-              <w:jc w:val="right"/>
-              <w:cnfStyle w:val="000000000000" w:firstRow="0" w:lastRow="0" w:firstColumn="0" w:lastColumn="0" w:oddVBand="0" w:evenVBand="0" w:oddHBand="0" w:evenHBand="0" w:firstRowFirstColumn="0" w:firstRowLastColumn="0" w:lastRowFirstColumn="0" w:lastRowLastColumn="0"/>
-              <w:rPr>
-                <w:rFonts w:eastAsia="MS Mincho"/>
-                <w:sz w:val="16"/>
-                <w:szCs w:val="16"/>
-              </w:rPr>
-            </w:pPr>
-            <w:r>
-              <w:rPr>
-                <w:rFonts w:eastAsia="MS Mincho"/>
-                <w:sz w:val="16"/>
-                <w:szCs w:val="16"/>
-              </w:rPr>
               <w:t>0.2</w:t>
             </w:r>
           </w:p>
         </w:tc>
         <w:tc>
           <w:tcPr>
-            <w:tcW w:w="850" w:type="dxa"/>
+            <w:tcW w:w="794" w:type="dxa"/>
             <w:vAlign w:val="center"/>
           </w:tcPr>
           <w:p>
@@ -18868,6 +18828,7 @@
                 <w:sz w:val="16"/>
                 <w:szCs w:val="16"/>
               </w:rPr>
+              <w:lastRenderedPageBreak/>
               <w:t>Edge filter</w:t>
             </w:r>
           </w:p>
@@ -19191,7 +19152,37 @@
         </w:tc>
         <w:tc>
           <w:tcPr>
-            <w:tcW w:w="850" w:type="dxa"/>
+            <w:tcW w:w="1209" w:type="dxa"/>
+            <w:tcBorders>
+              <w:bottom w:val="double" w:sz="4" w:space="0" w:color="auto"/>
+            </w:tcBorders>
+            <w:vAlign w:val="center"/>
+          </w:tcPr>
+          <w:p>
+            <w:pPr>
+              <w:jc w:val="center"/>
+              <w:cnfStyle w:val="000000000000" w:firstRow="0" w:lastRow="0" w:firstColumn="0" w:lastColumn="0" w:oddVBand="0" w:evenVBand="0" w:oddHBand="0" w:evenHBand="0" w:firstRowFirstColumn="0" w:firstRowLastColumn="0" w:lastRowFirstColumn="0" w:lastRowLastColumn="0"/>
+              <w:rPr>
+                <w:rFonts w:eastAsia="MS Mincho"/>
+                <w:sz w:val="16"/>
+                <w:szCs w:val="16"/>
+              </w:rPr>
+            </w:pPr>
+            <w:r>
+              <w:rPr>
+                <w:rFonts w:eastAsia="MS Mincho"/>
+                <w:sz w:val="16"/>
+                <w:szCs w:val="16"/>
+                <w:cs/>
+                <w:lang w:bidi="th-TH"/>
+              </w:rPr>
+              <w:t>13</w:t>
+            </w:r>
+          </w:p>
+        </w:tc>
+        <w:tc>
+          <w:tcPr>
+            <w:tcW w:w="935" w:type="dxa"/>
             <w:tcBorders>
               <w:bottom w:val="double" w:sz="4" w:space="0" w:color="auto"/>
             </w:tcBorders>
@@ -19212,16 +19203,14 @@
                 <w:rFonts w:eastAsia="MS Mincho"/>
                 <w:sz w:val="16"/>
                 <w:szCs w:val="16"/>
-                <w:cs/>
-                <w:lang w:bidi="th-TH"/>
-              </w:rPr>
-              <w:t>13</w:t>
+              </w:rPr>
+              <w:t>291.1</w:t>
             </w:r>
           </w:p>
         </w:tc>
         <w:tc>
           <w:tcPr>
-            <w:tcW w:w="850" w:type="dxa"/>
+            <w:tcW w:w="935" w:type="dxa"/>
             <w:tcBorders>
               <w:bottom w:val="double" w:sz="4" w:space="0" w:color="auto"/>
             </w:tcBorders>
@@ -19243,13 +19232,13 @@
                 <w:sz w:val="16"/>
                 <w:szCs w:val="16"/>
               </w:rPr>
-              <w:t>291.1</w:t>
+              <w:t>1,095.1</w:t>
             </w:r>
           </w:p>
         </w:tc>
         <w:tc>
           <w:tcPr>
-            <w:tcW w:w="850" w:type="dxa"/>
+            <w:tcW w:w="794" w:type="dxa"/>
             <w:tcBorders>
               <w:bottom w:val="double" w:sz="4" w:space="0" w:color="auto"/>
             </w:tcBorders>
@@ -19271,13 +19260,13 @@
                 <w:sz w:val="16"/>
                 <w:szCs w:val="16"/>
               </w:rPr>
-              <w:t>1,095.1</w:t>
+              <w:t>94.5</w:t>
             </w:r>
           </w:p>
         </w:tc>
         <w:tc>
           <w:tcPr>
-            <w:tcW w:w="850" w:type="dxa"/>
+            <w:tcW w:w="794" w:type="dxa"/>
             <w:tcBorders>
               <w:bottom w:val="double" w:sz="4" w:space="0" w:color="auto"/>
             </w:tcBorders>
@@ -19299,13 +19288,13 @@
                 <w:sz w:val="16"/>
                 <w:szCs w:val="16"/>
               </w:rPr>
-              <w:t>94.5</w:t>
+              <w:t>0.0</w:t>
             </w:r>
           </w:p>
         </w:tc>
         <w:tc>
           <w:tcPr>
-            <w:tcW w:w="850" w:type="dxa"/>
+            <w:tcW w:w="794" w:type="dxa"/>
             <w:tcBorders>
               <w:bottom w:val="double" w:sz="4" w:space="0" w:color="auto"/>
             </w:tcBorders>
@@ -19327,34 +19316,6 @@
                 <w:sz w:val="16"/>
                 <w:szCs w:val="16"/>
               </w:rPr>
-              <w:t>0.0</w:t>
-            </w:r>
-          </w:p>
-        </w:tc>
-        <w:tc>
-          <w:tcPr>
-            <w:tcW w:w="850" w:type="dxa"/>
-            <w:tcBorders>
-              <w:bottom w:val="double" w:sz="4" w:space="0" w:color="auto"/>
-            </w:tcBorders>
-            <w:vAlign w:val="center"/>
-          </w:tcPr>
-          <w:p>
-            <w:pPr>
-              <w:jc w:val="right"/>
-              <w:cnfStyle w:val="000000000000" w:firstRow="0" w:lastRow="0" w:firstColumn="0" w:lastColumn="0" w:oddVBand="0" w:evenVBand="0" w:oddHBand="0" w:evenHBand="0" w:firstRowFirstColumn="0" w:firstRowLastColumn="0" w:lastRowFirstColumn="0" w:lastRowLastColumn="0"/>
-              <w:rPr>
-                <w:rFonts w:eastAsia="MS Mincho"/>
-                <w:sz w:val="16"/>
-                <w:szCs w:val="16"/>
-              </w:rPr>
-            </w:pPr>
-            <w:r>
-              <w:rPr>
-                <w:rFonts w:eastAsia="MS Mincho"/>
-                <w:sz w:val="16"/>
-                <w:szCs w:val="16"/>
-              </w:rPr>
               <w:t>94.5</w:t>
             </w:r>
           </w:p>
@@ -19505,7 +19466,6 @@
           <w:rFonts w:eastAsia="MS Mincho"/>
           <w:noProof/>
         </w:rPr>
-        <w:lastRenderedPageBreak/>
         <w:drawing>
           <wp:inline distT="0" distB="0" distL="0" distR="0" wp14:anchorId="6BFC200B" wp14:editId="10C320C5">
             <wp:extent cx="6336805" cy="3566167"/>
@@ -19599,6 +19559,7 @@
           <w:rFonts w:cs="Times New Roman"/>
           <w:i w:val="0"/>
           <w:iCs w:val="0"/>
+          <w:highlight w:val="yellow"/>
         </w:rPr>
       </w:pPr>
       <w:r>
@@ -19646,7 +19607,47 @@
           <w:i w:val="0"/>
           <w:iCs w:val="0"/>
         </w:rPr>
-        <w:t>°, and with polarization in TE (Fig. 7a and 7c) and TM (Fig. 7b and 7d). For both TE</w:t>
+        <w:t xml:space="preserve">°, and with polarization in TE (Fig. 7a and 7c) and TM (Fig. 7b and 7d). </w:t>
+      </w:r>
+      <w:r>
+        <w:rPr>
+          <w:rStyle w:val="Emphasis"/>
+          <w:rFonts w:cs="Times New Roman"/>
+          <w:i w:val="0"/>
+          <w:iCs w:val="0"/>
+          <w:highlight w:val="yellow"/>
+        </w:rPr>
+        <w:t>For</w:t>
+      </w:r>
+      <w:r>
+        <w:rPr>
+          <w:rStyle w:val="Emphasis"/>
+          <w:rFonts w:cs="Times New Roman"/>
+          <w:i w:val="0"/>
+          <w:iCs w:val="0"/>
+          <w:highlight w:val="yellow"/>
+        </w:rPr>
+        <w:t xml:space="preserve"> both</w:t>
+      </w:r>
+      <w:r>
+        <w:rPr>
+          <w:rStyle w:val="Emphasis"/>
+          <w:rFonts w:cs="Times New Roman"/>
+          <w:i w:val="0"/>
+          <w:iCs w:val="0"/>
+          <w:highlight w:val="yellow"/>
+        </w:rPr>
+        <w:t xml:space="preserve"> TE</w:t>
+      </w:r>
+      <w:r>
+        <w:rPr>
+          <w:rStyle w:val="Emphasis"/>
+          <w:rFonts w:cs="Times New Roman"/>
+          <w:i w:val="0"/>
+          <w:iCs w:val="0"/>
+          <w:highlight w:val="yellow"/>
+        </w:rPr>
+        <w:t xml:space="preserve"> and TM</w:t>
       </w:r>
       <w:r>
         <w:rPr>
@@ -19655,72 +19656,9 @@
           <w:i w:val="0"/>
           <w:iCs w:val="0"/>
           <w:color w:val="000000"/>
-        </w:rPr>
-        <w:t xml:space="preserve"> and TM polarized light, </w:t>
-      </w:r>
-      <w:r>
-        <w:rPr>
-          <w:rStyle w:val="Emphasis"/>
-          <w:rFonts w:cs="Times New Roman"/>
-          <w:i w:val="0"/>
-          <w:iCs w:val="0"/>
-        </w:rPr>
-        <w:t>Δ</w:t>
-      </w:r>
-      <w:r>
-        <w:rPr>
-          <w:rStyle w:val="Emphasis"/>
-          <w:rFonts w:cs="Times New Roman"/>
-        </w:rPr>
-        <w:t>T</w:t>
-      </w:r>
-      <w:r>
-        <w:rPr>
-          <w:rStyle w:val="Emphasis"/>
-          <w:rFonts w:cs="Times New Roman"/>
+          <w:highlight w:val="yellow"/>
         </w:rPr>
         <w:t xml:space="preserve"> </w:t>
-      </w:r>
-      <w:r>
-        <w:rPr>
-          <w:rStyle w:val="Emphasis"/>
-          <w:rFonts w:cs="Times New Roman"/>
-          <w:i w:val="0"/>
-          <w:iCs w:val="0"/>
-        </w:rPr>
-        <w:t>remains higher than 90% from 0° to ~30°, but TM polarization causes the high-</w:t>
-      </w:r>
-      <w:r>
-        <w:rPr>
-          <w:rStyle w:val="Emphasis"/>
-          <w:rFonts w:cs="Times New Roman"/>
-          <w:i w:val="0"/>
-          <w:iCs w:val="0"/>
-        </w:rPr>
-        <w:t>Δ</w:t>
-      </w:r>
-      <w:r>
-        <w:rPr>
-          <w:rStyle w:val="Emphasis"/>
-          <w:rFonts w:cs="Times New Roman"/>
-        </w:rPr>
-        <w:t>T</w:t>
-      </w:r>
-      <w:r>
-        <w:rPr>
-          <w:rStyle w:val="Emphasis"/>
-          <w:rFonts w:cs="Times New Roman"/>
-        </w:rPr>
-        <w:t xml:space="preserve"> </w:t>
-      </w:r>
-      <w:r>
-        <w:rPr>
-          <w:rStyle w:val="Emphasis"/>
-          <w:rFonts w:cs="Times New Roman"/>
-          <w:i w:val="0"/>
-          <w:iCs w:val="0"/>
-        </w:rPr>
-        <w:t>region to blueshift significantly at higher incident angle. The spectral width</w:t>
       </w:r>
       <w:r>
         <w:rPr>
@@ -19729,8 +19667,9 @@
           <w:i w:val="0"/>
           <w:iCs w:val="0"/>
           <w:color w:val="000000"/>
-        </w:rPr>
-        <w:t>s of the high-</w:t>
+          <w:highlight w:val="yellow"/>
+        </w:rPr>
+        <w:t xml:space="preserve">polarized light, </w:t>
       </w:r>
       <w:r>
         <w:rPr>
@@ -19738,6 +19677,7 @@
           <w:rFonts w:cs="Times New Roman"/>
           <w:i w:val="0"/>
           <w:iCs w:val="0"/>
+          <w:highlight w:val="yellow"/>
         </w:rPr>
         <w:t>Δ</w:t>
       </w:r>
@@ -19745,15 +19685,9 @@
         <w:rPr>
           <w:rStyle w:val="Emphasis"/>
           <w:rFonts w:cs="Times New Roman"/>
-        </w:rPr>
-        <w:t>T</w:t>
-      </w:r>
-      <w:r>
-        <w:rPr>
-          <w:rStyle w:val="Emphasis"/>
-          <w:rFonts w:cs="Times New Roman"/>
-        </w:rPr>
-        <w:t xml:space="preserve"> </w:t>
+          <w:highlight w:val="yellow"/>
+        </w:rPr>
+        <w:t xml:space="preserve">T </w:t>
       </w:r>
       <w:r>
         <w:rPr>
@@ -19761,8 +19695,581 @@
           <w:rFonts w:cs="Times New Roman"/>
           <w:i w:val="0"/>
           <w:iCs w:val="0"/>
-        </w:rPr>
-        <w:t xml:space="preserve">region in both designs are comparable, but </w:t>
+          <w:highlight w:val="yellow"/>
+        </w:rPr>
+        <w:t xml:space="preserve">at 1064 nm </w:t>
+      </w:r>
+      <w:r>
+        <w:rPr>
+          <w:rStyle w:val="Emphasis"/>
+          <w:rFonts w:cs="Times New Roman"/>
+          <w:i w:val="0"/>
+          <w:iCs w:val="0"/>
+          <w:highlight w:val="yellow"/>
+        </w:rPr>
+        <w:t>remains higher than 90% from 0° to ~30°</w:t>
+      </w:r>
+      <w:r>
+        <w:rPr>
+          <w:rStyle w:val="Emphasis"/>
+          <w:rFonts w:cs="Times New Roman"/>
+          <w:i w:val="0"/>
+          <w:iCs w:val="0"/>
+          <w:highlight w:val="yellow"/>
+        </w:rPr>
+        <w:t>.</w:t>
+      </w:r>
+    </w:p>
+    <w:p>
+      <w:pPr>
+        <w:pStyle w:val="10BodySubsequentParagraph"/>
+        <w:rPr>
+          <w:rStyle w:val="Emphasis"/>
+          <w:rFonts w:cs="Times New Roman"/>
+          <w:i w:val="0"/>
+          <w:iCs w:val="0"/>
+          <w:highlight w:val="yellow"/>
+        </w:rPr>
+      </w:pPr>
+      <w:r>
+        <w:rPr>
+          <w:rStyle w:val="Emphasis"/>
+          <w:rFonts w:cs="Times New Roman"/>
+          <w:i w:val="0"/>
+          <w:iCs w:val="0"/>
+          <w:highlight w:val="yellow"/>
+        </w:rPr>
+        <w:t>At higher incident angle, the high-</w:t>
+      </w:r>
+      <w:r>
+        <w:rPr>
+          <w:rStyle w:val="Emphasis"/>
+          <w:rFonts w:cs="Times New Roman"/>
+          <w:i w:val="0"/>
+          <w:iCs w:val="0"/>
+          <w:highlight w:val="yellow"/>
+        </w:rPr>
+        <w:t>Δ</w:t>
+      </w:r>
+      <w:r>
+        <w:rPr>
+          <w:rStyle w:val="Emphasis"/>
+          <w:rFonts w:cs="Times New Roman"/>
+          <w:highlight w:val="yellow"/>
+        </w:rPr>
+        <w:t>T</w:t>
+      </w:r>
+      <w:r>
+        <w:rPr>
+          <w:rStyle w:val="Emphasis"/>
+          <w:rFonts w:cs="Times New Roman"/>
+          <w:highlight w:val="yellow"/>
+        </w:rPr>
+        <w:t xml:space="preserve"> </w:t>
+      </w:r>
+      <w:r>
+        <w:rPr>
+          <w:rStyle w:val="Emphasis"/>
+          <w:rFonts w:cs="Times New Roman"/>
+          <w:i w:val="0"/>
+          <w:iCs w:val="0"/>
+          <w:highlight w:val="yellow"/>
+        </w:rPr>
+        <w:t xml:space="preserve">spectral profile (yellow-green) shifted to shorter wavelengths. </w:t>
+      </w:r>
+      <w:r>
+        <w:rPr>
+          <w:rStyle w:val="Emphasis"/>
+          <w:rFonts w:cs="Times New Roman"/>
+          <w:i w:val="0"/>
+          <w:iCs w:val="0"/>
+          <w:highlight w:val="yellow"/>
+        </w:rPr>
+        <w:t xml:space="preserve">For TE polarized light, the blueshift of wavelength with the highest </w:t>
+      </w:r>
+      <w:r>
+        <w:rPr>
+          <w:rStyle w:val="Emphasis"/>
+          <w:rFonts w:cs="Times New Roman"/>
+          <w:highlight w:val="yellow"/>
+        </w:rPr>
+        <w:t>ΔT</w:t>
+      </w:r>
+      <w:r>
+        <w:rPr>
+          <w:rStyle w:val="Emphasis"/>
+          <w:rFonts w:cs="Times New Roman"/>
+          <w:i w:val="0"/>
+          <w:iCs w:val="0"/>
+          <w:highlight w:val="yellow"/>
+        </w:rPr>
+        <w:t xml:space="preserve"> at 45° compared to 0° </w:t>
+      </w:r>
+      <w:r>
+        <w:rPr>
+          <w:rStyle w:val="Emphasis"/>
+          <w:rFonts w:cs="Times New Roman"/>
+          <w:i w:val="0"/>
+          <w:iCs w:val="0"/>
+          <w:highlight w:val="yellow"/>
+        </w:rPr>
+        <w:t>incident angle</w:t>
+      </w:r>
+      <w:r>
+        <w:rPr>
+          <w:rStyle w:val="Emphasis"/>
+          <w:rFonts w:cs="Times New Roman"/>
+          <w:i w:val="0"/>
+          <w:iCs w:val="0"/>
+          <w:highlight w:val="yellow"/>
+        </w:rPr>
+        <w:t xml:space="preserve"> are -</w:t>
+      </w:r>
+      <w:r>
+        <w:rPr>
+          <w:rStyle w:val="Emphasis"/>
+          <w:rFonts w:cs="Times New Roman"/>
+          <w:i w:val="0"/>
+          <w:iCs w:val="0"/>
+          <w:highlight w:val="yellow"/>
+        </w:rPr>
+        <w:t>3</w:t>
+      </w:r>
+      <w:r>
+        <w:rPr>
+          <w:rStyle w:val="Emphasis"/>
+          <w:rFonts w:cs="Times New Roman"/>
+          <w:i w:val="0"/>
+          <w:iCs w:val="0"/>
+          <w:highlight w:val="yellow"/>
+        </w:rPr>
+        <w:t xml:space="preserve">7 and </w:t>
+      </w:r>
+      <w:r>
+        <w:rPr>
+          <w:rStyle w:val="Emphasis"/>
+          <w:rFonts w:cs="Times New Roman"/>
+          <w:i w:val="0"/>
+          <w:iCs w:val="0"/>
+          <w:highlight w:val="yellow"/>
+        </w:rPr>
+        <w:t>-</w:t>
+      </w:r>
+      <w:r>
+        <w:rPr>
+          <w:rStyle w:val="Emphasis"/>
+          <w:rFonts w:cs="Times New Roman"/>
+          <w:i w:val="0"/>
+          <w:iCs w:val="0"/>
+          <w:highlight w:val="yellow"/>
+        </w:rPr>
+        <w:t>5</w:t>
+      </w:r>
+      <w:r>
+        <w:rPr>
+          <w:rStyle w:val="Emphasis"/>
+          <w:rFonts w:cs="Times New Roman"/>
+          <w:i w:val="0"/>
+          <w:iCs w:val="0"/>
+          <w:highlight w:val="yellow"/>
+        </w:rPr>
+        <w:t>7</w:t>
+      </w:r>
+      <w:r>
+        <w:rPr>
+          <w:rStyle w:val="Emphasis"/>
+          <w:rFonts w:cs="Times New Roman"/>
+          <w:i w:val="0"/>
+          <w:iCs w:val="0"/>
+          <w:highlight w:val="yellow"/>
+        </w:rPr>
+        <w:t xml:space="preserve"> nm for 4-unit-cell and 5-unit-cell designs, respectively. </w:t>
+      </w:r>
+      <w:r>
+        <w:rPr>
+          <w:rStyle w:val="Emphasis"/>
+          <w:rFonts w:cs="Times New Roman"/>
+          <w:i w:val="0"/>
+          <w:iCs w:val="0"/>
+          <w:highlight w:val="yellow"/>
+        </w:rPr>
+        <w:t>And a</w:t>
+      </w:r>
+      <w:r>
+        <w:rPr>
+          <w:rStyle w:val="Emphasis"/>
+          <w:rFonts w:cs="Times New Roman"/>
+          <w:i w:val="0"/>
+          <w:iCs w:val="0"/>
+          <w:highlight w:val="yellow"/>
+        </w:rPr>
+        <w:t xml:space="preserve">t 60° angles the blueshift are </w:t>
+      </w:r>
+      <w:r>
+        <w:rPr>
+          <w:rStyle w:val="Emphasis"/>
+          <w:rFonts w:cs="Times New Roman"/>
+          <w:i w:val="0"/>
+          <w:iCs w:val="0"/>
+          <w:highlight w:val="yellow"/>
+        </w:rPr>
+        <w:t>-</w:t>
+      </w:r>
+      <w:r>
+        <w:rPr>
+          <w:rStyle w:val="Emphasis"/>
+          <w:rFonts w:cs="Times New Roman"/>
+          <w:i w:val="0"/>
+          <w:iCs w:val="0"/>
+          <w:highlight w:val="yellow"/>
+        </w:rPr>
+        <w:t>90, -143</w:t>
+      </w:r>
+      <w:r>
+        <w:rPr>
+          <w:rStyle w:val="Emphasis"/>
+          <w:rFonts w:cs="Times New Roman"/>
+          <w:i w:val="0"/>
+          <w:iCs w:val="0"/>
+          <w:highlight w:val="yellow"/>
+        </w:rPr>
+        <w:t xml:space="preserve"> nm, respectively. </w:t>
+      </w:r>
+      <w:r>
+        <w:rPr>
+          <w:rStyle w:val="Emphasis"/>
+          <w:rFonts w:cs="Times New Roman"/>
+          <w:i w:val="0"/>
+          <w:iCs w:val="0"/>
+          <w:highlight w:val="yellow"/>
+        </w:rPr>
+        <w:t xml:space="preserve">As </w:t>
+      </w:r>
+      <w:r>
+        <w:rPr>
+          <w:rStyle w:val="Emphasis"/>
+          <w:rFonts w:cs="Times New Roman"/>
+          <w:i w:val="0"/>
+          <w:iCs w:val="0"/>
+          <w:highlight w:val="yellow"/>
+        </w:rPr>
+        <w:t xml:space="preserve">for TM polarized light, the </w:t>
+      </w:r>
+      <w:r>
+        <w:rPr>
+          <w:rStyle w:val="Emphasis"/>
+          <w:rFonts w:cs="Times New Roman"/>
+          <w:i w:val="0"/>
+          <w:iCs w:val="0"/>
+          <w:highlight w:val="yellow"/>
+        </w:rPr>
+        <w:t>peak</w:t>
+      </w:r>
+      <w:r>
+        <w:rPr>
+          <w:rStyle w:val="Emphasis"/>
+          <w:rFonts w:cs="Times New Roman"/>
+          <w:i w:val="0"/>
+          <w:iCs w:val="0"/>
+          <w:highlight w:val="yellow"/>
+        </w:rPr>
+        <w:t xml:space="preserve"> </w:t>
+      </w:r>
+      <w:r>
+        <w:rPr>
+          <w:rStyle w:val="Emphasis"/>
+          <w:rFonts w:cs="Times New Roman"/>
+          <w:highlight w:val="yellow"/>
+        </w:rPr>
+        <w:t>ΔT</w:t>
+      </w:r>
+      <w:r>
+        <w:rPr>
+          <w:rStyle w:val="Emphasis"/>
+          <w:rFonts w:cs="Times New Roman"/>
+          <w:i w:val="0"/>
+          <w:iCs w:val="0"/>
+          <w:highlight w:val="yellow"/>
+        </w:rPr>
+        <w:t xml:space="preserve"> blueshift </w:t>
+      </w:r>
+      <w:r>
+        <w:rPr>
+          <w:rStyle w:val="Emphasis"/>
+          <w:rFonts w:cs="Times New Roman"/>
+          <w:i w:val="0"/>
+          <w:iCs w:val="0"/>
+          <w:highlight w:val="yellow"/>
+        </w:rPr>
+        <w:t>in</w:t>
+      </w:r>
+      <w:r>
+        <w:rPr>
+          <w:rStyle w:val="Emphasis"/>
+          <w:rFonts w:cs="Times New Roman"/>
+          <w:i w:val="0"/>
+          <w:iCs w:val="0"/>
+          <w:highlight w:val="yellow"/>
+        </w:rPr>
+        <w:t xml:space="preserve"> 4-unit-cell and 5-unit-cell designs at 45° are -</w:t>
+      </w:r>
+      <w:r>
+        <w:rPr>
+          <w:rStyle w:val="Emphasis"/>
+          <w:rFonts w:cs="Times New Roman"/>
+          <w:i w:val="0"/>
+          <w:iCs w:val="0"/>
+          <w:highlight w:val="yellow"/>
+        </w:rPr>
+        <w:t>103</w:t>
+      </w:r>
+      <w:r>
+        <w:rPr>
+          <w:rStyle w:val="Emphasis"/>
+          <w:rFonts w:cs="Times New Roman"/>
+          <w:i w:val="0"/>
+          <w:iCs w:val="0"/>
+          <w:highlight w:val="yellow"/>
+        </w:rPr>
+        <w:t xml:space="preserve"> and </w:t>
+      </w:r>
+      <w:r>
+        <w:rPr>
+          <w:rStyle w:val="Emphasis"/>
+          <w:rFonts w:cs="Times New Roman"/>
+          <w:i w:val="0"/>
+          <w:iCs w:val="0"/>
+          <w:highlight w:val="yellow"/>
+        </w:rPr>
+        <w:t xml:space="preserve">-168 </w:t>
+      </w:r>
+      <w:r>
+        <w:rPr>
+          <w:rStyle w:val="Emphasis"/>
+          <w:rFonts w:cs="Times New Roman"/>
+          <w:i w:val="0"/>
+          <w:iCs w:val="0"/>
+          <w:highlight w:val="yellow"/>
+        </w:rPr>
+        <w:t>nm, respectively. At 60° incident angles they are</w:t>
+      </w:r>
+      <w:r>
+        <w:rPr>
+          <w:rStyle w:val="Emphasis"/>
+          <w:rFonts w:cs="Times New Roman"/>
+          <w:i w:val="0"/>
+          <w:iCs w:val="0"/>
+          <w:highlight w:val="yellow"/>
+        </w:rPr>
+        <w:t xml:space="preserve"> -</w:t>
+      </w:r>
+      <w:r>
+        <w:rPr>
+          <w:rStyle w:val="Emphasis"/>
+          <w:rFonts w:cs="Times New Roman"/>
+          <w:i w:val="0"/>
+          <w:iCs w:val="0"/>
+          <w:highlight w:val="yellow"/>
+        </w:rPr>
+        <w:t>156</w:t>
+      </w:r>
+      <w:r>
+        <w:rPr>
+          <w:rStyle w:val="Emphasis"/>
+          <w:rFonts w:cs="Times New Roman"/>
+          <w:i w:val="0"/>
+          <w:iCs w:val="0"/>
+          <w:highlight w:val="yellow"/>
+        </w:rPr>
+        <w:t xml:space="preserve"> and </w:t>
+      </w:r>
+      <w:r>
+        <w:rPr>
+          <w:rStyle w:val="Emphasis"/>
+          <w:rFonts w:cs="Times New Roman"/>
+          <w:i w:val="0"/>
+          <w:iCs w:val="0"/>
+          <w:highlight w:val="yellow"/>
+        </w:rPr>
+        <w:t>-226</w:t>
+      </w:r>
+      <w:r>
+        <w:rPr>
+          <w:rStyle w:val="Emphasis"/>
+          <w:rFonts w:cs="Times New Roman"/>
+          <w:i w:val="0"/>
+          <w:iCs w:val="0"/>
+          <w:highlight w:val="yellow"/>
+        </w:rPr>
+        <w:t xml:space="preserve"> nm, respectively.</w:t>
+      </w:r>
+      <w:r>
+        <w:rPr>
+          <w:rStyle w:val="Emphasis"/>
+          <w:rFonts w:cs="Times New Roman"/>
+          <w:i w:val="0"/>
+          <w:iCs w:val="0"/>
+          <w:highlight w:val="yellow"/>
+        </w:rPr>
+        <w:t xml:space="preserve"> It can be seen that the </w:t>
+      </w:r>
+      <w:r>
+        <w:rPr>
+          <w:rStyle w:val="Emphasis"/>
+          <w:rFonts w:cs="Times New Roman"/>
+          <w:highlight w:val="yellow"/>
+        </w:rPr>
+        <w:t>ΔT</w:t>
+      </w:r>
+      <w:r>
+        <w:rPr>
+          <w:rStyle w:val="Emphasis"/>
+          <w:rFonts w:cs="Times New Roman"/>
+          <w:i w:val="0"/>
+          <w:iCs w:val="0"/>
+          <w:highlight w:val="yellow"/>
+        </w:rPr>
+        <w:t xml:space="preserve"> </w:t>
+      </w:r>
+      <w:r>
+        <w:rPr>
+          <w:rStyle w:val="Emphasis"/>
+          <w:rFonts w:cs="Times New Roman"/>
+          <w:i w:val="0"/>
+          <w:iCs w:val="0"/>
+          <w:highlight w:val="yellow"/>
+        </w:rPr>
+        <w:t>profile of both polarization modes blue shifted with increasing incident angle, with TM polarization caus</w:t>
+      </w:r>
+      <w:r>
+        <w:rPr>
+          <w:rStyle w:val="Emphasis"/>
+          <w:rFonts w:cs="Times New Roman"/>
+          <w:i w:val="0"/>
+          <w:iCs w:val="0"/>
+          <w:highlight w:val="yellow"/>
+        </w:rPr>
+        <w:t>ing</w:t>
+      </w:r>
+      <w:r>
+        <w:rPr>
+          <w:rStyle w:val="Emphasis"/>
+          <w:rFonts w:cs="Times New Roman"/>
+          <w:i w:val="0"/>
+          <w:iCs w:val="0"/>
+          <w:highlight w:val="yellow"/>
+        </w:rPr>
+        <w:t xml:space="preserve"> longer blueshift. This </w:t>
+      </w:r>
+      <w:r>
+        <w:rPr>
+          <w:rStyle w:val="Emphasis"/>
+          <w:rFonts w:cs="Times New Roman"/>
+          <w:i w:val="0"/>
+          <w:iCs w:val="0"/>
+          <w:highlight w:val="yellow"/>
+        </w:rPr>
+        <w:t xml:space="preserve">effect </w:t>
+      </w:r>
+      <w:r>
+        <w:rPr>
+          <w:rStyle w:val="Emphasis"/>
+          <w:rFonts w:cs="Times New Roman"/>
+          <w:i w:val="0"/>
+          <w:iCs w:val="0"/>
+          <w:highlight w:val="yellow"/>
+        </w:rPr>
+        <w:t xml:space="preserve">is surprisingly counterintuitive, since increasing </w:t>
+      </w:r>
+      <w:r>
+        <w:rPr>
+          <w:rStyle w:val="Emphasis"/>
+          <w:rFonts w:cs="Times New Roman"/>
+          <w:i w:val="0"/>
+          <w:iCs w:val="0"/>
+          <w:highlight w:val="yellow"/>
+        </w:rPr>
+        <w:t>incident angle effectively increases the thickness (t) of each film layer, this then increase the optical thickness (OT) from Eq. 2 and should’ve decreased k</w:t>
+      </w:r>
+      <w:r>
+        <w:rPr>
+          <w:rStyle w:val="Emphasis"/>
+          <w:rFonts w:cs="Times New Roman"/>
+          <w:i w:val="0"/>
+          <w:iCs w:val="0"/>
+          <w:highlight w:val="yellow"/>
+          <w:vertAlign w:val="subscript"/>
+        </w:rPr>
+        <w:t>0</w:t>
+      </w:r>
+      <w:r>
+        <w:rPr>
+          <w:rStyle w:val="Emphasis"/>
+          <w:rFonts w:cs="Times New Roman"/>
+          <w:i w:val="0"/>
+          <w:iCs w:val="0"/>
+          <w:highlight w:val="yellow"/>
+        </w:rPr>
+        <w:t xml:space="preserve"> from Eq. 6 thereby increasing the wavelenght (</w:t>
+      </w:r>
+      <w:r>
+        <w:rPr>
+          <w:rFonts w:eastAsia="MS Mincho"/>
+          <w:szCs w:val="20"/>
+          <w:highlight w:val="yellow"/>
+        </w:rPr>
+        <w:t>λ</w:t>
+      </w:r>
+      <w:r>
+        <w:rPr>
+          <w:rFonts w:eastAsia="MS Mincho"/>
+          <w:szCs w:val="20"/>
+          <w:highlight w:val="yellow"/>
+        </w:rPr>
+        <w:t>). But</w:t>
+      </w:r>
+    </w:p>
+    <w:p>
+      <w:pPr>
+        <w:pStyle w:val="10BodySubsequentParagraph"/>
+        <w:rPr>
+          <w:rStyle w:val="Emphasis"/>
+          <w:rFonts w:cs="Times New Roman"/>
+          <w:i w:val="0"/>
+          <w:iCs w:val="0"/>
+          <w:highlight w:val="yellow"/>
+        </w:rPr>
+      </w:pPr>
+    </w:p>
+    <w:p>
+      <w:pPr>
+        <w:pStyle w:val="10BodySubsequentParagraph"/>
+        <w:rPr>
+          <w:rStyle w:val="Emphasis"/>
+          <w:rFonts w:cs="Times New Roman"/>
+          <w:i w:val="0"/>
+          <w:iCs w:val="0"/>
+        </w:rPr>
+      </w:pPr>
+    </w:p>
+    <w:p>
+      <w:pPr>
+        <w:pStyle w:val="10BodySubsequentParagraph"/>
+        <w:rPr>
+          <w:rStyle w:val="Emphasis"/>
+          <w:rFonts w:cs="Times New Roman"/>
+          <w:i w:val="0"/>
+          <w:iCs w:val="0"/>
+        </w:rPr>
+      </w:pPr>
+      <w:r>
+        <w:rPr>
+          <w:rStyle w:val="Emphasis"/>
+          <w:rFonts w:cs="Times New Roman"/>
+          <w:i w:val="0"/>
+          <w:iCs w:val="0"/>
+        </w:rPr>
+        <w:t>The spectral width</w:t>
       </w:r>
       <w:r>
         <w:rPr>
@@ -19772,7 +20279,7 @@
           <w:iCs w:val="0"/>
           <w:color w:val="000000"/>
         </w:rPr>
-        <w:t xml:space="preserve">the 5-unit-cell design has a higher </w:t>
+        <w:t>s of the high-</w:t>
       </w:r>
       <w:r>
         <w:rPr>
@@ -19794,34 +20301,27 @@
         <w:rPr>
           <w:rStyle w:val="Emphasis"/>
           <w:rFonts w:cs="Times New Roman"/>
-          <w:i w:val="0"/>
-          <w:iCs w:val="0"/>
-        </w:rPr>
-        <w:t xml:space="preserve"> across the spectrum, which indicates a better broadband, wide-angle, tunable optical device.</w:t>
-      </w:r>
-    </w:p>
-    <w:p>
-      <w:pPr>
-        <w:pStyle w:val="10BodySubsequentParagraph"/>
+        </w:rPr>
+        <w:t xml:space="preserve"> </w:t>
+      </w:r>
+      <w:r>
         <w:rPr>
           <w:rStyle w:val="Emphasis"/>
           <w:rFonts w:cs="Times New Roman"/>
           <w:i w:val="0"/>
           <w:iCs w:val="0"/>
         </w:rPr>
-      </w:pPr>
-      <w:r>
-        <w:rPr>
-          <w:rFonts w:cs="Times New Roman"/>
-        </w:rPr>
-        <w:t xml:space="preserve">With the reasons given above, we decided that a 5-unit-cell, long-pass edge-filter design (Fig. 6, yellow) has the best compromise between high optical performances, device size, and complexity. This design has a broadband transmittance contrast between </w:t>
-      </w:r>
-      <w:r>
-        <w:rPr>
+        <w:t xml:space="preserve">region in both designs are comparable, but </w:t>
+      </w:r>
+      <w:r>
+        <w:rPr>
+          <w:rStyle w:val="Emphasis"/>
           <w:rFonts w:eastAsia="MS Mincho" w:cs="Times New Roman"/>
+          <w:i w:val="0"/>
+          <w:iCs w:val="0"/>
           <w:color w:val="000000"/>
         </w:rPr>
-        <w:t>the amorphous (ON mode) and the crystalline phases (OFF mode), and the FWHM of high-</w:t>
+        <w:t xml:space="preserve">the 5-unit-cell design has a higher </w:t>
       </w:r>
       <w:r>
         <w:rPr>
@@ -19846,11 +20346,154 @@
           <w:i w:val="0"/>
           <w:iCs w:val="0"/>
         </w:rPr>
-        <w:t xml:space="preserve"> region is 197.0 nm. This design is used as an example in the following sections.</w:t>
+        <w:t xml:space="preserve"> across the spectrum, which indicates a better broadband, wide-angle, tunable optical device.</w:t>
       </w:r>
     </w:p>
     <w:p>
       <w:pPr>
+        <w:pStyle w:val="10BodySubsequentParagraph"/>
+        <w:rPr>
+          <w:rStyle w:val="Emphasis"/>
+          <w:rFonts w:cs="Times New Roman"/>
+          <w:i w:val="0"/>
+          <w:iCs w:val="0"/>
+        </w:rPr>
+        <w:sectPr>
+          <w:type w:val="continuous"/>
+          <w:pgSz w:w="11520" w:h="15660" w:code="1"/>
+          <w:pgMar w:top="1300" w:right="740" w:bottom="1040" w:left="740" w:header="360" w:footer="640" w:gutter="0"/>
+          <w:cols w:num="2" w:space="400"/>
+          <w:docGrid w:linePitch="360"/>
+        </w:sectPr>
+      </w:pPr>
+      <w:r>
+        <w:rPr>
+          <w:rFonts w:cs="Times New Roman"/>
+        </w:rPr>
+        <w:t xml:space="preserve">With the reasons given above, we decided that a 5-unit-cell, long-pass edge-filter design (Fig. 6, yellow) has the best compromise between high optical performances, device size, and complexity. This design has a broadband transmittance contrast between </w:t>
+      </w:r>
+      <w:r>
+        <w:rPr>
+          <w:rFonts w:eastAsia="MS Mincho" w:cs="Times New Roman"/>
+          <w:color w:val="000000"/>
+        </w:rPr>
+        <w:t>the amorphous (ON mode) and the crystalline phases (OFF mode</w:t>
+      </w:r>
+      <w:r>
+        <w:rPr>
+          <w:rFonts w:eastAsia="MS Mincho" w:cs="Times New Roman"/>
+          <w:color w:val="000000"/>
+        </w:rPr>
+        <w:t>)</w:t>
+      </w:r>
+      <w:r>
+        <w:rPr>
+          <w:rFonts w:eastAsia="MS Mincho" w:cs="Times New Roman"/>
+          <w:color w:val="000000"/>
+        </w:rPr>
+        <w:t xml:space="preserve"> </w:t>
+      </w:r>
+      <w:r>
+        <w:rPr>
+          <w:rFonts w:eastAsia="MS Mincho" w:cs="Times New Roman"/>
+          <w:color w:val="000000"/>
+          <w:highlight w:val="yellow"/>
+        </w:rPr>
+        <w:t xml:space="preserve">with </w:t>
+      </w:r>
+      <w:r>
+        <w:rPr>
+          <w:rStyle w:val="Emphasis"/>
+          <w:rFonts w:cs="Times New Roman"/>
+          <w:i w:val="0"/>
+          <w:iCs w:val="0"/>
+          <w:highlight w:val="yellow"/>
+        </w:rPr>
+        <w:t>Δ</w:t>
+      </w:r>
+      <w:r>
+        <w:rPr>
+          <w:rStyle w:val="Emphasis"/>
+          <w:rFonts w:cs="Times New Roman"/>
+          <w:highlight w:val="yellow"/>
+        </w:rPr>
+        <w:t>T</w:t>
+      </w:r>
+      <w:r>
+        <w:rPr>
+          <w:rStyle w:val="Emphasis"/>
+          <w:rFonts w:cs="Times New Roman"/>
+          <w:highlight w:val="yellow"/>
+        </w:rPr>
+        <w:t xml:space="preserve"> </w:t>
+      </w:r>
+      <w:r>
+        <w:rPr>
+          <w:rFonts w:eastAsia="MS Mincho" w:cs="Times New Roman"/>
+          <w:color w:val="000000"/>
+          <w:highlight w:val="yellow"/>
+        </w:rPr>
+        <w:t>FWHM</w:t>
+      </w:r>
+      <w:r>
+        <w:rPr>
+          <w:rFonts w:eastAsia="MS Mincho" w:cs="Times New Roman"/>
+          <w:color w:val="000000"/>
+          <w:highlight w:val="yellow"/>
+        </w:rPr>
+        <w:t xml:space="preserve"> of 197.0 nm.</w:t>
+      </w:r>
+      <w:r>
+        <w:rPr>
+          <w:rFonts w:eastAsia="MS Mincho" w:cs="Times New Roman"/>
+          <w:color w:val="000000"/>
+        </w:rPr>
+        <w:t xml:space="preserve"> </w:t>
+      </w:r>
+      <w:r>
+        <w:rPr>
+          <w:rFonts w:eastAsia="MS Mincho" w:cs="Times New Roman"/>
+          <w:color w:val="000000"/>
+          <w:highlight w:val="yellow"/>
+        </w:rPr>
+        <w:t>T</w:t>
+      </w:r>
+      <w:r>
+        <w:rPr>
+          <w:rFonts w:eastAsia="MS Mincho" w:cs="Times New Roman"/>
+          <w:color w:val="000000"/>
+          <w:highlight w:val="yellow"/>
+        </w:rPr>
+        <w:t>he contrast remains</w:t>
+      </w:r>
+      <w:r>
+        <w:rPr>
+          <w:rFonts w:eastAsia="MS Mincho" w:cs="Times New Roman"/>
+          <w:color w:val="000000"/>
+          <w:highlight w:val="yellow"/>
+        </w:rPr>
+        <w:t xml:space="preserve"> higher than 90% from 0° up to ~30° incident angles.</w:t>
+      </w:r>
+      <w:r>
+        <w:rPr>
+          <w:rFonts w:eastAsia="MS Mincho" w:cs="Times New Roman"/>
+          <w:color w:val="000000"/>
+        </w:rPr>
+        <w:t xml:space="preserve"> </w:t>
+      </w:r>
+      <w:r>
+        <w:rPr>
+          <w:rStyle w:val="Emphasis"/>
+          <w:rFonts w:cs="Times New Roman"/>
+          <w:i w:val="0"/>
+          <w:iCs w:val="0"/>
+        </w:rPr>
+        <w:t>This design is used as an example in the following sections.</w:t>
+      </w:r>
+    </w:p>
+    <w:p>
+      <w:pPr>
+        <w:jc w:val="center"/>
         <w:rPr>
           <w:rStyle w:val="Emphasis"/>
           <w:i w:val="0"/>
@@ -19861,10 +20504,11 @@
         <w:rPr>
           <w:noProof/>
         </w:rPr>
+        <w:lastRenderedPageBreak/>
         <w:drawing>
-          <wp:inline distT="0" distB="0" distL="0" distR="0" wp14:anchorId="3CE85814" wp14:editId="142174A5">
-            <wp:extent cx="3060700" cy="3199765"/>
-            <wp:effectExtent l="0" t="0" r="6350" b="635"/>
+          <wp:inline distT="0" distB="0" distL="0" distR="0" wp14:anchorId="3CE85814" wp14:editId="6EB40A7E">
+            <wp:extent cx="6336000" cy="6623880"/>
+            <wp:effectExtent l="0" t="0" r="8255" b="0"/>
             <wp:docPr id="328062210" name="Picture 46"/>
             <wp:cNvGraphicFramePr>
               <a:graphicFrameLocks xmlns:a="http://schemas.openxmlformats.org/drawingml/2006/main" noChangeAspect="1"/>
@@ -19891,7 +20535,7 @@
                   <pic:spPr>
                     <a:xfrm>
                       <a:off x="0" y="0"/>
-                      <a:ext cx="3060700" cy="3199765"/>
+                      <a:ext cx="6336000" cy="6623880"/>
                     </a:xfrm>
                     <a:prstGeom prst="rect">
                       <a:avLst/>
@@ -19910,13 +20554,6 @@
         <w:rPr>
           <w:rFonts w:cs="Times New Roman"/>
         </w:rPr>
-        <w:sectPr>
-          <w:type w:val="continuous"/>
-          <w:pgSz w:w="11520" w:h="15660" w:code="1"/>
-          <w:pgMar w:top="1300" w:right="740" w:bottom="1040" w:left="740" w:header="360" w:footer="640" w:gutter="0"/>
-          <w:cols w:num="2" w:space="400"/>
-          <w:docGrid w:linePitch="360"/>
-        </w:sectPr>
       </w:pPr>
       <w:r>
         <w:rPr>
@@ -19938,15 +20575,30 @@
       </w:r>
     </w:p>
     <w:p>
+      <w:pPr>
+        <w:pStyle w:val="Figures"/>
+        <w:numPr>
+          <w:ilvl w:val="0"/>
+          <w:numId w:val="0"/>
+        </w:numPr>
+        <w:rPr>
+          <w:rFonts w:cs="Times New Roman"/>
+        </w:rPr>
+      </w:pPr>
+    </w:p>
+    <w:p>
+      <w:pPr>
+        <w:jc w:val="center"/>
+      </w:pPr>
       <w:r>
         <w:rPr>
           <w:noProof/>
         </w:rPr>
         <w:lastRenderedPageBreak/>
         <w:drawing>
-          <wp:inline distT="0" distB="0" distL="0" distR="0" wp14:anchorId="01BAD2BC" wp14:editId="65E77088">
-            <wp:extent cx="6375400" cy="5535930"/>
-            <wp:effectExtent l="0" t="0" r="6350" b="0"/>
+          <wp:inline distT="0" distB="0" distL="0" distR="0" wp14:anchorId="01BAD2BC" wp14:editId="00B222B4">
+            <wp:extent cx="6336000" cy="5501718"/>
+            <wp:effectExtent l="0" t="0" r="8255" b="0"/>
             <wp:docPr id="1808647138" name="Picture 47"/>
             <wp:cNvGraphicFramePr>
               <a:graphicFrameLocks xmlns:a="http://schemas.openxmlformats.org/drawingml/2006/main" noChangeAspect="1"/>
@@ -19973,7 +20625,7 @@
                   <pic:spPr>
                     <a:xfrm>
                       <a:off x="0" y="0"/>
-                      <a:ext cx="6375400" cy="5535930"/>
+                      <a:ext cx="6336000" cy="5501718"/>
                     </a:xfrm>
                     <a:prstGeom prst="rect">
                       <a:avLst/>
@@ -19991,7 +20643,46 @@
         <w:pStyle w:val="Figures"/>
       </w:pPr>
       <w:r>
-        <w:t>Optical endurance at 1064 nm of the single-layer, and 5-unit-cell edge-filter designs after 1.5×10⁶ phase-switching cycles. (a,b) Transmittance in amorphous (red) and crystalline phases (blue). (c,d) The percentage transmittance contrast degradation relative to the initial value. (e,f) Insertion loss in amorphous phase, expressed in dB. Note a different y-axis scales.</w:t>
+        <w:t xml:space="preserve">Optical endurance at 1064 nm of the single-layer, </w:t>
+      </w:r>
+      <w:r>
+        <w:rPr>
+          <w:highlight w:val="yellow"/>
+        </w:rPr>
+        <w:t>4-unit-cell</w:t>
+      </w:r>
+      <w:r>
+        <w:t xml:space="preserve"> </w:t>
+      </w:r>
+      <w:r>
+        <w:t>and 5-unit-cell edge-filter designs after 1.5×10⁶ phase-switching cycles. (a,b</w:t>
+      </w:r>
+      <w:r>
+        <w:rPr>
+          <w:highlight w:val="yellow"/>
+        </w:rPr>
+        <w:t>,c</w:t>
+      </w:r>
+      <w:r>
+        <w:t>) Transmittance in amorphous (red) and crystalline phases (blue). (</w:t>
+      </w:r>
+      <w:r>
+        <w:rPr>
+          <w:highlight w:val="yellow"/>
+        </w:rPr>
+        <w:t>d,e,f</w:t>
+      </w:r>
+      <w:r>
+        <w:t>) The percentage transmittance contrast degradation relative to the initial value. (</w:t>
+      </w:r>
+      <w:r>
+        <w:rPr>
+          <w:highlight w:val="yellow"/>
+        </w:rPr>
+        <w:t>g,h,i</w:t>
+      </w:r>
+      <w:r>
+        <w:t>) Insertion loss in amorphous phase, expressed in dB. Note a different y-axis scales.</w:t>
       </w:r>
     </w:p>
     <w:p>
@@ -20021,10 +20712,8 @@
     <w:p>
       <w:pPr>
         <w:pStyle w:val="H2First"/>
-        <w:spacing w:before="0"/>
         <w:rPr>
           <w:rStyle w:val="Emphasis"/>
-          <w:rFonts w:ascii="Times New Roman" w:hAnsi="Times New Roman"/>
           <w:i/>
           <w:iCs/>
         </w:rPr>
@@ -20032,21 +20721,11 @@
       <w:r>
         <w:rPr>
           <w:rStyle w:val="Emphasis"/>
-          <w:rFonts w:ascii="Times New Roman" w:hAnsi="Times New Roman"/>
-          <w:i/>
-        </w:rPr>
-        <w:t xml:space="preserve"> Endurance simulation of 1064-nm optical filters(</w:t>
-      </w:r>
-      <w:r>
-        <w:t xml:space="preserve"> </w:t>
-      </w:r>
-      <w:r>
-        <w:rPr>
-          <w:rStyle w:val="Emphasis"/>
-          <w:rFonts w:ascii="Times New Roman" w:hAnsi="Times New Roman"/>
-          <w:i/>
-        </w:rPr>
-        <w:t>check endurance of edge-filter.)</w:t>
+          <w:i/>
+          <w:iCs/>
+          <w:highlight w:val="yellow"/>
+        </w:rPr>
+        <w:t>ENDURANCE SIMULATION OF 1064-NM OPTICAL FILTERS</w:t>
       </w:r>
     </w:p>
     <w:p>
@@ -20494,16 +21173,7 @@
           <w:i w:val="0"/>
           <w:iCs w:val="0"/>
         </w:rPr>
-        <w:t xml:space="preserve"> T</w:t>
-      </w:r>
-      <w:r>
-        <w:rPr>
-          <w:rStyle w:val="Emphasis"/>
-          <w:rFonts w:cs="Times New Roman"/>
-          <w:i w:val="0"/>
-          <w:iCs w:val="0"/>
-        </w:rPr>
-        <w:t xml:space="preserve">heir larger </w:t>
+        <w:t xml:space="preserve"> Their larger </w:t>
       </w:r>
       <w:r>
         <w:rPr>
@@ -20537,13 +21207,7 @@
         <w:t>c</w:t>
       </w:r>
       <w:r>
-        <w:t xml:space="preserve"> become higher </w:t>
-      </w:r>
-      <w:r>
-        <w:t>at the latter cycle</w:t>
-      </w:r>
-      <w:r>
-        <w:t xml:space="preserve">. </w:t>
+        <w:t xml:space="preserve"> become higher at the latter cycle. </w:t>
       </w:r>
       <w:r>
         <w:rPr>
@@ -20812,31 +21476,22 @@
     </w:p>
     <w:p>
       <w:pPr>
-        <w:pStyle w:val="08SectionHeader2"/>
+        <w:pStyle w:val="H2First"/>
         <w:rPr>
           <w:rStyle w:val="Emphasis"/>
-          <w:rFonts w:ascii="Times New Roman" w:hAnsi="Times New Roman" w:cs="Times New Roman"/>
-          <w:i/>
-          <w:iCs w:val="0"/>
+          <w:i/>
+          <w:iCs/>
+          <w:highlight w:val="yellow"/>
         </w:rPr>
       </w:pPr>
       <w:r>
         <w:rPr>
           <w:rStyle w:val="Emphasis"/>
-          <w:rFonts w:ascii="Times New Roman" w:hAnsi="Times New Roman" w:cs="Times New Roman"/>
-          <w:i/>
-          <w:iCs w:val="0"/>
-        </w:rPr>
-        <w:t xml:space="preserve">4.3 </w:t>
-      </w:r>
-      <w:r>
-        <w:rPr>
-          <w:rStyle w:val="Emphasis"/>
-          <w:rFonts w:ascii="Times New Roman" w:hAnsi="Times New Roman" w:cs="Times New Roman"/>
-          <w:i/>
-          <w:iCs w:val="0"/>
-        </w:rPr>
-        <w:t>Transmittance tunability and optimization.</w:t>
+          <w:i/>
+          <w:iCs/>
+          <w:highlight w:val="yellow"/>
+        </w:rPr>
+        <w:t>TRANSMITTANCE TUNABILITY AND OPTIMIZATION.</w:t>
       </w:r>
     </w:p>
     <w:p>
@@ -21439,10 +22094,7 @@
       </w:pPr>
       <w:r>
         <w:lastRenderedPageBreak/>
-        <w:t>TABLE I</w:t>
-      </w:r>
-      <w:r>
-        <w:t>I</w:t>
+        <w:t>TABLE II</w:t>
       </w:r>
     </w:p>
     <w:p>
@@ -22934,11 +23586,79 @@
     </w:p>
     <w:p>
       <w:pPr>
+        <w:pStyle w:val="H2First"/>
+        <w:rPr>
+          <w:highlight w:val="yellow"/>
+        </w:rPr>
+      </w:pPr>
+      <w:r>
+        <w:rPr>
+          <w:highlight w:val="yellow"/>
+        </w:rPr>
+        <w:t>COMPARISON TO OTHER PCM-BASED OPTICAL FILTERS</w:t>
+      </w:r>
+    </w:p>
+    <w:p>
+      <w:pPr>
+        <w:pStyle w:val="H2First"/>
+        <w:numPr>
+          <w:ilvl w:val="0"/>
+          <w:numId w:val="0"/>
+        </w:numPr>
+        <w:rPr>
+          <w:highlight w:val="yellow"/>
+        </w:rPr>
+      </w:pPr>
+    </w:p>
+    <w:p>
+      <w:pPr>
+        <w:pStyle w:val="H2First"/>
+        <w:rPr>
+          <w:highlight w:val="yellow"/>
+        </w:rPr>
+      </w:pPr>
+      <w:r>
+        <w:rPr>
+          <w:highlight w:val="yellow"/>
+        </w:rPr>
+        <w:t>LIMITATIONS AND FUTURE WORK SUGGESTIONS</w:t>
+      </w:r>
+    </w:p>
+    <w:p>
+      <w:pPr>
+        <w:pStyle w:val="1stcolumntext"/>
+      </w:pPr>
+      <w:r>
+        <w:t xml:space="preserve">The biggest limitation is the lack of experimental validation. </w:t>
+      </w:r>
+      <w:r>
+        <w:t>To recreate or design in reality,</w:t>
+      </w:r>
+      <w:r>
+        <w:t xml:space="preserve"> among multitude of complications, the fabrication of multilayer thin film cannot be reliably controlled to a 1-nm range, and the refractive index used in our work is from </w:t>
+      </w:r>
+      <w:r>
+        <w:t xml:space="preserve">other published experimental dataset with set thickness is not the same as our designs, where the thickness of the film does affect the complex refractive index. So, we simulate optical performance of the original and optimized five-unit-cell designs multiple time by varying the thickness of each layer by </w:t>
+      </w:r>
+    </w:p>
+    <w:p>
+      <w:pPr>
+        <w:pStyle w:val="1stcolumntext"/>
+      </w:pPr>
+    </w:p>
+    <w:p>
+      <w:pPr>
         <w:pStyle w:val="H1ListNoSpace"/>
         <w:spacing w:before="0"/>
-      </w:pPr>
-      <w:r>
-        <w:t>Conclusions</w:t>
+        <w:rPr>
+          <w:highlight w:val="yellow"/>
+        </w:rPr>
+      </w:pPr>
+      <w:r>
+        <w:rPr>
+          <w:highlight w:val="yellow"/>
+        </w:rPr>
+        <w:t>CONCLUSIONS</w:t>
       </w:r>
     </w:p>
     <w:p>
@@ -22946,7 +23666,16 @@
         <w:pStyle w:val="1stcolumntext"/>
       </w:pPr>
       <w:r>
-        <w:t>We have shown that Sb</w:t>
+        <w:t>W</w:t>
+      </w:r>
+      <w:r>
+        <w:t>e</w:t>
+      </w:r>
+      <w:r>
+        <w:t xml:space="preserve"> </w:t>
+      </w:r>
+      <w:r>
+        <w:t>have shown that Sb</w:t>
       </w:r>
       <w:r>
         <w:rPr>
@@ -22976,7 +23705,10 @@
         <w:t>efficient</w:t>
       </w:r>
       <w:r>
-        <w:t>, broadband transmittance-tunable optical filter operating around 1064 nm wavelength. The 5-unit-cell long-pass edge-filter design has the best compromise between optical performance, size, and design complexity. This design required six Sb</w:t>
+        <w:t xml:space="preserve">, broadband transmittance-tunable optical filter operating around 1064 nm wavelength. The 5-unit-cell </w:t>
+      </w:r>
+      <w:r>
+        <w:t>long-pass edge-filter design has the best compromise between optical performance, size, and design complexity. This design required six Sb</w:t>
       </w:r>
       <w:r>
         <w:rPr>
@@ -23070,7 +23802,11 @@
         <w:t>grammatical</w:t>
       </w:r>
       <w:r>
-        <w:t xml:space="preserve"> and format suggestions from Nathan Hagen, Center for Optical Research and Education, Utsunomiya University, Japan.</w:t>
+        <w:t xml:space="preserve"> and format suggestions from Nathan Hagen, Center for </w:t>
+      </w:r>
+      <w:r>
+        <w:lastRenderedPageBreak/>
+        <w:t>Optical Research and Education, Utsunomiya University, Japan.</w:t>
       </w:r>
     </w:p>
     <w:p>
@@ -23110,7 +23846,19 @@
         <w:pStyle w:val="1stcolumntext"/>
       </w:pPr>
       <w:r>
-        <w:t>Data underlying the results presented in this paper may be obtained from the corresponding author upon a reasonable request.</w:t>
+        <w:t xml:space="preserve">Data </w:t>
+      </w:r>
+      <w:r>
+        <w:rPr>
+          <w:highlight w:val="yellow"/>
+        </w:rPr>
+        <w:t>and simulation codes</w:t>
+      </w:r>
+      <w:r>
+        <w:t xml:space="preserve"> </w:t>
+      </w:r>
+      <w:r>
+        <w:t>underlying the results presented in this paper may be obtained from the corresponding author upon a reasonable request.</w:t>
       </w:r>
     </w:p>
     <w:p>
@@ -23144,6 +23892,11 @@
       <w:r>
         <w:t>as needed after using these tools.</w:t>
       </w:r>
+    </w:p>
+    <w:p>
+      <w:pPr>
+        <w:pStyle w:val="1stcolumntext"/>
+      </w:pPr>
     </w:p>
     <w:p>
       <w:pPr>
@@ -23155,10 +23908,6 @@
         <w:spacing w:before="0"/>
       </w:pPr>
       <w:r>
-        <w:br w:type="page"/>
-      </w:r>
-      <w:r>
-        <w:lastRenderedPageBreak/>
         <w:t>References</w:t>
       </w:r>
     </w:p>
@@ -23497,7 +24246,10 @@
         <w:t xml:space="preserve">Photonics, </w:t>
       </w:r>
       <w:r>
-        <w:t xml:space="preserve">vol. 13, no. 2, p. 148, 2026. [Online]. Available: </w:t>
+        <w:t xml:space="preserve">vol. 13, no. 2, p. 148, </w:t>
+      </w:r>
+      <w:r>
+        <w:t xml:space="preserve">2026. [Online]. Available: </w:t>
       </w:r>
       <w:hyperlink r:id="rId24" w:history="1">
         <w:r>
@@ -23653,13 +24405,7 @@
         <w:rPr>
           <w:i/>
         </w:rPr>
-        <w:t xml:space="preserve">Opt. </w:t>
-      </w:r>
-      <w:r>
-        <w:rPr>
-          <w:i/>
-        </w:rPr>
-        <w:t xml:space="preserve">Express, </w:t>
+        <w:t xml:space="preserve">Opt. Express, </w:t>
       </w:r>
       <w:r>
         <w:t>vol. 34, no. 5, pp. 7378–7387, 2026/03/09 2026, doi: 10.1364/OE.586098.</w:t>
@@ -23977,7 +24723,11 @@
       </w:r>
       <w:r>
         <w:tab/>
-        <w:t xml:space="preserve">D. Franta, D. Nečas, A. Giglia, P. Franta, and I. Ohlídal, "Universal dispersion model for characterization of optical thin films over wide spectral range: Application to magnesium fluoride," </w:t>
+        <w:t xml:space="preserve">D. Franta, D. Nečas, A. Giglia, P. Franta, and I. Ohlídal, "Universal dispersion model for characterization of optical thin </w:t>
+      </w:r>
+      <w:r>
+        <w:lastRenderedPageBreak/>
+        <w:t xml:space="preserve">films over wide spectral range: Application to magnesium fluoride," </w:t>
       </w:r>
       <w:r>
         <w:rPr>
@@ -24094,11 +24844,7 @@
       </w:r>
       <w:r>
         <w:tab/>
-        <w:t xml:space="preserve">L. Y. Beliaev, E. Shkondin, A. V. Lavrinenko, and O. Takayama, "Optical, structural and composition properties of silicon nitride films deposited by reactive radio-frequency sputtering, low </w:t>
-      </w:r>
-      <w:r>
-        <w:lastRenderedPageBreak/>
-        <w:t xml:space="preserve">pressure and plasma-enhanced chemical vapor deposition," </w:t>
+        <w:t xml:space="preserve">L. Y. Beliaev, E. Shkondin, A. V. Lavrinenko, and O. Takayama, "Optical, structural and composition properties of silicon nitride films deposited by reactive radio-frequency sputtering, low pressure and plasma-enhanced chemical vapor deposition," </w:t>
       </w:r>
       <w:r>
         <w:rPr>
@@ -24455,10 +25201,7 @@
         <w:t xml:space="preserve">BURANASIRI </w:t>
       </w:r>
       <w:r>
-        <w:t>received</w:t>
-      </w:r>
-      <w:r>
-        <w:t xml:space="preserve"> the B.Sc. degree in physics from Ramkhamhaeng University, Thailand</w:t>
+        <w:t>received the B.Sc. degree in physics from Ramkhamhaeng University, Thailand</w:t>
       </w:r>
       <w:r>
         <w:rPr>
@@ -24661,10 +25404,7 @@
         <w:t xml:space="preserve">. He then received the M.Sc. and Ph.D. degrees in applied physics from </w:t>
       </w:r>
       <w:r>
-        <w:t>King Mongkut’s Institute of Technology Ladkrabang, Bangkok, Thailand</w:t>
-      </w:r>
-      <w:r>
-        <w:t>, in 1999 and 2007, respectively.</w:t>
+        <w:t>King Mongkut’s Institute of Technology Ladkrabang, Bangkok, Thailand, in 1999 and 2007, respectively.</w:t>
       </w:r>
       <w:r>
         <w:rPr>
@@ -24848,13 +25588,7 @@
         <w:rPr>
           <w:rStyle w:val="AUBiosbd"/>
         </w:rPr>
-        <w:t>WICHARN</w:t>
-      </w:r>
-      <w:r>
-        <w:rPr>
-          <w:rStyle w:val="AUBiosbd"/>
-        </w:rPr>
-        <w:t xml:space="preserve"> </w:t>
+        <w:t xml:space="preserve">WICHARN </w:t>
       </w:r>
       <w:r>
         <w:rPr>
@@ -24872,10 +25606,7 @@
         <w:t xml:space="preserve"> </w:t>
       </w:r>
       <w:r>
-        <w:t>received</w:t>
-      </w:r>
-      <w:r>
-        <w:t xml:space="preserve"> the B.Sc. with honor class, M.Sc., and Ph.D. degrees in applied physics from King Mongkut’s Institute of Technology Ladkrabang, Bangkok, Thailand, in 2007, 2010, and 2014, respectively. </w:t>
+        <w:t xml:space="preserve">received the B.Sc. with honor class, M.Sc., and Ph.D. degrees in applied physics from King Mongkut’s Institute of Technology Ladkrabang, Bangkok, Thailand, in 2007, 2010, and 2014, respectively. </w:t>
       </w:r>
     </w:p>
     <w:p>
@@ -24883,7 +25614,7 @@
         <w:pStyle w:val="AUBios"/>
         <w:spacing w:before="0"/>
         <w:rPr>
-          <w:rFonts w:ascii="Helvetica" w:hAnsi="Helvetica" w:cs="FormataOTFMd" w:hint="cs"/>
+          <w:rFonts w:ascii="Helvetica" w:hAnsi="Helvetica" w:cs="FormataOTFMd"/>
           <w:b/>
           <w:cs/>
         </w:rPr>
@@ -24942,7 +25673,7 @@
 </file>
 
 <file path=word/endnotes.xml><?xml version="1.0" encoding="utf-8"?>
-<w:endnotes xmlns:wpc="http://schemas.microsoft.com/office/word/2010/wordprocessingCanvas" xmlns:cx="http://schemas.microsoft.com/office/drawing/2014/chartex" xmlns:cx1="http://schemas.microsoft.com/office/drawing/2015/9/8/chartex" xmlns:cx2="http://schemas.microsoft.com/office/drawing/2015/10/21/chartex" xmlns:cx3="http://schemas.microsoft.com/office/drawing/2016/5/9/chartex" xmlns:cx4="http://schemas.microsoft.com/office/drawing/2016/5/10/chartex" xmlns:cx5="http://schemas.microsoft.com/office/drawing/2016/5/11/chartex" xmlns:cx6="http://schemas.microsoft.com/office/drawing/2016/5/12/chartex" xmlns:cx7="http://schemas.microsoft.com/office/drawing/2016/5/13/chartex" xmlns:cx8="http://schemas.microsoft.com/office/drawing/2016/5/14/chartex" xmlns:mc="http://schemas.openxmlformats.org/markup-compatibility/2006" xmlns:aink="http://schemas.microsoft.com/office/drawing/2016/ink" xmlns:am3d="http://schemas.microsoft.com/office/drawing/2017/model3d" xmlns:o="urn:schemas-microsoft-com:office:office" xmlns:oel="http://schemas.microsoft.com/office/2019/extlst" xmlns:r="http://schemas.openxmlformats.org/officeDocument/2006/relationships" xmlns:m="http://schemas.openxmlformats.org/officeDocument/2006/math" xmlns:v="urn:schemas-microsoft-com:vml" xmlns:wp14="http://schemas.microsoft.com/office/word/2010/wordprocessingDrawing" xmlns:wp="http://schemas.openxmlformats.org/drawingml/2006/wordprocessingDrawing" xmlns:w10="urn:schemas-microsoft-com:office:word" xmlns:w="http://schemas.openxmlformats.org/wordprocessingml/2006/main" xmlns:w14="http://schemas.microsoft.com/office/word/2010/wordml" xmlns:w15="http://schemas.microsoft.com/office/word/2012/wordml" xmlns:w16cex="http://schemas.microsoft.com/office/word/2018/wordml/cex" xmlns:w16cid="http://schemas.microsoft.com/office/word/2016/wordml/cid" xmlns:w16="http://schemas.microsoft.com/office/word/2018/wordml" xmlns:w16du="http://schemas.microsoft.com/office/word/2023/wordml/word16du" xmlns:w16sdtdh="http://schemas.microsoft.com/office/word/2020/wordml/sdtdatahash" xmlns:w16sdtfl="http://schemas.microsoft.com/office/word/2024/wordml/sdtformatlock" xmlns:w16se="http://schemas.microsoft.com/office/word/2015/wordml/symex" xmlns:wpg="http://schemas.microsoft.com/office/word/2010/wordprocessingGroup" xmlns:wpi="http://schemas.microsoft.com/office/word/2010/wordprocessingInk" xmlns:wne="http://schemas.microsoft.com/office/word/2006/wordml" xmlns:wps="http://schemas.microsoft.com/office/word/2010/wordprocessingShape" mc:Ignorable="w14 w15 w16se w16cid w16 w16cex w16sdtdh w16sdtfl w16du wp14">
+<w:endnotes xmlns:wpc="http://schemas.microsoft.com/office/word/2010/wordprocessingCanvas" xmlns:cx="http://schemas.microsoft.com/office/drawing/2014/chartex" xmlns:cx1="http://schemas.microsoft.com/office/drawing/2015/9/8/chartex" xmlns:cx2="http://schemas.microsoft.com/office/drawing/2015/10/21/chartex" xmlns:cx3="http://schemas.microsoft.com/office/drawing/2016/5/9/chartex" xmlns:cx4="http://schemas.microsoft.com/office/drawing/2016/5/10/chartex" xmlns:cx5="http://schemas.microsoft.com/office/drawing/2016/5/11/chartex" xmlns:cx6="http://schemas.microsoft.com/office/drawing/2016/5/12/chartex" xmlns:cx7="http://schemas.microsoft.com/office/drawing/2016/5/13/chartex" xmlns:cx8="http://schemas.microsoft.com/office/drawing/2016/5/14/chartex" xmlns:mc="http://schemas.openxmlformats.org/markup-compatibility/2006" xmlns:aink="http://schemas.microsoft.com/office/drawing/2016/ink" xmlns:am3d="http://schemas.microsoft.com/office/drawing/2017/model3d" xmlns:o="urn:schemas-microsoft-com:office:office" xmlns:oel="http://schemas.microsoft.com/office/2019/extlst" xmlns:r="http://schemas.openxmlformats.org/officeDocument/2006/relationships" xmlns:m="http://schemas.openxmlformats.org/officeDocument/2006/math" xmlns:v="urn:schemas-microsoft-com:vml" xmlns:wp14="http://schemas.microsoft.com/office/word/2010/wordprocessingDrawing" xmlns:wp="http://schemas.openxmlformats.org/drawingml/2006/wordprocessingDrawing" xmlns:w10="urn:schemas-microsoft-com:office:word" xmlns:w="http://schemas.openxmlformats.org/wordprocessingml/2006/main" xmlns:w14="http://schemas.microsoft.com/office/word/2010/wordml" xmlns:w15="http://schemas.microsoft.com/office/word/2012/wordml" xmlns:w16cei="http://schemas.microsoft.com/office/word/2026/wordml/cei" xmlns:w16cex="http://schemas.microsoft.com/office/word/2018/wordml/cex" xmlns:w16cid="http://schemas.microsoft.com/office/word/2016/wordml/cid" xmlns:w16="http://schemas.microsoft.com/office/word/2018/wordml" xmlns:w16du="http://schemas.microsoft.com/office/word/2023/wordml/word16du" xmlns:w16sdtdh="http://schemas.microsoft.com/office/word/2020/wordml/sdtdatahash" xmlns:w16sdtfl="http://schemas.microsoft.com/office/word/2024/wordml/sdtformatlock" xmlns:w16se="http://schemas.microsoft.com/office/word/2015/wordml/symex" xmlns:wpg="http://schemas.microsoft.com/office/word/2010/wordprocessingGroup" xmlns:wpi="http://schemas.microsoft.com/office/word/2010/wordprocessingInk" xmlns:wne="http://schemas.microsoft.com/office/word/2006/wordml" xmlns:wps="http://schemas.microsoft.com/office/word/2010/wordprocessingShape" mc:Ignorable="w14 w15 w16se w16cid w16 w16cex w16sdtdh w16sdtfl w16du wp14">
   <w:endnote w:type="separator" w:id="-1">
     <w:p>
       <w:r>
@@ -24961,7 +25692,7 @@
 </file>
 
 <file path=word/footer1.xml><?xml version="1.0" encoding="utf-8"?>
-<w:ftr xmlns:wpc="http://schemas.microsoft.com/office/word/2010/wordprocessingCanvas" xmlns:cx="http://schemas.microsoft.com/office/drawing/2014/chartex" xmlns:cx1="http://schemas.microsoft.com/office/drawing/2015/9/8/chartex" xmlns:cx2="http://schemas.microsoft.com/office/drawing/2015/10/21/chartex" xmlns:cx3="http://schemas.microsoft.com/office/drawing/2016/5/9/chartex" xmlns:cx4="http://schemas.microsoft.com/office/drawing/2016/5/10/chartex" xmlns:cx5="http://schemas.microsoft.com/office/drawing/2016/5/11/chartex" xmlns:cx6="http://schemas.microsoft.com/office/drawing/2016/5/12/chartex" xmlns:cx7="http://schemas.microsoft.com/office/drawing/2016/5/13/chartex" xmlns:cx8="http://schemas.microsoft.com/office/drawing/2016/5/14/chartex" xmlns:mc="http://schemas.openxmlformats.org/markup-compatibility/2006" xmlns:aink="http://schemas.microsoft.com/office/drawing/2016/ink" xmlns:am3d="http://schemas.microsoft.com/office/drawing/2017/model3d" xmlns:o="urn:schemas-microsoft-com:office:office" xmlns:oel="http://schemas.microsoft.com/office/2019/extlst" xmlns:r="http://schemas.openxmlformats.org/officeDocument/2006/relationships" xmlns:m="http://schemas.openxmlformats.org/officeDocument/2006/math" xmlns:v="urn:schemas-microsoft-com:vml" xmlns:wp14="http://schemas.microsoft.com/office/word/2010/wordprocessingDrawing" xmlns:wp="http://schemas.openxmlformats.org/drawingml/2006/wordprocessingDrawing" xmlns:w10="urn:schemas-microsoft-com:office:word" xmlns:w="http://schemas.openxmlformats.org/wordprocessingml/2006/main" xmlns:w14="http://schemas.microsoft.com/office/word/2010/wordml" xmlns:w15="http://schemas.microsoft.com/office/word/2012/wordml" xmlns:w16cex="http://schemas.microsoft.com/office/word/2018/wordml/cex" xmlns:w16cid="http://schemas.microsoft.com/office/word/2016/wordml/cid" xmlns:w16="http://schemas.microsoft.com/office/word/2018/wordml" xmlns:w16du="http://schemas.microsoft.com/office/word/2023/wordml/word16du" xmlns:w16sdtdh="http://schemas.microsoft.com/office/word/2020/wordml/sdtdatahash" xmlns:w16sdtfl="http://schemas.microsoft.com/office/word/2024/wordml/sdtformatlock" xmlns:w16se="http://schemas.microsoft.com/office/word/2015/wordml/symex" xmlns:wpg="http://schemas.microsoft.com/office/word/2010/wordprocessingGroup" xmlns:wpi="http://schemas.microsoft.com/office/word/2010/wordprocessingInk" xmlns:wne="http://schemas.microsoft.com/office/word/2006/wordml" xmlns:wps="http://schemas.microsoft.com/office/word/2010/wordprocessingShape" mc:Ignorable="w14 w15 w16se w16cid w16 w16cex w16sdtdh w16sdtfl w16du wp14">
+<w:ftr xmlns:wpc="http://schemas.microsoft.com/office/word/2010/wordprocessingCanvas" xmlns:cx="http://schemas.microsoft.com/office/drawing/2014/chartex" xmlns:cx1="http://schemas.microsoft.com/office/drawing/2015/9/8/chartex" xmlns:cx2="http://schemas.microsoft.com/office/drawing/2015/10/21/chartex" xmlns:cx3="http://schemas.microsoft.com/office/drawing/2016/5/9/chartex" xmlns:cx4="http://schemas.microsoft.com/office/drawing/2016/5/10/chartex" xmlns:cx5="http://schemas.microsoft.com/office/drawing/2016/5/11/chartex" xmlns:cx6="http://schemas.microsoft.com/office/drawing/2016/5/12/chartex" xmlns:cx7="http://schemas.microsoft.com/office/drawing/2016/5/13/chartex" xmlns:cx8="http://schemas.microsoft.com/office/drawing/2016/5/14/chartex" xmlns:mc="http://schemas.openxmlformats.org/markup-compatibility/2006" xmlns:aink="http://schemas.microsoft.com/office/drawing/2016/ink" xmlns:am3d="http://schemas.microsoft.com/office/drawing/2017/model3d" xmlns:o="urn:schemas-microsoft-com:office:office" xmlns:oel="http://schemas.microsoft.com/office/2019/extlst" xmlns:r="http://schemas.openxmlformats.org/officeDocument/2006/relationships" xmlns:m="http://schemas.openxmlformats.org/officeDocument/2006/math" xmlns:v="urn:schemas-microsoft-com:vml" xmlns:wp14="http://schemas.microsoft.com/office/word/2010/wordprocessingDrawing" xmlns:wp="http://schemas.openxmlformats.org/drawingml/2006/wordprocessingDrawing" xmlns:w10="urn:schemas-microsoft-com:office:word" xmlns:w="http://schemas.openxmlformats.org/wordprocessingml/2006/main" xmlns:w14="http://schemas.microsoft.com/office/word/2010/wordml" xmlns:w15="http://schemas.microsoft.com/office/word/2012/wordml" xmlns:w16cei="http://schemas.microsoft.com/office/word/2026/wordml/cei" xmlns:w16cex="http://schemas.microsoft.com/office/word/2018/wordml/cex" xmlns:w16cid="http://schemas.microsoft.com/office/word/2016/wordml/cid" xmlns:w16="http://schemas.microsoft.com/office/word/2018/wordml" xmlns:w16du="http://schemas.microsoft.com/office/word/2023/wordml/word16du" xmlns:w16sdtdh="http://schemas.microsoft.com/office/word/2020/wordml/sdtdatahash" xmlns:w16sdtfl="http://schemas.microsoft.com/office/word/2024/wordml/sdtformatlock" xmlns:w16se="http://schemas.microsoft.com/office/word/2015/wordml/symex" xmlns:wpg="http://schemas.microsoft.com/office/word/2010/wordprocessingGroup" xmlns:wpi="http://schemas.microsoft.com/office/word/2010/wordprocessingInk" xmlns:wne="http://schemas.microsoft.com/office/word/2006/wordml" xmlns:wps="http://schemas.microsoft.com/office/word/2010/wordprocessingShape" mc:Ignorable="w14 w15 w16se w16cid w16 w16cex w16sdtdh w16sdtfl w16du wp14">
   <w:p>
     <w:pPr>
       <w:pStyle w:val="Footer"/>
@@ -24998,7 +25729,7 @@
 </file>
 
 <file path=word/footer2.xml><?xml version="1.0" encoding="utf-8"?>
-<w:ftr xmlns:wpc="http://schemas.microsoft.com/office/word/2010/wordprocessingCanvas" xmlns:cx="http://schemas.microsoft.com/office/drawing/2014/chartex" xmlns:cx1="http://schemas.microsoft.com/office/drawing/2015/9/8/chartex" xmlns:cx2="http://schemas.microsoft.com/office/drawing/2015/10/21/chartex" xmlns:cx3="http://schemas.microsoft.com/office/drawing/2016/5/9/chartex" xmlns:cx4="http://schemas.microsoft.com/office/drawing/2016/5/10/chartex" xmlns:cx5="http://schemas.microsoft.com/office/drawing/2016/5/11/chartex" xmlns:cx6="http://schemas.microsoft.com/office/drawing/2016/5/12/chartex" xmlns:cx7="http://schemas.microsoft.com/office/drawing/2016/5/13/chartex" xmlns:cx8="http://schemas.microsoft.com/office/drawing/2016/5/14/chartex" xmlns:mc="http://schemas.openxmlformats.org/markup-compatibility/2006" xmlns:aink="http://schemas.microsoft.com/office/drawing/2016/ink" xmlns:am3d="http://schemas.microsoft.com/office/drawing/2017/model3d" xmlns:o="urn:schemas-microsoft-com:office:office" xmlns:oel="http://schemas.microsoft.com/office/2019/extlst" xmlns:r="http://schemas.openxmlformats.org/officeDocument/2006/relationships" xmlns:m="http://schemas.openxmlformats.org/officeDocument/2006/math" xmlns:v="urn:schemas-microsoft-com:vml" xmlns:wp14="http://schemas.microsoft.com/office/word/2010/wordprocessingDrawing" xmlns:wp="http://schemas.openxmlformats.org/drawingml/2006/wordprocessingDrawing" xmlns:w10="urn:schemas-microsoft-com:office:word" xmlns:w="http://schemas.openxmlformats.org/wordprocessingml/2006/main" xmlns:w14="http://schemas.microsoft.com/office/word/2010/wordml" xmlns:w15="http://schemas.microsoft.com/office/word/2012/wordml" xmlns:w16cex="http://schemas.microsoft.com/office/word/2018/wordml/cex" xmlns:w16cid="http://schemas.microsoft.com/office/word/2016/wordml/cid" xmlns:w16="http://schemas.microsoft.com/office/word/2018/wordml" xmlns:w16du="http://schemas.microsoft.com/office/word/2023/wordml/word16du" xmlns:w16sdtdh="http://schemas.microsoft.com/office/word/2020/wordml/sdtdatahash" xmlns:w16sdtfl="http://schemas.microsoft.com/office/word/2024/wordml/sdtformatlock" xmlns:w16se="http://schemas.microsoft.com/office/word/2015/wordml/symex" xmlns:wpg="http://schemas.microsoft.com/office/word/2010/wordprocessingGroup" xmlns:wpi="http://schemas.microsoft.com/office/word/2010/wordprocessingInk" xmlns:wne="http://schemas.microsoft.com/office/word/2006/wordml" xmlns:wps="http://schemas.microsoft.com/office/word/2010/wordprocessingShape" mc:Ignorable="w14 w15 w16se w16cid w16 w16cex w16sdtdh w16sdtfl w16du wp14">
+<w:ftr xmlns:wpc="http://schemas.microsoft.com/office/word/2010/wordprocessingCanvas" xmlns:cx="http://schemas.microsoft.com/office/drawing/2014/chartex" xmlns:cx1="http://schemas.microsoft.com/office/drawing/2015/9/8/chartex" xmlns:cx2="http://schemas.microsoft.com/office/drawing/2015/10/21/chartex" xmlns:cx3="http://schemas.microsoft.com/office/drawing/2016/5/9/chartex" xmlns:cx4="http://schemas.microsoft.com/office/drawing/2016/5/10/chartex" xmlns:cx5="http://schemas.microsoft.com/office/drawing/2016/5/11/chartex" xmlns:cx6="http://schemas.microsoft.com/office/drawing/2016/5/12/chartex" xmlns:cx7="http://schemas.microsoft.com/office/drawing/2016/5/13/chartex" xmlns:cx8="http://schemas.microsoft.com/office/drawing/2016/5/14/chartex" xmlns:mc="http://schemas.openxmlformats.org/markup-compatibility/2006" xmlns:aink="http://schemas.microsoft.com/office/drawing/2016/ink" xmlns:am3d="http://schemas.microsoft.com/office/drawing/2017/model3d" xmlns:o="urn:schemas-microsoft-com:office:office" xmlns:oel="http://schemas.microsoft.com/office/2019/extlst" xmlns:r="http://schemas.openxmlformats.org/officeDocument/2006/relationships" xmlns:m="http://schemas.openxmlformats.org/officeDocument/2006/math" xmlns:v="urn:schemas-microsoft-com:vml" xmlns:wp14="http://schemas.microsoft.com/office/word/2010/wordprocessingDrawing" xmlns:wp="http://schemas.openxmlformats.org/drawingml/2006/wordprocessingDrawing" xmlns:w10="urn:schemas-microsoft-com:office:word" xmlns:w="http://schemas.openxmlformats.org/wordprocessingml/2006/main" xmlns:w14="http://schemas.microsoft.com/office/word/2010/wordml" xmlns:w15="http://schemas.microsoft.com/office/word/2012/wordml" xmlns:w16cei="http://schemas.microsoft.com/office/word/2026/wordml/cei" xmlns:w16cex="http://schemas.microsoft.com/office/word/2018/wordml/cex" xmlns:w16cid="http://schemas.microsoft.com/office/word/2016/wordml/cid" xmlns:w16="http://schemas.microsoft.com/office/word/2018/wordml" xmlns:w16du="http://schemas.microsoft.com/office/word/2023/wordml/word16du" xmlns:w16sdtdh="http://schemas.microsoft.com/office/word/2020/wordml/sdtdatahash" xmlns:w16sdtfl="http://schemas.microsoft.com/office/word/2024/wordml/sdtformatlock" xmlns:w16se="http://schemas.microsoft.com/office/word/2015/wordml/symex" xmlns:wpg="http://schemas.microsoft.com/office/word/2010/wordprocessingGroup" xmlns:wpi="http://schemas.microsoft.com/office/word/2010/wordprocessingInk" xmlns:wne="http://schemas.microsoft.com/office/word/2006/wordml" xmlns:wps="http://schemas.microsoft.com/office/word/2010/wordprocessingShape" mc:Ignorable="w14 w15 w16se w16cid w16 w16cex w16sdtdh w16sdtfl w16du wp14">
   <w:p>
     <w:pPr>
       <w:pStyle w:val="Footer"/>
@@ -25041,7 +25772,7 @@
 </file>
 
 <file path=word/footnotes.xml><?xml version="1.0" encoding="utf-8"?>
-<w:footnotes xmlns:wpc="http://schemas.microsoft.com/office/word/2010/wordprocessingCanvas" xmlns:cx="http://schemas.microsoft.com/office/drawing/2014/chartex" xmlns:cx1="http://schemas.microsoft.com/office/drawing/2015/9/8/chartex" xmlns:cx2="http://schemas.microsoft.com/office/drawing/2015/10/21/chartex" xmlns:cx3="http://schemas.microsoft.com/office/drawing/2016/5/9/chartex" xmlns:cx4="http://schemas.microsoft.com/office/drawing/2016/5/10/chartex" xmlns:cx5="http://schemas.microsoft.com/office/drawing/2016/5/11/chartex" xmlns:cx6="http://schemas.microsoft.com/office/drawing/2016/5/12/chartex" xmlns:cx7="http://schemas.microsoft.com/office/drawing/2016/5/13/chartex" xmlns:cx8="http://schemas.microsoft.com/office/drawing/2016/5/14/chartex" xmlns:mc="http://schemas.openxmlformats.org/markup-compatibility/2006" xmlns:aink="http://schemas.microsoft.com/office/drawing/2016/ink" xmlns:am3d="http://schemas.microsoft.com/office/drawing/2017/model3d" xmlns:o="urn:schemas-microsoft-com:office:office" xmlns:oel="http://schemas.microsoft.com/office/2019/extlst" xmlns:r="http://schemas.openxmlformats.org/officeDocument/2006/relationships" xmlns:m="http://schemas.openxmlformats.org/officeDocument/2006/math" xmlns:v="urn:schemas-microsoft-com:vml" xmlns:wp14="http://schemas.microsoft.com/office/word/2010/wordprocessingDrawing" xmlns:wp="http://schemas.openxmlformats.org/drawingml/2006/wordprocessingDrawing" xmlns:w10="urn:schemas-microsoft-com:office:word" xmlns:w="http://schemas.openxmlformats.org/wordprocessingml/2006/main" xmlns:w14="http://schemas.microsoft.com/office/word/2010/wordml" xmlns:w15="http://schemas.microsoft.com/office/word/2012/wordml" xmlns:w16cex="http://schemas.microsoft.com/office/word/2018/wordml/cex" xmlns:w16cid="http://schemas.microsoft.com/office/word/2016/wordml/cid" xmlns:w16="http://schemas.microsoft.com/office/word/2018/wordml" xmlns:w16du="http://schemas.microsoft.com/office/word/2023/wordml/word16du" xmlns:w16sdtdh="http://schemas.microsoft.com/office/word/2020/wordml/sdtdatahash" xmlns:w16sdtfl="http://schemas.microsoft.com/office/word/2024/wordml/sdtformatlock" xmlns:w16se="http://schemas.microsoft.com/office/word/2015/wordml/symex" xmlns:wpg="http://schemas.microsoft.com/office/word/2010/wordprocessingGroup" xmlns:wpi="http://schemas.microsoft.com/office/word/2010/wordprocessingInk" xmlns:wne="http://schemas.microsoft.com/office/word/2006/wordml" xmlns:wps="http://schemas.microsoft.com/office/word/2010/wordprocessingShape" mc:Ignorable="w14 w15 w16se w16cid w16 w16cex w16sdtdh w16sdtfl w16du wp14">
+<w:footnotes xmlns:wpc="http://schemas.microsoft.com/office/word/2010/wordprocessingCanvas" xmlns:cx="http://schemas.microsoft.com/office/drawing/2014/chartex" xmlns:cx1="http://schemas.microsoft.com/office/drawing/2015/9/8/chartex" xmlns:cx2="http://schemas.microsoft.com/office/drawing/2015/10/21/chartex" xmlns:cx3="http://schemas.microsoft.com/office/drawing/2016/5/9/chartex" xmlns:cx4="http://schemas.microsoft.com/office/drawing/2016/5/10/chartex" xmlns:cx5="http://schemas.microsoft.com/office/drawing/2016/5/11/chartex" xmlns:cx6="http://schemas.microsoft.com/office/drawing/2016/5/12/chartex" xmlns:cx7="http://schemas.microsoft.com/office/drawing/2016/5/13/chartex" xmlns:cx8="http://schemas.microsoft.com/office/drawing/2016/5/14/chartex" xmlns:mc="http://schemas.openxmlformats.org/markup-compatibility/2006" xmlns:aink="http://schemas.microsoft.com/office/drawing/2016/ink" xmlns:am3d="http://schemas.microsoft.com/office/drawing/2017/model3d" xmlns:o="urn:schemas-microsoft-com:office:office" xmlns:oel="http://schemas.microsoft.com/office/2019/extlst" xmlns:r="http://schemas.openxmlformats.org/officeDocument/2006/relationships" xmlns:m="http://schemas.openxmlformats.org/officeDocument/2006/math" xmlns:v="urn:schemas-microsoft-com:vml" xmlns:wp14="http://schemas.microsoft.com/office/word/2010/wordprocessingDrawing" xmlns:wp="http://schemas.openxmlformats.org/drawingml/2006/wordprocessingDrawing" xmlns:w10="urn:schemas-microsoft-com:office:word" xmlns:w="http://schemas.openxmlformats.org/wordprocessingml/2006/main" xmlns:w14="http://schemas.microsoft.com/office/word/2010/wordml" xmlns:w15="http://schemas.microsoft.com/office/word/2012/wordml" xmlns:w16cei="http://schemas.microsoft.com/office/word/2026/wordml/cei" xmlns:w16cex="http://schemas.microsoft.com/office/word/2018/wordml/cex" xmlns:w16cid="http://schemas.microsoft.com/office/word/2016/wordml/cid" xmlns:w16="http://schemas.microsoft.com/office/word/2018/wordml" xmlns:w16du="http://schemas.microsoft.com/office/word/2023/wordml/word16du" xmlns:w16sdtdh="http://schemas.microsoft.com/office/word/2020/wordml/sdtdatahash" xmlns:w16sdtfl="http://schemas.microsoft.com/office/word/2024/wordml/sdtformatlock" xmlns:w16se="http://schemas.microsoft.com/office/word/2015/wordml/symex" xmlns:wpg="http://schemas.microsoft.com/office/word/2010/wordprocessingGroup" xmlns:wpi="http://schemas.microsoft.com/office/word/2010/wordprocessingInk" xmlns:wne="http://schemas.microsoft.com/office/word/2006/wordml" xmlns:wps="http://schemas.microsoft.com/office/word/2010/wordprocessingShape" mc:Ignorable="w14 w15 w16se w16cid w16 w16cex w16sdtdh w16sdtfl w16du wp14">
   <w:footnote w:type="separator" w:id="-1">
     <w:p>
       <w:r>
@@ -25060,7 +25791,7 @@
 </file>
 
 <file path=word/header1.xml><?xml version="1.0" encoding="utf-8"?>
-<w:hdr xmlns:wpc="http://schemas.microsoft.com/office/word/2010/wordprocessingCanvas" xmlns:cx="http://schemas.microsoft.com/office/drawing/2014/chartex" xmlns:cx1="http://schemas.microsoft.com/office/drawing/2015/9/8/chartex" xmlns:cx2="http://schemas.microsoft.com/office/drawing/2015/10/21/chartex" xmlns:cx3="http://schemas.microsoft.com/office/drawing/2016/5/9/chartex" xmlns:cx4="http://schemas.microsoft.com/office/drawing/2016/5/10/chartex" xmlns:cx5="http://schemas.microsoft.com/office/drawing/2016/5/11/chartex" xmlns:cx6="http://schemas.microsoft.com/office/drawing/2016/5/12/chartex" xmlns:cx7="http://schemas.microsoft.com/office/drawing/2016/5/13/chartex" xmlns:cx8="http://schemas.microsoft.com/office/drawing/2016/5/14/chartex" xmlns:mc="http://schemas.openxmlformats.org/markup-compatibility/2006" xmlns:aink="http://schemas.microsoft.com/office/drawing/2016/ink" xmlns:am3d="http://schemas.microsoft.com/office/drawing/2017/model3d" xmlns:o="urn:schemas-microsoft-com:office:office" xmlns:oel="http://schemas.microsoft.com/office/2019/extlst" xmlns:r="http://schemas.openxmlformats.org/officeDocument/2006/relationships" xmlns:m="http://schemas.openxmlformats.org/officeDocument/2006/math" xmlns:v="urn:schemas-microsoft-com:vml" xmlns:wp14="http://schemas.microsoft.com/office/word/2010/wordprocessingDrawing" xmlns:wp="http://schemas.openxmlformats.org/drawingml/2006/wordprocessingDrawing" xmlns:w10="urn:schemas-microsoft-com:office:word" xmlns:w="http://schemas.openxmlformats.org/wordprocessingml/2006/main" xmlns:w14="http://schemas.microsoft.com/office/word/2010/wordml" xmlns:w15="http://schemas.microsoft.com/office/word/2012/wordml" xmlns:w16cex="http://schemas.microsoft.com/office/word/2018/wordml/cex" xmlns:w16cid="http://schemas.microsoft.com/office/word/2016/wordml/cid" xmlns:w16="http://schemas.microsoft.com/office/word/2018/wordml" xmlns:w16du="http://schemas.microsoft.com/office/word/2023/wordml/word16du" xmlns:w16sdtdh="http://schemas.microsoft.com/office/word/2020/wordml/sdtdatahash" xmlns:w16sdtfl="http://schemas.microsoft.com/office/word/2024/wordml/sdtformatlock" xmlns:w16se="http://schemas.microsoft.com/office/word/2015/wordml/symex" xmlns:wpg="http://schemas.microsoft.com/office/word/2010/wordprocessingGroup" xmlns:wpi="http://schemas.microsoft.com/office/word/2010/wordprocessingInk" xmlns:wne="http://schemas.microsoft.com/office/word/2006/wordml" xmlns:wps="http://schemas.microsoft.com/office/word/2010/wordprocessingShape" mc:Ignorable="w14 w15 w16se w16cid w16 w16cex w16sdtdh w16sdtfl w16du wp14">
+<w:hdr xmlns:wpc="http://schemas.microsoft.com/office/word/2010/wordprocessingCanvas" xmlns:cx="http://schemas.microsoft.com/office/drawing/2014/chartex" xmlns:cx1="http://schemas.microsoft.com/office/drawing/2015/9/8/chartex" xmlns:cx2="http://schemas.microsoft.com/office/drawing/2015/10/21/chartex" xmlns:cx3="http://schemas.microsoft.com/office/drawing/2016/5/9/chartex" xmlns:cx4="http://schemas.microsoft.com/office/drawing/2016/5/10/chartex" xmlns:cx5="http://schemas.microsoft.com/office/drawing/2016/5/11/chartex" xmlns:cx6="http://schemas.microsoft.com/office/drawing/2016/5/12/chartex" xmlns:cx7="http://schemas.microsoft.com/office/drawing/2016/5/13/chartex" xmlns:cx8="http://schemas.microsoft.com/office/drawing/2016/5/14/chartex" xmlns:mc="http://schemas.openxmlformats.org/markup-compatibility/2006" xmlns:aink="http://schemas.microsoft.com/office/drawing/2016/ink" xmlns:am3d="http://schemas.microsoft.com/office/drawing/2017/model3d" xmlns:o="urn:schemas-microsoft-com:office:office" xmlns:oel="http://schemas.microsoft.com/office/2019/extlst" xmlns:r="http://schemas.openxmlformats.org/officeDocument/2006/relationships" xmlns:m="http://schemas.openxmlformats.org/officeDocument/2006/math" xmlns:v="urn:schemas-microsoft-com:vml" xmlns:wp14="http://schemas.microsoft.com/office/word/2010/wordprocessingDrawing" xmlns:wp="http://schemas.openxmlformats.org/drawingml/2006/wordprocessingDrawing" xmlns:w10="urn:schemas-microsoft-com:office:word" xmlns:w="http://schemas.openxmlformats.org/wordprocessingml/2006/main" xmlns:w14="http://schemas.microsoft.com/office/word/2010/wordml" xmlns:w15="http://schemas.microsoft.com/office/word/2012/wordml" xmlns:w16cei="http://schemas.microsoft.com/office/word/2026/wordml/cei" xmlns:w16cex="http://schemas.microsoft.com/office/word/2018/wordml/cex" xmlns:w16cid="http://schemas.microsoft.com/office/word/2016/wordml/cid" xmlns:w16="http://schemas.microsoft.com/office/word/2018/wordml" xmlns:w16du="http://schemas.microsoft.com/office/word/2023/wordml/word16du" xmlns:w16sdtdh="http://schemas.microsoft.com/office/word/2020/wordml/sdtdatahash" xmlns:w16sdtfl="http://schemas.microsoft.com/office/word/2024/wordml/sdtformatlock" xmlns:w16se="http://schemas.microsoft.com/office/word/2015/wordml/symex" xmlns:wpg="http://schemas.microsoft.com/office/word/2010/wordprocessingGroup" xmlns:wpi="http://schemas.microsoft.com/office/word/2010/wordprocessingInk" xmlns:wne="http://schemas.microsoft.com/office/word/2006/wordml" xmlns:wps="http://schemas.microsoft.com/office/word/2010/wordprocessingShape" mc:Ignorable="w14 w15 w16se w16cid w16 w16cex w16sdtdh w16sdtfl w16du wp14">
   <w:p>
     <w:pPr>
       <w:pStyle w:val="Header"/>
@@ -25139,7 +25870,7 @@
 </file>
 
 <file path=word/numbering.xml><?xml version="1.0" encoding="utf-8"?>
-<w:numbering xmlns:wpc="http://schemas.microsoft.com/office/word/2010/wordprocessingCanvas" xmlns:cx="http://schemas.microsoft.com/office/drawing/2014/chartex" xmlns:cx1="http://schemas.microsoft.com/office/drawing/2015/9/8/chartex" xmlns:cx2="http://schemas.microsoft.com/office/drawing/2015/10/21/chartex" xmlns:cx3="http://schemas.microsoft.com/office/drawing/2016/5/9/chartex" xmlns:cx4="http://schemas.microsoft.com/office/drawing/2016/5/10/chartex" xmlns:cx5="http://schemas.microsoft.com/office/drawing/2016/5/11/chartex" xmlns:cx6="http://schemas.microsoft.com/office/drawing/2016/5/12/chartex" xmlns:cx7="http://schemas.microsoft.com/office/drawing/2016/5/13/chartex" xmlns:cx8="http://schemas.microsoft.com/office/drawing/2016/5/14/chartex" xmlns:mc="http://schemas.openxmlformats.org/markup-compatibility/2006" xmlns:aink="http://schemas.microsoft.com/office/drawing/2016/ink" xmlns:am3d="http://schemas.microsoft.com/office/drawing/2017/model3d" xmlns:o="urn:schemas-microsoft-com:office:office" xmlns:oel="http://schemas.microsoft.com/office/2019/extlst" xmlns:r="http://schemas.openxmlformats.org/officeDocument/2006/relationships" xmlns:m="http://schemas.openxmlformats.org/officeDocument/2006/math" xmlns:v="urn:schemas-microsoft-com:vml" xmlns:wp14="http://schemas.microsoft.com/office/word/2010/wordprocessingDrawing" xmlns:wp="http://schemas.openxmlformats.org/drawingml/2006/wordprocessingDrawing" xmlns:w10="urn:schemas-microsoft-com:office:word" xmlns:w="http://schemas.openxmlformats.org/wordprocessingml/2006/main" xmlns:w14="http://schemas.microsoft.com/office/word/2010/wordml" xmlns:w15="http://schemas.microsoft.com/office/word/2012/wordml" xmlns:w16cex="http://schemas.microsoft.com/office/word/2018/wordml/cex" xmlns:w16cid="http://schemas.microsoft.com/office/word/2016/wordml/cid" xmlns:w16="http://schemas.microsoft.com/office/word/2018/wordml" xmlns:w16du="http://schemas.microsoft.com/office/word/2023/wordml/word16du" xmlns:w16sdtdh="http://schemas.microsoft.com/office/word/2020/wordml/sdtdatahash" xmlns:w16sdtfl="http://schemas.microsoft.com/office/word/2024/wordml/sdtformatlock" xmlns:w16se="http://schemas.microsoft.com/office/word/2015/wordml/symex" xmlns:wpg="http://schemas.microsoft.com/office/word/2010/wordprocessingGroup" xmlns:wpi="http://schemas.microsoft.com/office/word/2010/wordprocessingInk" xmlns:wne="http://schemas.microsoft.com/office/word/2006/wordml" xmlns:wps="http://schemas.microsoft.com/office/word/2010/wordprocessingShape" mc:Ignorable="w14 w15 w16se w16cid w16 w16cex w16sdtdh w16sdtfl w16du wp14">
+<w:numbering xmlns:wpc="http://schemas.microsoft.com/office/word/2010/wordprocessingCanvas" xmlns:cx="http://schemas.microsoft.com/office/drawing/2014/chartex" xmlns:cx1="http://schemas.microsoft.com/office/drawing/2015/9/8/chartex" xmlns:cx2="http://schemas.microsoft.com/office/drawing/2015/10/21/chartex" xmlns:cx3="http://schemas.microsoft.com/office/drawing/2016/5/9/chartex" xmlns:cx4="http://schemas.microsoft.com/office/drawing/2016/5/10/chartex" xmlns:cx5="http://schemas.microsoft.com/office/drawing/2016/5/11/chartex" xmlns:cx6="http://schemas.microsoft.com/office/drawing/2016/5/12/chartex" xmlns:cx7="http://schemas.microsoft.com/office/drawing/2016/5/13/chartex" xmlns:cx8="http://schemas.microsoft.com/office/drawing/2016/5/14/chartex" xmlns:mc="http://schemas.openxmlformats.org/markup-compatibility/2006" xmlns:aink="http://schemas.microsoft.com/office/drawing/2016/ink" xmlns:am3d="http://schemas.microsoft.com/office/drawing/2017/model3d" xmlns:o="urn:schemas-microsoft-com:office:office" xmlns:oel="http://schemas.microsoft.com/office/2019/extlst" xmlns:r="http://schemas.openxmlformats.org/officeDocument/2006/relationships" xmlns:m="http://schemas.openxmlformats.org/officeDocument/2006/math" xmlns:v="urn:schemas-microsoft-com:vml" xmlns:wp14="http://schemas.microsoft.com/office/word/2010/wordprocessingDrawing" xmlns:wp="http://schemas.openxmlformats.org/drawingml/2006/wordprocessingDrawing" xmlns:w10="urn:schemas-microsoft-com:office:word" xmlns:w="http://schemas.openxmlformats.org/wordprocessingml/2006/main" xmlns:w14="http://schemas.microsoft.com/office/word/2010/wordml" xmlns:w15="http://schemas.microsoft.com/office/word/2012/wordml" xmlns:w16cei="http://schemas.microsoft.com/office/word/2026/wordml/cei" xmlns:w16cex="http://schemas.microsoft.com/office/word/2018/wordml/cex" xmlns:w16cid="http://schemas.microsoft.com/office/word/2016/wordml/cid" xmlns:w16="http://schemas.microsoft.com/office/word/2018/wordml" xmlns:w16du="http://schemas.microsoft.com/office/word/2023/wordml/word16du" xmlns:w16sdtdh="http://schemas.microsoft.com/office/word/2020/wordml/sdtdatahash" xmlns:w16sdtfl="http://schemas.microsoft.com/office/word/2024/wordml/sdtformatlock" xmlns:w16se="http://schemas.microsoft.com/office/word/2015/wordml/symex" xmlns:wpg="http://schemas.microsoft.com/office/word/2010/wordprocessingGroup" xmlns:wpi="http://schemas.microsoft.com/office/word/2010/wordprocessingInk" xmlns:wne="http://schemas.microsoft.com/office/word/2006/wordml" xmlns:wps="http://schemas.microsoft.com/office/word/2010/wordprocessingShape" mc:Ignorable="w14 w15 w16se w16cid w16 w16cex w16sdtdh w16sdtfl w16du wp14">
   <w:abstractNum w:abstractNumId="0" w15:restartNumberingAfterBreak="0">
     <w:nsid w:val="FFFFFFFB"/>
     <w:multiLevelType w:val="multilevel"/>
@@ -25244,11 +25975,11 @@
   <w:abstractNum w:abstractNumId="1" w15:restartNumberingAfterBreak="0">
     <w:nsid w:val="00334CBB"/>
     <w:multiLevelType w:val="multilevel"/>
-    <w:tmpl w:val="52B8CDD6"/>
+    <w:tmpl w:val="BC22EE72"/>
     <w:lvl w:ilvl="0">
       <w:start w:val="1"/>
       <w:numFmt w:val="upperLetter"/>
-      <w:pStyle w:val="H2Cont"/>
+      <w:pStyle w:val="H2First"/>
       <w:suff w:val="space"/>
       <w:lvlText w:val="%1."/>
       <w:lvlJc w:val="left"/>
@@ -27816,6 +28547,36 @@
     <w:abstractNumId w:val="1"/>
   </w:num>
   <w:num w:numId="47" w16cid:durableId="1989557261">
+    <w:abstractNumId w:val="1"/>
+    <w:lvlOverride w:ilvl="0">
+      <w:startOverride w:val="1"/>
+    </w:lvlOverride>
+    <w:lvlOverride w:ilvl="1">
+      <w:startOverride w:val="1"/>
+    </w:lvlOverride>
+    <w:lvlOverride w:ilvl="2">
+      <w:startOverride w:val="1"/>
+    </w:lvlOverride>
+    <w:lvlOverride w:ilvl="3">
+      <w:startOverride w:val="1"/>
+    </w:lvlOverride>
+    <w:lvlOverride w:ilvl="4">
+      <w:startOverride w:val="1"/>
+    </w:lvlOverride>
+    <w:lvlOverride w:ilvl="5">
+      <w:startOverride w:val="1"/>
+    </w:lvlOverride>
+    <w:lvlOverride w:ilvl="6">
+      <w:startOverride w:val="1"/>
+    </w:lvlOverride>
+    <w:lvlOverride w:ilvl="7">
+      <w:startOverride w:val="1"/>
+    </w:lvlOverride>
+    <w:lvlOverride w:ilvl="8">
+      <w:startOverride w:val="1"/>
+    </w:lvlOverride>
+  </w:num>
+  <w:num w:numId="48" w16cid:durableId="2002348260">
     <w:abstractNumId w:val="1"/>
     <w:lvlOverride w:ilvl="0">
       <w:startOverride w:val="1"/>
@@ -28431,6 +29192,7 @@
   <w:style w:type="character" w:default="1" w:styleId="DefaultParagraphFont">
     <w:name w:val="Default Paragraph Font"/>
     <w:uiPriority w:val="1"/>
+    <w:semiHidden/>
     <w:unhideWhenUsed/>
   </w:style>
   <w:style w:type="table" w:default="1" w:styleId="TableNormal">
@@ -29083,13 +29845,16 @@
     <w:name w:val="H2_First"/>
     <w:basedOn w:val="H2Cont"/>
     <w:qFormat/>
-    <w:rsid w:val="002F311A"/>
+    <w:rsid w:val="00DF2641"/>
     <w:pPr>
       <w:numPr>
         <w:numId w:val="40"/>
       </w:numPr>
-      <w:spacing w:before="270"/>
+      <w:spacing w:before="0"/>
     </w:pPr>
+    <w:rPr>
+      <w:rFonts w:cs="Helvetica"/>
+    </w:rPr>
   </w:style>
   <w:style w:type="paragraph" w:customStyle="1" w:styleId="H2ConSpaceBefore12pt">
     <w:name w:val="H2_Con Space(Before: 12 pt)"/>

</xml_diff>